<commit_message>
Mod: modificato il documento 3.2 subsystem decomposition, sviluppato il punto 3.0,3.1,3.2,3.3
</commit_message>
<xml_diff>
--- a/Workspace/SDD/PuntiSingoli/3.2 - Subsystem decomposition.docx
+++ b/Workspace/SDD/PuntiSingoli/3.2 - Subsystem decomposition.docx
@@ -3,16 +3,867 @@
 <w:document xmlns:wpc="http://schemas.microsoft.com/office/word/2010/wordprocessingCanvas" xmlns:cx="http://schemas.microsoft.com/office/drawing/2014/chartex" xmlns:cx1="http://schemas.microsoft.com/office/drawing/2015/9/8/chartex" xmlns:cx2="http://schemas.microsoft.com/office/drawing/2015/10/21/chartex" xmlns:cx3="http://schemas.microsoft.com/office/drawing/2016/5/9/chartex" xmlns:cx4="http://schemas.microsoft.com/office/drawing/2016/5/10/chartex" xmlns:cx5="http://schemas.microsoft.com/office/drawing/2016/5/11/chartex" xmlns:cx6="http://schemas.microsoft.com/office/drawing/2016/5/12/chartex" xmlns:cx7="http://schemas.microsoft.com/office/drawing/2016/5/13/chartex" xmlns:cx8="http://schemas.microsoft.com/office/drawing/2016/5/14/chartex" xmlns:mc="http://schemas.openxmlformats.org/markup-compatibility/2006" xmlns:aink="http://schemas.microsoft.com/office/drawing/2016/ink" xmlns:am3d="http://schemas.microsoft.com/office/drawing/2017/model3d" xmlns:o="urn:schemas-microsoft-com:office:office" xmlns:oel="http://schemas.microsoft.com/office/2019/extlst" xmlns:r="http://schemas.openxmlformats.org/officeDocument/2006/relationships" xmlns:m="http://schemas.openxmlformats.org/officeDocument/2006/math" xmlns:v="urn:schemas-microsoft-com:vml" xmlns:wp14="http://schemas.microsoft.com/office/word/2010/wordprocessingDrawing" xmlns:wp="http://schemas.openxmlformats.org/drawingml/2006/wordprocessingDrawing" xmlns:w10="urn:schemas-microsoft-com:office:word" xmlns:w="http://schemas.openxmlformats.org/wordprocessingml/2006/main" xmlns:w14="http://schemas.microsoft.com/office/word/2010/wordml" xmlns:w15="http://schemas.microsoft.com/office/word/2012/wordml" xmlns:w16cex="http://schemas.microsoft.com/office/word/2018/wordml/cex" xmlns:w16cid="http://schemas.microsoft.com/office/word/2016/wordml/cid" xmlns:w16="http://schemas.microsoft.com/office/word/2018/wordml" xmlns:w16du="http://schemas.microsoft.com/office/word/2023/wordml/word16du" xmlns:w16sdtdh="http://schemas.microsoft.com/office/word/2020/wordml/sdtdatahash" xmlns:w16sdtfl="http://schemas.microsoft.com/office/word/2024/wordml/sdtformatlock" xmlns:w16se="http://schemas.microsoft.com/office/word/2015/wordml/symex" xmlns:wpg="http://schemas.microsoft.com/office/word/2010/wordprocessingGroup" xmlns:wpi="http://schemas.microsoft.com/office/word/2010/wordprocessingInk" xmlns:wne="http://schemas.microsoft.com/office/word/2006/wordml" xmlns:wps="http://schemas.microsoft.com/office/word/2010/wordprocessingShape" mc:Ignorable="w14 w15 w16se w16cid w16 w16cex w16sdtdh w16sdtfl w16du wp14">
   <w:body>
     <w:p>
+      <w:pPr>
+        <w:pStyle w:val="Titolo2"/>
+        <w:ind w:left="-426"/>
+      </w:pPr>
+      <w:r>
+        <w:t>3. Architettura del software proposto</w:t>
+      </w:r>
+    </w:p>
+    <w:p>
+      <w:pPr>
+        <w:pStyle w:val="Titolo3"/>
+      </w:pPr>
+      <w:r>
+        <w:t>3.1 Overview</w:t>
+      </w:r>
+    </w:p>
+    <w:p/>
+    <w:p>
+      <w:r>
+        <w:t>Il sistema Easy Work Management System (E.W.M.S.) è progettato seguendo un'architettura software Three-Tier (a tre livelli) basata sul web.</w:t>
+      </w:r>
+      <w:r>
+        <w:t xml:space="preserve"> </w:t>
+      </w:r>
+      <w:r>
+        <w:t>L'architettura segue il design pattern Model-View-Controller (MVC) per l'organizzazione della logica applicativa.</w:t>
+      </w:r>
+      <w:r>
+        <w:t xml:space="preserve"> </w:t>
+      </w:r>
+    </w:p>
+    <w:p>
+      <w:r>
+        <w:t>Il sistema è strutturato quindi su tre livelli:</w:t>
+      </w:r>
+    </w:p>
+    <w:p>
+      <w:pPr>
+        <w:pStyle w:val="Paragrafoelenco"/>
+        <w:numPr>
+          <w:ilvl w:val="0"/>
+          <w:numId w:val="2"/>
+        </w:numPr>
+      </w:pPr>
+      <w:r>
+        <w:rPr>
+          <w:b/>
+          <w:bCs/>
+        </w:rPr>
+        <w:t>Presentation layer</w:t>
+      </w:r>
+      <w:r>
+        <w:t xml:space="preserve">: costituisce il livello </w:t>
+      </w:r>
+      <w:r>
+        <w:t xml:space="preserve">di presentazione accessibile agli utenti </w:t>
+      </w:r>
+      <w:r>
+        <w:t>finali.</w:t>
+      </w:r>
+      <w:r>
+        <w:t xml:space="preserve"> </w:t>
+      </w:r>
+      <w:r>
+        <w:t>L'interfaccia è fruibile attraverso qualsiasi browser web moderno. Questo livello è responsabile della visualizzazione delle pagine dinamiche (generate tramite tecnologia) e dell'invio delle richieste utente al server tramite protocollo HTTP/HTTPS.</w:t>
+      </w:r>
+    </w:p>
+    <w:p>
+      <w:pPr>
+        <w:pStyle w:val="Paragrafoelenco"/>
+        <w:numPr>
+          <w:ilvl w:val="0"/>
+          <w:numId w:val="2"/>
+        </w:numPr>
+      </w:pPr>
+      <w:r>
+        <w:rPr>
+          <w:b/>
+          <w:bCs/>
+        </w:rPr>
+        <w:t>Application layer</w:t>
+      </w:r>
+      <w:r>
+        <w:t>:</w:t>
+      </w:r>
+      <w:r>
+        <w:t xml:space="preserve"> costituisce il cuore del sistema, </w:t>
+      </w:r>
+      <w:r>
+        <w:t>spitato su un Web Server Apache Tomcat. Questo livello implementa la logica di business e il controllo del flusso applicativo.</w:t>
+      </w:r>
+    </w:p>
+    <w:p>
+      <w:pPr>
+        <w:pStyle w:val="Paragrafoelenco"/>
+        <w:numPr>
+          <w:ilvl w:val="0"/>
+          <w:numId w:val="2"/>
+        </w:numPr>
+      </w:pPr>
+      <w:r>
+        <w:rPr>
+          <w:b/>
+          <w:bCs/>
+        </w:rPr>
+        <w:t>Persistence layer</w:t>
+      </w:r>
+      <w:r>
+        <w:t>:</w:t>
+      </w:r>
+      <w:r>
+        <w:t xml:space="preserve"> </w:t>
+      </w:r>
+      <w:r>
+        <w:t>Costituisce il livello di persistenza dei dati. È composto da un Database Management System (DBMS) relazionale</w:t>
+      </w:r>
+      <w:r>
+        <w:t xml:space="preserve">, il server applicativo comunica con questo livello utilizzando lo standard </w:t>
+      </w:r>
+      <w:r>
+        <w:rPr>
+          <w:b/>
+          <w:bCs/>
+        </w:rPr>
+        <w:t>JDBC</w:t>
+      </w:r>
+      <w:r>
+        <w:t>.</w:t>
+      </w:r>
+    </w:p>
+    <w:p/>
+    <w:p>
+      <w:pPr>
+        <w:pStyle w:val="Titolo3"/>
+      </w:pPr>
+      <w:r>
+        <w:t>3.2 Decomposizione in subsystem</w:t>
+      </w:r>
+    </w:p>
+    <w:p/>
+    <w:p>
+      <w:r>
+        <w:t>Di seguito viene presentato il sistema scomposto in “subsystem” e le relative dipendenze.</w:t>
+      </w:r>
+    </w:p>
+    <w:p/>
+    <w:p>
+      <w:r>
+        <w:rPr>
+          <w:noProof/>
+        </w:rPr>
+        <w:drawing>
+          <wp:inline distT="0" distB="0" distL="0" distR="0" wp14:anchorId="2C939F48" wp14:editId="2C612608">
+            <wp:extent cx="6120130" cy="3644265"/>
+            <wp:effectExtent l="0" t="0" r="0" b="0"/>
+            <wp:docPr id="1919883923" name="Elemento grafico 1"/>
+            <wp:cNvGraphicFramePr>
+              <a:graphicFrameLocks xmlns:a="http://schemas.openxmlformats.org/drawingml/2006/main" noChangeAspect="1"/>
+            </wp:cNvGraphicFramePr>
+            <a:graphic xmlns:a="http://schemas.openxmlformats.org/drawingml/2006/main">
+              <a:graphicData uri="http://schemas.openxmlformats.org/drawingml/2006/picture">
+                <pic:pic xmlns:pic="http://schemas.openxmlformats.org/drawingml/2006/picture">
+                  <pic:nvPicPr>
+                    <pic:cNvPr id="1919883923" name="Elemento grafico 1919883923"/>
+                    <pic:cNvPicPr/>
+                  </pic:nvPicPr>
+                  <pic:blipFill>
+                    <a:blip r:embed="rId6">
+                      <a:extLst>
+                        <a:ext uri="{96DAC541-7B7A-43D3-8B79-37D633B846F1}">
+                          <asvg:svgBlip xmlns:asvg="http://schemas.microsoft.com/office/drawing/2016/SVG/main" r:embed="rId7"/>
+                        </a:ext>
+                      </a:extLst>
+                    </a:blip>
+                    <a:stretch>
+                      <a:fillRect/>
+                    </a:stretch>
+                  </pic:blipFill>
+                  <pic:spPr>
+                    <a:xfrm>
+                      <a:off x="0" y="0"/>
+                      <a:ext cx="6120130" cy="3644265"/>
+                    </a:xfrm>
+                    <a:prstGeom prst="rect">
+                      <a:avLst/>
+                    </a:prstGeom>
+                  </pic:spPr>
+                </pic:pic>
+              </a:graphicData>
+            </a:graphic>
+          </wp:inline>
+        </w:drawing>
+      </w:r>
+    </w:p>
+    <w:tbl>
+      <w:tblPr>
+        <w:tblStyle w:val="Grigliatabella"/>
+        <w:tblW w:w="0" w:type="auto"/>
+        <w:tblInd w:w="426" w:type="dxa"/>
+        <w:tblLook w:val="04A0" w:firstRow="1" w:lastRow="0" w:firstColumn="1" w:lastColumn="0" w:noHBand="0" w:noVBand="1"/>
+      </w:tblPr>
+      <w:tblGrid>
+        <w:gridCol w:w="2549"/>
+        <w:gridCol w:w="6653"/>
+      </w:tblGrid>
+      <w:tr>
+        <w:trPr>
+          <w:trHeight w:val="389"/>
+        </w:trPr>
+        <w:tc>
+          <w:tcPr>
+            <w:tcW w:w="2376" w:type="dxa"/>
+            <w:vAlign w:val="center"/>
+          </w:tcPr>
+          <w:p>
+            <w:pPr>
+              <w:jc w:val="center"/>
+              <w:rPr>
+                <w:b/>
+                <w:bCs/>
+              </w:rPr>
+            </w:pPr>
+            <w:r>
+              <w:rPr>
+                <w:b/>
+                <w:bCs/>
+              </w:rPr>
+              <w:lastRenderedPageBreak/>
+              <w:t>Nome</w:t>
+            </w:r>
+          </w:p>
+        </w:tc>
+        <w:tc>
+          <w:tcPr>
+            <w:tcW w:w="6826" w:type="dxa"/>
+            <w:vAlign w:val="center"/>
+          </w:tcPr>
+          <w:p>
+            <w:pPr>
+              <w:jc w:val="center"/>
+              <w:rPr>
+                <w:b/>
+                <w:bCs/>
+              </w:rPr>
+            </w:pPr>
+            <w:r>
+              <w:rPr>
+                <w:b/>
+                <w:bCs/>
+              </w:rPr>
+              <w:t>Descrizione</w:t>
+            </w:r>
+          </w:p>
+        </w:tc>
+      </w:tr>
+      <w:tr>
+        <w:tc>
+          <w:tcPr>
+            <w:tcW w:w="2376" w:type="dxa"/>
+          </w:tcPr>
+          <w:p>
+            <w:r>
+              <w:t>EWMSClient</w:t>
+            </w:r>
+          </w:p>
+        </w:tc>
+        <w:tc>
+          <w:tcPr>
+            <w:tcW w:w="6826" w:type="dxa"/>
+          </w:tcPr>
+          <w:p>
+            <w:r>
+              <w:t>Sottosistema che si occupa della presentazione lato client offre tutti i servizi che verranno utilizzati dagli utenti finali per comunicare con il sistema</w:t>
+            </w:r>
+          </w:p>
+        </w:tc>
+      </w:tr>
+      <w:tr>
+        <w:tc>
+          <w:tcPr>
+            <w:tcW w:w="2376" w:type="dxa"/>
+          </w:tcPr>
+          <w:p>
+            <w:r>
+              <w:t xml:space="preserve">EWMSServer </w:t>
+            </w:r>
+          </w:p>
+        </w:tc>
+        <w:tc>
+          <w:tcPr>
+            <w:tcW w:w="6826" w:type="dxa"/>
+          </w:tcPr>
+          <w:p>
+            <w:r>
+              <w:t xml:space="preserve">Sottosistema che rappresenta il server intercetta </w:t>
+            </w:r>
+            <w:r>
+              <w:t>le richieste</w:t>
+            </w:r>
+            <w:r>
+              <w:t xml:space="preserve"> da parte dei client e utilizza i sottosistemi sottostanti per applicare la logica di business</w:t>
+            </w:r>
+          </w:p>
+        </w:tc>
+      </w:tr>
+      <w:tr>
+        <w:tc>
+          <w:tcPr>
+            <w:tcW w:w="2376" w:type="dxa"/>
+          </w:tcPr>
+          <w:p>
+            <w:r>
+              <w:t xml:space="preserve">AccessManagement </w:t>
+            </w:r>
+          </w:p>
+        </w:tc>
+        <w:tc>
+          <w:tcPr>
+            <w:tcW w:w="6826" w:type="dxa"/>
+          </w:tcPr>
+          <w:p>
+            <w:r>
+              <w:t xml:space="preserve">Sottosistema </w:t>
+            </w:r>
+            <w:r>
+              <w:t>che offre i servizi per login e logout dal proprio account</w:t>
+            </w:r>
+          </w:p>
+        </w:tc>
+      </w:tr>
+      <w:tr>
+        <w:tc>
+          <w:tcPr>
+            <w:tcW w:w="2376" w:type="dxa"/>
+          </w:tcPr>
+          <w:p>
+            <w:r>
+              <w:t>AccountManagement</w:t>
+            </w:r>
+          </w:p>
+        </w:tc>
+        <w:tc>
+          <w:tcPr>
+            <w:tcW w:w="6826" w:type="dxa"/>
+          </w:tcPr>
+          <w:p>
+            <w:r>
+              <w:t>Sottosistema che si occupa dei servizi di modifica e inserimento degli account sul database del sistema</w:t>
+            </w:r>
+          </w:p>
+        </w:tc>
+      </w:tr>
+      <w:tr>
+        <w:tc>
+          <w:tcPr>
+            <w:tcW w:w="2376" w:type="dxa"/>
+          </w:tcPr>
+          <w:p>
+            <w:r>
+              <w:t>TaskManagement</w:t>
+            </w:r>
+          </w:p>
+        </w:tc>
+        <w:tc>
+          <w:tcPr>
+            <w:tcW w:w="6826" w:type="dxa"/>
+          </w:tcPr>
+          <w:p>
+            <w:r>
+              <w:t>Sottosistema che offre tutti i servizi che si concentrano sul controllo del ciclo di vita di un task all’interno del sistema</w:t>
+            </w:r>
+          </w:p>
+        </w:tc>
+      </w:tr>
+      <w:tr>
+        <w:tc>
+          <w:tcPr>
+            <w:tcW w:w="2376" w:type="dxa"/>
+          </w:tcPr>
+          <w:p>
+            <w:r>
+              <w:t>NotificheManagement</w:t>
+            </w:r>
+          </w:p>
+        </w:tc>
+        <w:tc>
+          <w:tcPr>
+            <w:tcW w:w="6826" w:type="dxa"/>
+          </w:tcPr>
+          <w:p>
+            <w:r>
+              <w:t>Sottosistema che offre i servizi di controllo delle notifiche generate dalle operazioni sui task</w:t>
+            </w:r>
+          </w:p>
+        </w:tc>
+      </w:tr>
+      <w:tr>
+        <w:tc>
+          <w:tcPr>
+            <w:tcW w:w="2376" w:type="dxa"/>
+          </w:tcPr>
+          <w:p>
+            <w:r>
+              <w:t>PersistenceManagement</w:t>
+            </w:r>
+          </w:p>
+        </w:tc>
+        <w:tc>
+          <w:tcPr>
+            <w:tcW w:w="6826" w:type="dxa"/>
+          </w:tcPr>
+          <w:p>
+            <w:r>
+              <w:t>Sottosistema che offre i servizi per la lettura e scrittura dal database</w:t>
+            </w:r>
+          </w:p>
+        </w:tc>
+      </w:tr>
+    </w:tbl>
+    <w:p>
+      <w:pPr>
+        <w:ind w:left="426"/>
+      </w:pPr>
+    </w:p>
+    <w:p/>
+    <w:p>
+      <w:pPr>
+        <w:pStyle w:val="Titolo2"/>
+      </w:pPr>
+      <w:r>
+        <w:t xml:space="preserve">3.3 </w:t>
+      </w:r>
+      <w:r>
+        <w:t>Hardware/software mapping</w:t>
+      </w:r>
+    </w:p>
+    <w:p/>
+    <w:p>
+      <w:r>
+        <w:t>Il sistema E.W.M.S. è distribuito su tre nodi computazionali distinti, corrispondenti ai livelli dell'architettura Three-Tier:</w:t>
+      </w:r>
+    </w:p>
+    <w:p>
+      <w:pPr>
+        <w:pStyle w:val="Paragrafoelenco"/>
+        <w:numPr>
+          <w:ilvl w:val="0"/>
+          <w:numId w:val="2"/>
+        </w:numPr>
+      </w:pPr>
+      <w:r>
+        <w:rPr>
+          <w:b/>
+          <w:bCs/>
+        </w:rPr>
+        <w:t>Client Node</w:t>
+      </w:r>
+      <w:r>
+        <w:t>: il dispositivo dell’utente finale, essendo EWMS una web application che gira sul server di azienda n</w:t>
+      </w:r>
+      <w:r>
+        <w:t>on richiede installazione di software proprietario, ma si affida</w:t>
+      </w:r>
+      <w:r>
+        <w:t xml:space="preserve"> ad un browser (Chrome, Mozilla, Opera ecc…).</w:t>
+      </w:r>
+    </w:p>
+    <w:p>
+      <w:pPr>
+        <w:pStyle w:val="Paragrafoelenco"/>
+        <w:numPr>
+          <w:ilvl w:val="0"/>
+          <w:numId w:val="2"/>
+        </w:numPr>
+      </w:pPr>
+      <w:r>
+        <w:rPr>
+          <w:b/>
+          <w:bCs/>
+        </w:rPr>
+        <w:t>Application Server Node:</w:t>
+      </w:r>
+      <w:r>
+        <w:t xml:space="preserve"> È il server centrale che ospita la logica applicativa. Esegue il container web necessario per gestire il ciclo di vita delle Servlet e delle pagine JSP.</w:t>
+      </w:r>
+    </w:p>
+    <w:p>
+      <w:pPr>
+        <w:pStyle w:val="Paragrafoelenco"/>
+        <w:numPr>
+          <w:ilvl w:val="0"/>
+          <w:numId w:val="2"/>
+        </w:numPr>
+      </w:pPr>
+      <w:r>
+        <w:rPr>
+          <w:b/>
+          <w:bCs/>
+        </w:rPr>
+        <w:t>Database Server Node:</w:t>
+      </w:r>
+      <w:r>
+        <w:t xml:space="preserve"> È il server dedicato alla persistenza dei dati. Ospita il DBMS relazionale che memorizza tutte le informazioni di sistema</w:t>
+      </w:r>
+      <w:r>
+        <w:t>.</w:t>
+      </w:r>
+    </w:p>
+    <w:p>
+      <w:r>
+        <w:rPr>
+          <w:noProof/>
+        </w:rPr>
+        <w:drawing>
+          <wp:inline distT="0" distB="0" distL="0" distR="0" wp14:anchorId="74A1050A" wp14:editId="33018688">
+            <wp:extent cx="6120130" cy="2633345"/>
+            <wp:effectExtent l="0" t="0" r="0" b="0"/>
+            <wp:docPr id="335504766" name="Elemento grafico 3"/>
+            <wp:cNvGraphicFramePr>
+              <a:graphicFrameLocks xmlns:a="http://schemas.openxmlformats.org/drawingml/2006/main" noChangeAspect="1"/>
+            </wp:cNvGraphicFramePr>
+            <a:graphic xmlns:a="http://schemas.openxmlformats.org/drawingml/2006/main">
+              <a:graphicData uri="http://schemas.openxmlformats.org/drawingml/2006/picture">
+                <pic:pic xmlns:pic="http://schemas.openxmlformats.org/drawingml/2006/picture">
+                  <pic:nvPicPr>
+                    <pic:cNvPr id="335504766" name="Elemento grafico 335504766"/>
+                    <pic:cNvPicPr/>
+                  </pic:nvPicPr>
+                  <pic:blipFill>
+                    <a:blip r:embed="rId8">
+                      <a:extLst>
+                        <a:ext uri="{96DAC541-7B7A-43D3-8B79-37D633B846F1}">
+                          <asvg:svgBlip xmlns:asvg="http://schemas.microsoft.com/office/drawing/2016/SVG/main" r:embed="rId9"/>
+                        </a:ext>
+                      </a:extLst>
+                    </a:blip>
+                    <a:stretch>
+                      <a:fillRect/>
+                    </a:stretch>
+                  </pic:blipFill>
+                  <pic:spPr>
+                    <a:xfrm>
+                      <a:off x="0" y="0"/>
+                      <a:ext cx="6120130" cy="2633345"/>
+                    </a:xfrm>
+                    <a:prstGeom prst="rect">
+                      <a:avLst/>
+                    </a:prstGeom>
+                  </pic:spPr>
+                </pic:pic>
+              </a:graphicData>
+            </a:graphic>
+          </wp:inline>
+        </w:drawing>
+      </w:r>
+    </w:p>
+    <w:p>
+      <w:pPr>
+        <w:rPr>
+          <w:b/>
+          <w:bCs/>
+        </w:rPr>
+      </w:pPr>
+      <w:r>
+        <w:rPr>
+          <w:b/>
+          <w:bCs/>
+        </w:rPr>
+        <w:lastRenderedPageBreak/>
+        <w:t>Componenti off-the-shelfs</w:t>
+      </w:r>
+    </w:p>
+    <w:p>
+      <w:pPr>
+        <w:rPr>
+          <w:b/>
+          <w:bCs/>
+        </w:rPr>
+      </w:pPr>
+    </w:p>
+    <w:tbl>
+      <w:tblPr>
+        <w:tblStyle w:val="Grigliatabella"/>
+        <w:tblW w:w="0" w:type="auto"/>
+        <w:tblLook w:val="04A0" w:firstRow="1" w:lastRow="0" w:firstColumn="1" w:lastColumn="0" w:noHBand="0" w:noVBand="1"/>
+      </w:tblPr>
+      <w:tblGrid>
+        <w:gridCol w:w="2405"/>
+        <w:gridCol w:w="2693"/>
+        <w:gridCol w:w="4530"/>
+      </w:tblGrid>
+      <w:tr>
+        <w:trPr>
+          <w:trHeight w:val="495"/>
+        </w:trPr>
+        <w:tc>
+          <w:tcPr>
+            <w:tcW w:w="2405" w:type="dxa"/>
+            <w:vAlign w:val="center"/>
+          </w:tcPr>
+          <w:p>
+            <w:pPr>
+              <w:jc w:val="center"/>
+              <w:rPr>
+                <w:b/>
+                <w:bCs/>
+              </w:rPr>
+            </w:pPr>
+            <w:r>
+              <w:rPr>
+                <w:b/>
+                <w:bCs/>
+              </w:rPr>
+              <w:t>Componente</w:t>
+            </w:r>
+          </w:p>
+        </w:tc>
+        <w:tc>
+          <w:tcPr>
+            <w:tcW w:w="2693" w:type="dxa"/>
+            <w:vAlign w:val="center"/>
+          </w:tcPr>
+          <w:p>
+            <w:pPr>
+              <w:jc w:val="center"/>
+              <w:rPr>
+                <w:b/>
+                <w:bCs/>
+              </w:rPr>
+            </w:pPr>
+            <w:r>
+              <w:rPr>
+                <w:b/>
+                <w:bCs/>
+              </w:rPr>
+              <w:t>Tipo</w:t>
+            </w:r>
+          </w:p>
+        </w:tc>
+        <w:tc>
+          <w:tcPr>
+            <w:tcW w:w="4530" w:type="dxa"/>
+            <w:vAlign w:val="center"/>
+          </w:tcPr>
+          <w:p>
+            <w:pPr>
+              <w:jc w:val="center"/>
+              <w:rPr>
+                <w:b/>
+                <w:bCs/>
+              </w:rPr>
+            </w:pPr>
+            <w:r>
+              <w:rPr>
+                <w:b/>
+                <w:bCs/>
+              </w:rPr>
+              <w:t>Descrizione</w:t>
+            </w:r>
+          </w:p>
+        </w:tc>
+      </w:tr>
+      <w:tr>
+        <w:trPr>
+          <w:trHeight w:val="495"/>
+        </w:trPr>
+        <w:tc>
+          <w:tcPr>
+            <w:tcW w:w="2405" w:type="dxa"/>
+            <w:vAlign w:val="center"/>
+          </w:tcPr>
+          <w:p>
+            <w:r>
+              <w:t>Apache Tomcat</w:t>
+            </w:r>
+          </w:p>
+        </w:tc>
+        <w:tc>
+          <w:tcPr>
+            <w:tcW w:w="2693" w:type="dxa"/>
+            <w:vAlign w:val="center"/>
+          </w:tcPr>
+          <w:p>
+            <w:r>
+              <w:t>Web Server/Container</w:t>
+            </w:r>
+          </w:p>
+        </w:tc>
+        <w:tc>
+          <w:tcPr>
+            <w:tcW w:w="4530" w:type="dxa"/>
+            <w:vAlign w:val="center"/>
+          </w:tcPr>
+          <w:p>
+            <w:r>
+              <w:t>Ges</w:t>
+            </w:r>
+            <w:r>
+              <w:t>tione del ciclo di vita di Servlet/JSP e dove verrà caricato il file ewms.war per il deployment</w:t>
+            </w:r>
+          </w:p>
+        </w:tc>
+      </w:tr>
+      <w:tr>
+        <w:trPr>
+          <w:trHeight w:val="495"/>
+        </w:trPr>
+        <w:tc>
+          <w:tcPr>
+            <w:tcW w:w="2405" w:type="dxa"/>
+            <w:vAlign w:val="center"/>
+          </w:tcPr>
+          <w:p>
+            <w:r>
+              <w:t>MySQL</w:t>
+            </w:r>
+          </w:p>
+        </w:tc>
+        <w:tc>
+          <w:tcPr>
+            <w:tcW w:w="2693" w:type="dxa"/>
+            <w:vAlign w:val="center"/>
+          </w:tcPr>
+          <w:p>
+            <w:r>
+              <w:t>DBMS</w:t>
+            </w:r>
+          </w:p>
+        </w:tc>
+        <w:tc>
+          <w:tcPr>
+            <w:tcW w:w="4530" w:type="dxa"/>
+            <w:vAlign w:val="center"/>
+          </w:tcPr>
+          <w:p>
+            <w:r>
+              <w:t>Gestione della persistenza dei dati</w:t>
+            </w:r>
+          </w:p>
+        </w:tc>
+      </w:tr>
+      <w:tr>
+        <w:trPr>
+          <w:trHeight w:val="495"/>
+        </w:trPr>
+        <w:tc>
+          <w:tcPr>
+            <w:tcW w:w="2405" w:type="dxa"/>
+            <w:vAlign w:val="center"/>
+          </w:tcPr>
+          <w:p>
+            <w:r>
+              <w:t>Java SE JVM</w:t>
+            </w:r>
+          </w:p>
+        </w:tc>
+        <w:tc>
+          <w:tcPr>
+            <w:tcW w:w="2693" w:type="dxa"/>
+            <w:vAlign w:val="center"/>
+          </w:tcPr>
+          <w:p>
+            <w:r>
+              <w:t>Runtime enviroment</w:t>
+            </w:r>
+          </w:p>
+        </w:tc>
+        <w:tc>
+          <w:tcPr>
+            <w:tcW w:w="4530" w:type="dxa"/>
+            <w:vAlign w:val="center"/>
+          </w:tcPr>
+          <w:p>
+            <w:r>
+              <w:t>Ambiente di esecuzione per il codice Java lato server</w:t>
+            </w:r>
+          </w:p>
+        </w:tc>
+      </w:tr>
+      <w:tr>
+        <w:trPr>
+          <w:trHeight w:val="495"/>
+        </w:trPr>
+        <w:tc>
+          <w:tcPr>
+            <w:tcW w:w="2405" w:type="dxa"/>
+            <w:vAlign w:val="center"/>
+          </w:tcPr>
+          <w:p>
+            <w:r>
+              <w:t>WebBrowser</w:t>
+            </w:r>
+          </w:p>
+        </w:tc>
+        <w:tc>
+          <w:tcPr>
+            <w:tcW w:w="2693" w:type="dxa"/>
+            <w:vAlign w:val="center"/>
+          </w:tcPr>
+          <w:p>
+            <w:r>
+              <w:t>Client runtime</w:t>
+            </w:r>
+          </w:p>
+        </w:tc>
+        <w:tc>
+          <w:tcPr>
+            <w:tcW w:w="4530" w:type="dxa"/>
+            <w:vAlign w:val="center"/>
+          </w:tcPr>
+          <w:p>
+            <w:r>
+              <w:t>Gestione del rendering delle pagine web generate dal server, supporta HTML5 e CSS3</w:t>
+            </w:r>
+          </w:p>
+        </w:tc>
+      </w:tr>
+    </w:tbl>
+    <w:p>
+      <w:pPr>
+        <w:rPr>
+          <w:b/>
+          <w:bCs/>
+        </w:rPr>
+      </w:pPr>
+    </w:p>
+    <w:p/>
+    <w:p/>
+    <w:p/>
+    <w:p/>
+    <w:p/>
+    <w:p/>
+    <w:p/>
+    <w:p/>
+    <w:p/>
+    <w:p/>
+    <w:p/>
+    <w:p/>
+    <w:p/>
+    <w:p/>
+    <w:p/>
+    <w:p/>
+    <w:p/>
+    <w:p/>
+    <w:p/>
+    <w:p/>
+    <w:p/>
+    <w:p/>
+    <w:p/>
+    <w:p/>
+    <w:p/>
+    <w:p/>
+    <w:p>
       <w:r>
         <w:t>I sottosistemi individuati sono:</w:t>
       </w:r>
     </w:p>
     <w:p>
-      <w:proofErr w:type="spellStart"/>
       <w:r>
         <w:t>EWMSClient</w:t>
       </w:r>
-      <w:proofErr w:type="spellEnd"/>
       <w:r>
         <w:t>: per gestire l’interazione con l’utente</w:t>
       </w:r>
@@ -24,32 +875,17 @@
       </w:r>
     </w:p>
     <w:p>
-      <w:proofErr w:type="spellStart"/>
-      <w:r>
-        <w:t>EWMSServer</w:t>
-      </w:r>
-      <w:proofErr w:type="spellEnd"/>
-      <w:r>
-        <w:t xml:space="preserve">: responsabile per il controllo di accesso e concorrenza, delega agli altri </w:t>
-      </w:r>
-      <w:proofErr w:type="spellStart"/>
-      <w:r>
-        <w:t>subsystem</w:t>
-      </w:r>
-      <w:proofErr w:type="spellEnd"/>
-      <w:r>
-        <w:t xml:space="preserve"> la logica applicativa. </w:t>
-      </w:r>
-    </w:p>
-    <w:p>
-      <w:proofErr w:type="spellStart"/>
+      <w:r>
+        <w:t xml:space="preserve">EWMSServer: responsabile per il controllo di accesso e concorrenza, delega agli altri subsystem la logica applicativa. </w:t>
+      </w:r>
+    </w:p>
+    <w:p>
       <w:r>
         <w:t>Access</w:t>
       </w:r>
       <w:r>
         <w:t>Management</w:t>
       </w:r>
-      <w:proofErr w:type="spellEnd"/>
       <w:r>
         <w:t>: per gestire le operazioni di login e logout del sistema</w:t>
       </w:r>
@@ -58,7 +894,6 @@
       </w:r>
     </w:p>
     <w:p>
-      <w:proofErr w:type="spellStart"/>
       <w:r>
         <w:t>Account</w:t>
       </w:r>
@@ -71,7 +906,6 @@
       <w:r>
         <w:t>t</w:t>
       </w:r>
-      <w:proofErr w:type="spellEnd"/>
       <w:r>
         <w:t xml:space="preserve">: </w:t>
       </w:r>
@@ -86,56 +920,31 @@
       </w:r>
     </w:p>
     <w:p>
-      <w:proofErr w:type="spellStart"/>
-      <w:r>
-        <w:t>TaskManagement</w:t>
-      </w:r>
-      <w:proofErr w:type="spellEnd"/>
-      <w:r>
-        <w:t>: Gestisce tutti i Servizi le</w:t>
-      </w:r>
-      <w:r>
-        <w:t xml:space="preserve">gati al ciclo di vita </w:t>
-      </w:r>
-      <w:proofErr w:type="gramStart"/>
-      <w:r>
-        <w:t>delle task</w:t>
-      </w:r>
-      <w:proofErr w:type="gramEnd"/>
-    </w:p>
-    <w:p/>
-    <w:p>
-      <w:proofErr w:type="spellStart"/>
-      <w:r>
-        <w:t>NotificheManagement</w:t>
-      </w:r>
-      <w:proofErr w:type="spellEnd"/>
-      <w:r>
-        <w:t>: serve a gestire i servizi di notifica</w:t>
+      <w:r>
+        <w:t>TaskManagement: Gestisce tutti i Servizi le</w:t>
+      </w:r>
+      <w:r>
+        <w:t>gati al ciclo di vita delle task</w:t>
+      </w:r>
+    </w:p>
+    <w:p/>
+    <w:p>
+      <w:r>
+        <w:t>NotificheManagement: serve a gestire i servizi di notifica</w:t>
       </w:r>
       <w:r>
         <w:t>.</w:t>
       </w:r>
     </w:p>
     <w:p>
-      <w:proofErr w:type="spellStart"/>
       <w:r>
         <w:t>Persistence</w:t>
       </w:r>
       <w:r>
         <w:t>Management</w:t>
       </w:r>
-      <w:proofErr w:type="spellEnd"/>
-      <w:r>
-        <w:t xml:space="preserve">: Servizi di persistenza delle </w:t>
-      </w:r>
-      <w:proofErr w:type="spellStart"/>
-      <w:r>
-        <w:t>entity</w:t>
-      </w:r>
-      <w:proofErr w:type="spellEnd"/>
-      <w:r>
-        <w:t xml:space="preserve"> class</w:t>
+      <w:r>
+        <w:t>: Servizi di persistenza delle entity class</w:t>
       </w:r>
       <w:r>
         <w:t>, controlla la logica di accesso ai dati.</w:t>
@@ -199,6 +1008,216 @@
     </w:sectPr>
   </w:body>
 </w:document>
+</file>
+
+<file path=word/numbering.xml><?xml version="1.0" encoding="utf-8"?>
+<w:numbering xmlns:wpc="http://schemas.microsoft.com/office/word/2010/wordprocessingCanvas" xmlns:cx="http://schemas.microsoft.com/office/drawing/2014/chartex" xmlns:cx1="http://schemas.microsoft.com/office/drawing/2015/9/8/chartex" xmlns:cx2="http://schemas.microsoft.com/office/drawing/2015/10/21/chartex" xmlns:cx3="http://schemas.microsoft.com/office/drawing/2016/5/9/chartex" xmlns:cx4="http://schemas.microsoft.com/office/drawing/2016/5/10/chartex" xmlns:cx5="http://schemas.microsoft.com/office/drawing/2016/5/11/chartex" xmlns:cx6="http://schemas.microsoft.com/office/drawing/2016/5/12/chartex" xmlns:cx7="http://schemas.microsoft.com/office/drawing/2016/5/13/chartex" xmlns:cx8="http://schemas.microsoft.com/office/drawing/2016/5/14/chartex" xmlns:mc="http://schemas.openxmlformats.org/markup-compatibility/2006" xmlns:aink="http://schemas.microsoft.com/office/drawing/2016/ink" xmlns:am3d="http://schemas.microsoft.com/office/drawing/2017/model3d" xmlns:o="urn:schemas-microsoft-com:office:office" xmlns:oel="http://schemas.microsoft.com/office/2019/extlst" xmlns:r="http://schemas.openxmlformats.org/officeDocument/2006/relationships" xmlns:m="http://schemas.openxmlformats.org/officeDocument/2006/math" xmlns:v="urn:schemas-microsoft-com:vml" xmlns:wp14="http://schemas.microsoft.com/office/word/2010/wordprocessingDrawing" xmlns:wp="http://schemas.openxmlformats.org/drawingml/2006/wordprocessingDrawing" xmlns:w10="urn:schemas-microsoft-com:office:word" xmlns:w="http://schemas.openxmlformats.org/wordprocessingml/2006/main" xmlns:w14="http://schemas.microsoft.com/office/word/2010/wordml" xmlns:w15="http://schemas.microsoft.com/office/word/2012/wordml" xmlns:w16cex="http://schemas.microsoft.com/office/word/2018/wordml/cex" xmlns:w16cid="http://schemas.microsoft.com/office/word/2016/wordml/cid" xmlns:w16="http://schemas.microsoft.com/office/word/2018/wordml" xmlns:w16du="http://schemas.microsoft.com/office/word/2023/wordml/word16du" xmlns:w16sdtdh="http://schemas.microsoft.com/office/word/2020/wordml/sdtdatahash" xmlns:w16sdtfl="http://schemas.microsoft.com/office/word/2024/wordml/sdtformatlock" xmlns:w16se="http://schemas.microsoft.com/office/word/2015/wordml/symex" xmlns:wpg="http://schemas.microsoft.com/office/word/2010/wordprocessingGroup" xmlns:wpi="http://schemas.microsoft.com/office/word/2010/wordprocessingInk" xmlns:wne="http://schemas.microsoft.com/office/word/2006/wordml" xmlns:wps="http://schemas.microsoft.com/office/word/2010/wordprocessingShape" mc:Ignorable="w14 w15 w16se w16cid w16 w16cex w16sdtdh w16sdtfl w16du wp14">
+  <w:abstractNum w:abstractNumId="0" w15:restartNumberingAfterBreak="0">
+    <w:nsid w:val="4E3D350D"/>
+    <w:multiLevelType w:val="hybridMultilevel"/>
+    <w:tmpl w:val="C1403E7E"/>
+    <w:lvl w:ilvl="0" w:tplc="0410000F">
+      <w:start w:val="1"/>
+      <w:numFmt w:val="decimal"/>
+      <w:lvlText w:val="%1."/>
+      <w:lvlJc w:val="left"/>
+      <w:pPr>
+        <w:ind w:left="720" w:hanging="360"/>
+      </w:pPr>
+    </w:lvl>
+    <w:lvl w:ilvl="1" w:tplc="04100019" w:tentative="1">
+      <w:start w:val="1"/>
+      <w:numFmt w:val="lowerLetter"/>
+      <w:lvlText w:val="%2."/>
+      <w:lvlJc w:val="left"/>
+      <w:pPr>
+        <w:ind w:left="1440" w:hanging="360"/>
+      </w:pPr>
+    </w:lvl>
+    <w:lvl w:ilvl="2" w:tplc="0410001B" w:tentative="1">
+      <w:start w:val="1"/>
+      <w:numFmt w:val="lowerRoman"/>
+      <w:lvlText w:val="%3."/>
+      <w:lvlJc w:val="right"/>
+      <w:pPr>
+        <w:ind w:left="2160" w:hanging="180"/>
+      </w:pPr>
+    </w:lvl>
+    <w:lvl w:ilvl="3" w:tplc="0410000F" w:tentative="1">
+      <w:start w:val="1"/>
+      <w:numFmt w:val="decimal"/>
+      <w:lvlText w:val="%4."/>
+      <w:lvlJc w:val="left"/>
+      <w:pPr>
+        <w:ind w:left="2880" w:hanging="360"/>
+      </w:pPr>
+    </w:lvl>
+    <w:lvl w:ilvl="4" w:tplc="04100019" w:tentative="1">
+      <w:start w:val="1"/>
+      <w:numFmt w:val="lowerLetter"/>
+      <w:lvlText w:val="%5."/>
+      <w:lvlJc w:val="left"/>
+      <w:pPr>
+        <w:ind w:left="3600" w:hanging="360"/>
+      </w:pPr>
+    </w:lvl>
+    <w:lvl w:ilvl="5" w:tplc="0410001B" w:tentative="1">
+      <w:start w:val="1"/>
+      <w:numFmt w:val="lowerRoman"/>
+      <w:lvlText w:val="%6."/>
+      <w:lvlJc w:val="right"/>
+      <w:pPr>
+        <w:ind w:left="4320" w:hanging="180"/>
+      </w:pPr>
+    </w:lvl>
+    <w:lvl w:ilvl="6" w:tplc="0410000F" w:tentative="1">
+      <w:start w:val="1"/>
+      <w:numFmt w:val="decimal"/>
+      <w:lvlText w:val="%7."/>
+      <w:lvlJc w:val="left"/>
+      <w:pPr>
+        <w:ind w:left="5040" w:hanging="360"/>
+      </w:pPr>
+    </w:lvl>
+    <w:lvl w:ilvl="7" w:tplc="04100019" w:tentative="1">
+      <w:start w:val="1"/>
+      <w:numFmt w:val="lowerLetter"/>
+      <w:lvlText w:val="%8."/>
+      <w:lvlJc w:val="left"/>
+      <w:pPr>
+        <w:ind w:left="5760" w:hanging="360"/>
+      </w:pPr>
+    </w:lvl>
+    <w:lvl w:ilvl="8" w:tplc="0410001B" w:tentative="1">
+      <w:start w:val="1"/>
+      <w:numFmt w:val="lowerRoman"/>
+      <w:lvlText w:val="%9."/>
+      <w:lvlJc w:val="right"/>
+      <w:pPr>
+        <w:ind w:left="6480" w:hanging="180"/>
+      </w:pPr>
+    </w:lvl>
+  </w:abstractNum>
+  <w:abstractNum w:abstractNumId="1" w15:restartNumberingAfterBreak="0">
+    <w:nsid w:val="7E752170"/>
+    <w:multiLevelType w:val="hybridMultilevel"/>
+    <w:tmpl w:val="88C0D706"/>
+    <w:lvl w:ilvl="0" w:tplc="F5B6D510">
+      <w:start w:val="3"/>
+      <w:numFmt w:val="bullet"/>
+      <w:lvlText w:val="-"/>
+      <w:lvlJc w:val="left"/>
+      <w:pPr>
+        <w:ind w:left="720" w:hanging="360"/>
+      </w:pPr>
+      <w:rPr>
+        <w:rFonts w:ascii="Times New Roman" w:eastAsiaTheme="minorHAnsi" w:hAnsi="Times New Roman" w:cs="Times New Roman" w:hint="default"/>
+      </w:rPr>
+    </w:lvl>
+    <w:lvl w:ilvl="1" w:tplc="04100003" w:tentative="1">
+      <w:start w:val="1"/>
+      <w:numFmt w:val="bullet"/>
+      <w:lvlText w:val="o"/>
+      <w:lvlJc w:val="left"/>
+      <w:pPr>
+        <w:ind w:left="1440" w:hanging="360"/>
+      </w:pPr>
+      <w:rPr>
+        <w:rFonts w:ascii="Courier New" w:hAnsi="Courier New" w:cs="Courier New" w:hint="default"/>
+      </w:rPr>
+    </w:lvl>
+    <w:lvl w:ilvl="2" w:tplc="04100005" w:tentative="1">
+      <w:start w:val="1"/>
+      <w:numFmt w:val="bullet"/>
+      <w:lvlText w:val=""/>
+      <w:lvlJc w:val="left"/>
+      <w:pPr>
+        <w:ind w:left="2160" w:hanging="360"/>
+      </w:pPr>
+      <w:rPr>
+        <w:rFonts w:ascii="Wingdings" w:hAnsi="Wingdings" w:hint="default"/>
+      </w:rPr>
+    </w:lvl>
+    <w:lvl w:ilvl="3" w:tplc="04100001" w:tentative="1">
+      <w:start w:val="1"/>
+      <w:numFmt w:val="bullet"/>
+      <w:lvlText w:val=""/>
+      <w:lvlJc w:val="left"/>
+      <w:pPr>
+        <w:ind w:left="2880" w:hanging="360"/>
+      </w:pPr>
+      <w:rPr>
+        <w:rFonts w:ascii="Symbol" w:hAnsi="Symbol" w:hint="default"/>
+      </w:rPr>
+    </w:lvl>
+    <w:lvl w:ilvl="4" w:tplc="04100003" w:tentative="1">
+      <w:start w:val="1"/>
+      <w:numFmt w:val="bullet"/>
+      <w:lvlText w:val="o"/>
+      <w:lvlJc w:val="left"/>
+      <w:pPr>
+        <w:ind w:left="3600" w:hanging="360"/>
+      </w:pPr>
+      <w:rPr>
+        <w:rFonts w:ascii="Courier New" w:hAnsi="Courier New" w:cs="Courier New" w:hint="default"/>
+      </w:rPr>
+    </w:lvl>
+    <w:lvl w:ilvl="5" w:tplc="04100005" w:tentative="1">
+      <w:start w:val="1"/>
+      <w:numFmt w:val="bullet"/>
+      <w:lvlText w:val=""/>
+      <w:lvlJc w:val="left"/>
+      <w:pPr>
+        <w:ind w:left="4320" w:hanging="360"/>
+      </w:pPr>
+      <w:rPr>
+        <w:rFonts w:ascii="Wingdings" w:hAnsi="Wingdings" w:hint="default"/>
+      </w:rPr>
+    </w:lvl>
+    <w:lvl w:ilvl="6" w:tplc="04100001" w:tentative="1">
+      <w:start w:val="1"/>
+      <w:numFmt w:val="bullet"/>
+      <w:lvlText w:val=""/>
+      <w:lvlJc w:val="left"/>
+      <w:pPr>
+        <w:ind w:left="5040" w:hanging="360"/>
+      </w:pPr>
+      <w:rPr>
+        <w:rFonts w:ascii="Symbol" w:hAnsi="Symbol" w:hint="default"/>
+      </w:rPr>
+    </w:lvl>
+    <w:lvl w:ilvl="7" w:tplc="04100003" w:tentative="1">
+      <w:start w:val="1"/>
+      <w:numFmt w:val="bullet"/>
+      <w:lvlText w:val="o"/>
+      <w:lvlJc w:val="left"/>
+      <w:pPr>
+        <w:ind w:left="5760" w:hanging="360"/>
+      </w:pPr>
+      <w:rPr>
+        <w:rFonts w:ascii="Courier New" w:hAnsi="Courier New" w:cs="Courier New" w:hint="default"/>
+      </w:rPr>
+    </w:lvl>
+    <w:lvl w:ilvl="8" w:tplc="04100005" w:tentative="1">
+      <w:start w:val="1"/>
+      <w:numFmt w:val="bullet"/>
+      <w:lvlText w:val=""/>
+      <w:lvlJc w:val="left"/>
+      <w:pPr>
+        <w:ind w:left="6480" w:hanging="360"/>
+      </w:pPr>
+      <w:rPr>
+        <w:rFonts w:ascii="Wingdings" w:hAnsi="Wingdings" w:hint="default"/>
+      </w:rPr>
+    </w:lvl>
+  </w:abstractNum>
+  <w:num w:numId="1" w16cid:durableId="873422198">
+    <w:abstractNumId w:val="0"/>
+  </w:num>
+  <w:num w:numId="2" w16cid:durableId="1843158215">
+    <w:abstractNumId w:val="1"/>
+  </w:num>
+</w:numbering>
 </file>
 
 <file path=word/styles.xml><?xml version="1.0" encoding="utf-8"?>
@@ -634,7 +1653,6 @@
     <w:next w:val="Normale"/>
     <w:link w:val="Titolo2Carattere"/>
     <w:uiPriority w:val="9"/>
-    <w:semiHidden/>
     <w:unhideWhenUsed/>
     <w:qFormat/>
     <w:rsid w:val="003F6CE1"/>
@@ -657,7 +1675,6 @@
     <w:next w:val="Normale"/>
     <w:link w:val="Titolo3Carattere"/>
     <w:uiPriority w:val="9"/>
-    <w:semiHidden/>
     <w:unhideWhenUsed/>
     <w:qFormat/>
     <w:rsid w:val="003F6CE1"/>
@@ -809,7 +1826,6 @@
   <w:style w:type="character" w:default="1" w:styleId="Carpredefinitoparagrafo">
     <w:name w:val="Default Paragraph Font"/>
     <w:uiPriority w:val="1"/>
-    <w:semiHidden/>
     <w:unhideWhenUsed/>
   </w:style>
   <w:style w:type="table" w:default="1" w:styleId="Tabellanormale">
@@ -851,7 +1867,6 @@
     <w:basedOn w:val="Carpredefinitoparagrafo"/>
     <w:link w:val="Titolo2"/>
     <w:uiPriority w:val="9"/>
-    <w:semiHidden/>
     <w:rsid w:val="003F6CE1"/>
     <w:rPr>
       <w:rFonts w:asciiTheme="majorHAnsi" w:eastAsiaTheme="majorEastAsia" w:hAnsiTheme="majorHAnsi" w:cstheme="majorBidi"/>
@@ -865,7 +1880,6 @@
     <w:basedOn w:val="Carpredefinitoparagrafo"/>
     <w:link w:val="Titolo3"/>
     <w:uiPriority w:val="9"/>
-    <w:semiHidden/>
     <w:rsid w:val="003F6CE1"/>
     <w:rPr>
       <w:rFonts w:eastAsiaTheme="majorEastAsia" w:cstheme="majorBidi"/>
@@ -1122,6 +2136,25 @@
       <w:color w:val="0F4761" w:themeColor="accent1" w:themeShade="BF"/>
       <w:spacing w:val="5"/>
     </w:rPr>
+  </w:style>
+  <w:style w:type="table" w:styleId="Grigliatabella">
+    <w:name w:val="Table Grid"/>
+    <w:basedOn w:val="Tabellanormale"/>
+    <w:uiPriority w:val="39"/>
+    <w:rsid w:val="00086E02"/>
+    <w:pPr>
+      <w:spacing w:after="0" w:line="240" w:lineRule="auto"/>
+    </w:pPr>
+    <w:tblPr>
+      <w:tblBorders>
+        <w:top w:val="single" w:sz="4" w:space="0" w:color="auto"/>
+        <w:left w:val="single" w:sz="4" w:space="0" w:color="auto"/>
+        <w:bottom w:val="single" w:sz="4" w:space="0" w:color="auto"/>
+        <w:right w:val="single" w:sz="4" w:space="0" w:color="auto"/>
+        <w:insideH w:val="single" w:sz="4" w:space="0" w:color="auto"/>
+        <w:insideV w:val="single" w:sz="4" w:space="0" w:color="auto"/>
+      </w:tblBorders>
+    </w:tblPr>
   </w:style>
 </w:styles>
 </file>
@@ -1419,4 +2452,16 @@
     </a:ext>
   </a:extLst>
 </a:theme>
+</file>
+
+<file path=customXml/item1.xml><?xml version="1.0" encoding="utf-8"?>
+<b:Sources xmlns:b="http://schemas.openxmlformats.org/officeDocument/2006/bibliography" xmlns="http://schemas.openxmlformats.org/officeDocument/2006/bibliography" SelectedStyle="\APASixthEditionOfficeOnline.xsl" StyleName="APA" Version="6"/>
+</file>
+
+<file path=customXml/itemProps1.xml><?xml version="1.0" encoding="utf-8"?>
+<ds:datastoreItem xmlns:ds="http://schemas.openxmlformats.org/officeDocument/2006/customXml" ds:itemID="{A433ACB3-C98B-4653-B36F-5FCE27FD2471}">
+  <ds:schemaRefs>
+    <ds:schemaRef ds:uri="http://schemas.openxmlformats.org/officeDocument/2006/bibliography"/>
+  </ds:schemaRefs>
+</ds:datastoreItem>
 </file>
</xml_diff>

<commit_message>
Mod: modificato documento 3.2 Subsystem decomposition, aggiunti ed espansi punti 3.4/5/6
</commit_message>
<xml_diff>
--- a/Workspace/SDD/PuntiSingoli/3.2 - Subsystem decomposition.docx
+++ b/Workspace/SDD/PuntiSingoli/3.2 - Subsystem decomposition.docx
@@ -4,31 +4,45 @@
   <w:body>
     <w:p>
       <w:pPr>
+        <w:pStyle w:val="Titolo1"/>
+        <w:ind w:left="-426"/>
+      </w:pPr>
+      <w:r>
+        <w:t>3. Architettura del software proposto</w:t>
+      </w:r>
+    </w:p>
+    <w:p>
+      <w:pPr>
         <w:pStyle w:val="Titolo2"/>
-        <w:ind w:left="-426"/>
-      </w:pPr>
-      <w:r>
-        <w:t>3. Architettura del software proposto</w:t>
-      </w:r>
-    </w:p>
-    <w:p>
-      <w:pPr>
-        <w:pStyle w:val="Titolo3"/>
-      </w:pPr>
-      <w:r>
-        <w:t>3.1 Overview</w:t>
-      </w:r>
-    </w:p>
-    <w:p/>
-    <w:p>
-      <w:r>
-        <w:t>Il sistema Easy Work Management System (E.W.M.S.) è progettato seguendo un'architettura software Three-Tier (a tre livelli) basata sul web.</w:t>
-      </w:r>
-      <w:r>
-        <w:t xml:space="preserve"> </w:t>
-      </w:r>
-      <w:r>
-        <w:t>L'architettura segue il design pattern Model-View-Controller (MVC) per l'organizzazione della logica applicativa.</w:t>
+      </w:pPr>
+      <w:r>
+        <w:t xml:space="preserve">3.1 </w:t>
+      </w:r>
+      <w:proofErr w:type="spellStart"/>
+      <w:r>
+        <w:t>Overview</w:t>
+      </w:r>
+      <w:proofErr w:type="spellEnd"/>
+    </w:p>
+    <w:p>
+      <w:r>
+        <w:t>Il sistema Easy Work Management System (E.W.M.S.) è progettato seguendo un'architettura software Three-</w:t>
+      </w:r>
+      <w:proofErr w:type="spellStart"/>
+      <w:r>
+        <w:t>Tier</w:t>
+      </w:r>
+      <w:proofErr w:type="spellEnd"/>
+      <w:r>
+        <w:t xml:space="preserve"> (a tre livelli) basata sul web. L'architettura segue il design pattern Model-</w:t>
+      </w:r>
+      <w:proofErr w:type="spellStart"/>
+      <w:r>
+        <w:t>View</w:t>
+      </w:r>
+      <w:proofErr w:type="spellEnd"/>
+      <w:r>
+        <w:t>-Controller (MVC) per l'organizzazione della logica applicativa.</w:t>
       </w:r>
       <w:r>
         <w:t xml:space="preserve"> </w:t>
@@ -52,16 +66,22 @@
           <w:b/>
           <w:bCs/>
         </w:rPr>
-        <w:t>Presentation layer</w:t>
-      </w:r>
+        <w:t xml:space="preserve">Presentation </w:t>
+      </w:r>
+      <w:proofErr w:type="spellStart"/>
+      <w:r>
+        <w:rPr>
+          <w:b/>
+          <w:bCs/>
+        </w:rPr>
+        <w:t>layer</w:t>
+      </w:r>
+      <w:proofErr w:type="spellEnd"/>
       <w:r>
         <w:t xml:space="preserve">: costituisce il livello </w:t>
       </w:r>
       <w:r>
-        <w:t xml:space="preserve">di presentazione accessibile agli utenti </w:t>
-      </w:r>
-      <w:r>
-        <w:t>finali.</w:t>
+        <w:t>di presentazione accessibile agli utenti finali.</w:t>
       </w:r>
       <w:r>
         <w:t xml:space="preserve"> </w:t>
@@ -83,8 +103,17 @@
           <w:b/>
           <w:bCs/>
         </w:rPr>
-        <w:t>Application layer</w:t>
-      </w:r>
+        <w:t xml:space="preserve">Application </w:t>
+      </w:r>
+      <w:proofErr w:type="spellStart"/>
+      <w:r>
+        <w:rPr>
+          <w:b/>
+          <w:bCs/>
+        </w:rPr>
+        <w:t>layer</w:t>
+      </w:r>
+      <w:proofErr w:type="spellEnd"/>
       <w:r>
         <w:t>:</w:t>
       </w:r>
@@ -92,7 +121,10 @@
         <w:t xml:space="preserve"> costituisce il cuore del sistema, </w:t>
       </w:r>
       <w:r>
-        <w:t>spitato su un Web Server Apache Tomcat. Questo livello implementa la logica di business e il controllo del flusso applicativo.</w:t>
+        <w:t>ospitato</w:t>
+      </w:r>
+      <w:r>
+        <w:t xml:space="preserve"> su un Web Server Apache Tomcat. Questo livello implementa la logica di business e il controllo del flusso applicativo.</w:t>
       </w:r>
     </w:p>
     <w:p>
@@ -103,30 +135,48 @@
           <w:numId w:val="2"/>
         </w:numPr>
       </w:pPr>
+      <w:proofErr w:type="spellStart"/>
       <w:r>
         <w:rPr>
           <w:b/>
           <w:bCs/>
         </w:rPr>
-        <w:t>Persistence layer</w:t>
-      </w:r>
-      <w:r>
-        <w:t>:</w:t>
-      </w:r>
-      <w:r>
-        <w:t xml:space="preserve"> </w:t>
-      </w:r>
-      <w:r>
-        <w:t>Costituisce il livello di persistenza dei dati. È composto da un Database Management System (DBMS) relazionale</w:t>
-      </w:r>
-      <w:r>
-        <w:t xml:space="preserve">, il server applicativo comunica con questo livello utilizzando lo standard </w:t>
-      </w:r>
+        <w:t>Persistence</w:t>
+      </w:r>
+      <w:proofErr w:type="spellEnd"/>
       <w:r>
         <w:rPr>
           <w:b/>
           <w:bCs/>
         </w:rPr>
+        <w:t xml:space="preserve"> </w:t>
+      </w:r>
+      <w:proofErr w:type="spellStart"/>
+      <w:r>
+        <w:rPr>
+          <w:b/>
+          <w:bCs/>
+        </w:rPr>
+        <w:t>layer</w:t>
+      </w:r>
+      <w:proofErr w:type="spellEnd"/>
+      <w:r>
+        <w:t>:</w:t>
+      </w:r>
+      <w:r>
+        <w:t xml:space="preserve"> </w:t>
+      </w:r>
+      <w:r>
+        <w:t>Costituisce il livello di persistenza dei dati. È composto da un Database Management System (DBMS) relazionale</w:t>
+      </w:r>
+      <w:r>
+        <w:t xml:space="preserve">, il server applicativo comunica con questo livello utilizzando lo standard </w:t>
+      </w:r>
+      <w:r>
+        <w:rPr>
+          <w:b/>
+          <w:bCs/>
+        </w:rPr>
         <w:t>JDBC</w:t>
       </w:r>
       <w:r>
@@ -136,16 +186,29 @@
     <w:p/>
     <w:p>
       <w:pPr>
-        <w:pStyle w:val="Titolo3"/>
-      </w:pPr>
-      <w:r>
-        <w:t>3.2 Decomposizione in subsystem</w:t>
-      </w:r>
+        <w:pStyle w:val="Titolo2"/>
+      </w:pPr>
+      <w:r>
+        <w:t xml:space="preserve">3.2 Decomposizione in </w:t>
+      </w:r>
+      <w:proofErr w:type="spellStart"/>
+      <w:r>
+        <w:t>subsystem</w:t>
+      </w:r>
+      <w:proofErr w:type="spellEnd"/>
     </w:p>
     <w:p/>
     <w:p>
       <w:r>
-        <w:t>Di seguito viene presentato il sistema scomposto in “subsystem” e le relative dipendenze.</w:t>
+        <w:t>Di seguito viene presentato il sistema scomposto in “</w:t>
+      </w:r>
+      <w:proofErr w:type="spellStart"/>
+      <w:r>
+        <w:t>subsystem</w:t>
+      </w:r>
+      <w:proofErr w:type="spellEnd"/>
+      <w:r>
+        <w:t>” e le relative dipendenze.</w:t>
       </w:r>
     </w:p>
     <w:p/>
@@ -264,9 +327,11 @@
             <w:tcW w:w="2376" w:type="dxa"/>
           </w:tcPr>
           <w:p>
+            <w:proofErr w:type="spellStart"/>
             <w:r>
               <w:t>EWMSClient</w:t>
             </w:r>
+            <w:proofErr w:type="spellEnd"/>
           </w:p>
         </w:tc>
         <w:tc>
@@ -286,8 +351,13 @@
             <w:tcW w:w="2376" w:type="dxa"/>
           </w:tcPr>
           <w:p>
-            <w:r>
-              <w:t xml:space="preserve">EWMSServer </w:t>
+            <w:proofErr w:type="spellStart"/>
+            <w:r>
+              <w:t>EWMSServer</w:t>
+            </w:r>
+            <w:proofErr w:type="spellEnd"/>
+            <w:r>
+              <w:t xml:space="preserve"> </w:t>
             </w:r>
           </w:p>
         </w:tc>
@@ -314,8 +384,13 @@
             <w:tcW w:w="2376" w:type="dxa"/>
           </w:tcPr>
           <w:p>
-            <w:r>
-              <w:t xml:space="preserve">AccessManagement </w:t>
+            <w:proofErr w:type="spellStart"/>
+            <w:r>
+              <w:t>AccessManagement</w:t>
+            </w:r>
+            <w:proofErr w:type="spellEnd"/>
+            <w:r>
+              <w:t xml:space="preserve"> </w:t>
             </w:r>
           </w:p>
         </w:tc>
@@ -339,9 +414,11 @@
             <w:tcW w:w="2376" w:type="dxa"/>
           </w:tcPr>
           <w:p>
+            <w:proofErr w:type="spellStart"/>
             <w:r>
               <w:t>AccountManagement</w:t>
             </w:r>
+            <w:proofErr w:type="spellEnd"/>
           </w:p>
         </w:tc>
         <w:tc>
@@ -361,9 +438,11 @@
             <w:tcW w:w="2376" w:type="dxa"/>
           </w:tcPr>
           <w:p>
+            <w:proofErr w:type="spellStart"/>
             <w:r>
               <w:t>TaskManagement</w:t>
             </w:r>
+            <w:proofErr w:type="spellEnd"/>
           </w:p>
         </w:tc>
         <w:tc>
@@ -383,9 +462,11 @@
             <w:tcW w:w="2376" w:type="dxa"/>
           </w:tcPr>
           <w:p>
+            <w:proofErr w:type="spellStart"/>
             <w:r>
               <w:t>NotificheManagement</w:t>
             </w:r>
+            <w:proofErr w:type="spellEnd"/>
           </w:p>
         </w:tc>
         <w:tc>
@@ -405,9 +486,11 @@
             <w:tcW w:w="2376" w:type="dxa"/>
           </w:tcPr>
           <w:p>
+            <w:proofErr w:type="spellStart"/>
             <w:r>
               <w:t>PersistenceManagement</w:t>
             </w:r>
+            <w:proofErr w:type="spellEnd"/>
           </w:p>
         </w:tc>
         <w:tc>
@@ -442,7 +525,15 @@
     <w:p/>
     <w:p>
       <w:r>
-        <w:t>Il sistema E.W.M.S. è distribuito su tre nodi computazionali distinti, corrispondenti ai livelli dell'architettura Three-Tier:</w:t>
+        <w:t>Il sistema E.W.M.S. è distribuito su tre nodi computazionali distinti, corrispondenti ai livelli dell'architettura Three-</w:t>
+      </w:r>
+      <w:proofErr w:type="spellStart"/>
+      <w:r>
+        <w:t>Tier</w:t>
+      </w:r>
+      <w:proofErr w:type="spellEnd"/>
+      <w:r>
+        <w:t>:</w:t>
       </w:r>
     </w:p>
     <w:p>
@@ -458,16 +549,41 @@
           <w:b/>
           <w:bCs/>
         </w:rPr>
-        <w:t>Client Node</w:t>
-      </w:r>
-      <w:r>
-        <w:t>: il dispositivo dell’utente finale, essendo EWMS una web application che gira sul server di azienda n</w:t>
+        <w:t xml:space="preserve">Client </w:t>
+      </w:r>
+      <w:proofErr w:type="spellStart"/>
+      <w:r>
+        <w:rPr>
+          <w:b/>
+          <w:bCs/>
+        </w:rPr>
+        <w:t>Node</w:t>
+      </w:r>
+      <w:proofErr w:type="spellEnd"/>
+      <w:r>
+        <w:t xml:space="preserve">: il dispositivo dell’utente finale, essendo EWMS una web </w:t>
+      </w:r>
+      <w:proofErr w:type="spellStart"/>
+      <w:r>
+        <w:t>application</w:t>
+      </w:r>
+      <w:proofErr w:type="spellEnd"/>
+      <w:r>
+        <w:t xml:space="preserve"> che gira sul server di azienda n</w:t>
       </w:r>
       <w:r>
         <w:t>on richiede installazione di software proprietario, ma si affida</w:t>
       </w:r>
       <w:r>
-        <w:t xml:space="preserve"> ad un browser (Chrome, Mozilla, Opera ecc…).</w:t>
+        <w:t xml:space="preserve"> ad un browser (Chrome, Mozilla, Opera </w:t>
+      </w:r>
+      <w:proofErr w:type="spellStart"/>
+      <w:r>
+        <w:t>ecc</w:t>
+      </w:r>
+      <w:proofErr w:type="spellEnd"/>
+      <w:r>
+        <w:t>…).</w:t>
       </w:r>
     </w:p>
     <w:p>
@@ -483,10 +599,34 @@
           <w:b/>
           <w:bCs/>
         </w:rPr>
-        <w:t>Application Server Node:</w:t>
-      </w:r>
-      <w:r>
-        <w:t xml:space="preserve"> È il server centrale che ospita la logica applicativa. Esegue il container web necessario per gestire il ciclo di vita delle Servlet e delle pagine JSP.</w:t>
+        <w:t xml:space="preserve">Application Server </w:t>
+      </w:r>
+      <w:proofErr w:type="spellStart"/>
+      <w:r>
+        <w:rPr>
+          <w:b/>
+          <w:bCs/>
+        </w:rPr>
+        <w:t>Node</w:t>
+      </w:r>
+      <w:proofErr w:type="spellEnd"/>
+      <w:r>
+        <w:rPr>
+          <w:b/>
+          <w:bCs/>
+        </w:rPr>
+        <w:t>:</w:t>
+      </w:r>
+      <w:r>
+        <w:t xml:space="preserve"> È il server centrale che ospita la logica applicativa. Esegue il container web necessario per gestire il ciclo di vita delle </w:t>
+      </w:r>
+      <w:proofErr w:type="spellStart"/>
+      <w:r>
+        <w:t>Servlet</w:t>
+      </w:r>
+      <w:proofErr w:type="spellEnd"/>
+      <w:r>
+        <w:t xml:space="preserve"> e delle pagine JSP.</w:t>
       </w:r>
     </w:p>
     <w:p>
@@ -502,7 +642,23 @@
           <w:b/>
           <w:bCs/>
         </w:rPr>
-        <w:t>Database Server Node:</w:t>
+        <w:t xml:space="preserve">Database Server </w:t>
+      </w:r>
+      <w:proofErr w:type="spellStart"/>
+      <w:r>
+        <w:rPr>
+          <w:b/>
+          <w:bCs/>
+        </w:rPr>
+        <w:t>Node</w:t>
+      </w:r>
+      <w:proofErr w:type="spellEnd"/>
+      <w:r>
+        <w:rPr>
+          <w:b/>
+          <w:bCs/>
+        </w:rPr>
+        <w:t>:</w:t>
       </w:r>
       <w:r>
         <w:t xml:space="preserve"> È il server dedicato alla persistenza dei dati. Ospita il DBMS relazionale che memorizza tutte le informazioni di sistema</w:t>
@@ -572,8 +728,17 @@
           <w:bCs/>
         </w:rPr>
         <w:lastRenderedPageBreak/>
-        <w:t>Componenti off-the-shelfs</w:t>
-      </w:r>
+        <w:t>Componenti off-the-</w:t>
+      </w:r>
+      <w:proofErr w:type="spellStart"/>
+      <w:r>
+        <w:rPr>
+          <w:b/>
+          <w:bCs/>
+        </w:rPr>
+        <w:t>shelfs</w:t>
+      </w:r>
+      <w:proofErr w:type="spellEnd"/>
     </w:p>
     <w:p>
       <w:pPr>
@@ -701,7 +866,23 @@
               <w:t>Ges</w:t>
             </w:r>
             <w:r>
-              <w:t>tione del ciclo di vita di Servlet/JSP e dove verrà caricato il file ewms.war per il deployment</w:t>
+              <w:t xml:space="preserve">tione del ciclo di vita di </w:t>
+            </w:r>
+            <w:proofErr w:type="spellStart"/>
+            <w:r>
+              <w:t>Servlet</w:t>
+            </w:r>
+            <w:proofErr w:type="spellEnd"/>
+            <w:r>
+              <w:t xml:space="preserve">/JSP e dove verrà caricato il file </w:t>
+            </w:r>
+            <w:proofErr w:type="spellStart"/>
+            <w:r>
+              <w:t>ewms.war</w:t>
+            </w:r>
+            <w:proofErr w:type="spellEnd"/>
+            <w:r>
+              <w:t xml:space="preserve"> per il deployment</w:t>
             </w:r>
           </w:p>
         </w:tc>
@@ -766,8 +947,13 @@
           </w:tcPr>
           <w:p>
             <w:r>
-              <w:t>Runtime enviroment</w:t>
-            </w:r>
+              <w:t xml:space="preserve">Runtime </w:t>
+            </w:r>
+            <w:proofErr w:type="spellStart"/>
+            <w:r>
+              <w:t>enviroment</w:t>
+            </w:r>
+            <w:proofErr w:type="spellEnd"/>
           </w:p>
         </w:tc>
         <w:tc>
@@ -792,9 +978,11 @@
             <w:vAlign w:val="center"/>
           </w:tcPr>
           <w:p>
+            <w:proofErr w:type="spellStart"/>
             <w:r>
               <w:t>WebBrowser</w:t>
             </w:r>
+            <w:proofErr w:type="spellEnd"/>
           </w:p>
         </w:tc>
         <w:tc>
@@ -804,8 +992,13 @@
           </w:tcPr>
           <w:p>
             <w:r>
-              <w:t>Client runtime</w:t>
-            </w:r>
+              <w:t xml:space="preserve">Client </w:t>
+            </w:r>
+            <w:proofErr w:type="spellStart"/>
+            <w:r>
+              <w:t>runtime</w:t>
+            </w:r>
+            <w:proofErr w:type="spellEnd"/>
           </w:p>
         </w:tc>
         <w:tc>
@@ -829,6 +1022,1114 @@
         </w:rPr>
       </w:pPr>
     </w:p>
+    <w:p/>
+    <w:p/>
+    <w:p/>
+    <w:p>
+      <w:pPr>
+        <w:pStyle w:val="Titolo2"/>
+      </w:pPr>
+      <w:r>
+        <w:t xml:space="preserve">3.4 </w:t>
+      </w:r>
+      <w:proofErr w:type="spellStart"/>
+      <w:r>
+        <w:t>Persistent</w:t>
+      </w:r>
+      <w:proofErr w:type="spellEnd"/>
+      <w:r>
+        <w:t xml:space="preserve"> Data Management</w:t>
+      </w:r>
+    </w:p>
+    <w:p/>
+    <w:p>
+      <w:r>
+        <w:t>La gestione della persistenza dei dati nel sistema E.W.M.S. è affidata a un RDBMS (</w:t>
+      </w:r>
+      <w:proofErr w:type="spellStart"/>
+      <w:r>
+        <w:t>Relational</w:t>
+      </w:r>
+      <w:proofErr w:type="spellEnd"/>
+      <w:r>
+        <w:t xml:space="preserve"> Database Management System). Il sistema applicativo interagisce con il database per garantire che le informazioni relative agli account, ai task e alle notifiche siano salvate in modo durevole, consistente e sicuro.</w:t>
+      </w:r>
+    </w:p>
+    <w:p>
+      <w:r>
+        <w:t>Il DBMS utilizzato sarà MySQL</w:t>
+      </w:r>
+      <w:r>
+        <w:t xml:space="preserve"> questo ci permetterà di soddisfare le esigenze di </w:t>
+      </w:r>
+      <w:r>
+        <w:rPr>
+          <w:b/>
+          <w:bCs/>
+        </w:rPr>
+        <w:t>c</w:t>
+      </w:r>
+      <w:r>
+        <w:rPr>
+          <w:rStyle w:val="citation-76"/>
+          <w:b/>
+          <w:bCs/>
+        </w:rPr>
+        <w:t xml:space="preserve">ompatibilità </w:t>
+      </w:r>
+      <w:r>
+        <w:rPr>
+          <w:rStyle w:val="citation-76"/>
+        </w:rPr>
+        <w:t xml:space="preserve">essendo presente un </w:t>
+      </w:r>
+      <w:r>
+        <w:rPr>
+          <w:rStyle w:val="citation-76"/>
+          <w:rFonts w:eastAsiaTheme="majorEastAsia"/>
+        </w:rPr>
+        <w:t>s</w:t>
+      </w:r>
+      <w:r>
+        <w:rPr>
+          <w:rStyle w:val="citation-76"/>
+        </w:rPr>
+        <w:t xml:space="preserve">upporto nativo e driver stabili per lo standard </w:t>
+      </w:r>
+      <w:r>
+        <w:rPr>
+          <w:rStyle w:val="citation-76"/>
+        </w:rPr>
+        <w:t>JDBC</w:t>
+      </w:r>
+      <w:r>
+        <w:rPr>
+          <w:rStyle w:val="citation-76"/>
+        </w:rPr>
+        <w:t>, utilizzato dal livello applicativo</w:t>
+      </w:r>
+      <w:r>
+        <w:t xml:space="preserve">. </w:t>
+      </w:r>
+      <w:r>
+        <w:t>Per ottimizzare le prestazioni del database, i file binari (allegati) non verranno memorizzati direttamente come BLOB nel RDBMS. Il sistema utilizzerà un approccio</w:t>
+      </w:r>
+      <w:r>
+        <w:t xml:space="preserve"> su due livelli</w:t>
+      </w:r>
+      <w:r>
+        <w:t>:</w:t>
+      </w:r>
+    </w:p>
+    <w:p>
+      <w:pPr>
+        <w:pStyle w:val="Paragrafoelenco"/>
+        <w:numPr>
+          <w:ilvl w:val="0"/>
+          <w:numId w:val="2"/>
+        </w:numPr>
+      </w:pPr>
+      <w:r>
+        <w:t xml:space="preserve">I </w:t>
+      </w:r>
+      <w:r>
+        <w:rPr>
+          <w:b/>
+          <w:bCs/>
+        </w:rPr>
+        <w:t>file fisici</w:t>
+      </w:r>
+      <w:r>
+        <w:t xml:space="preserve"> verranno salvati in una directory del server applicativo</w:t>
+      </w:r>
+      <w:r>
+        <w:t>.</w:t>
+      </w:r>
+    </w:p>
+    <w:p>
+      <w:pPr>
+        <w:pStyle w:val="Paragrafoelenco"/>
+        <w:numPr>
+          <w:ilvl w:val="0"/>
+          <w:numId w:val="2"/>
+        </w:numPr>
+      </w:pPr>
+      <w:r>
+        <w:t xml:space="preserve">La tabella </w:t>
+      </w:r>
+      <w:r>
+        <w:t>“</w:t>
+      </w:r>
+      <w:r>
+        <w:t>Allegato</w:t>
+      </w:r>
+      <w:r>
+        <w:t>”</w:t>
+      </w:r>
+      <w:r>
+        <w:t xml:space="preserve"> memorizzerà solo i metadati necessari al recupero del file:</w:t>
+      </w:r>
+    </w:p>
+    <w:p>
+      <w:pPr>
+        <w:pStyle w:val="Paragrafoelenco"/>
+        <w:numPr>
+          <w:ilvl w:val="1"/>
+          <w:numId w:val="2"/>
+        </w:numPr>
+      </w:pPr>
+      <w:proofErr w:type="spellStart"/>
+      <w:r>
+        <w:t>Filename</w:t>
+      </w:r>
+      <w:proofErr w:type="spellEnd"/>
+      <w:r>
+        <w:t>: il nome del file caricato,</w:t>
+      </w:r>
+    </w:p>
+    <w:p>
+      <w:pPr>
+        <w:pStyle w:val="Paragrafoelenco"/>
+        <w:numPr>
+          <w:ilvl w:val="1"/>
+          <w:numId w:val="2"/>
+        </w:numPr>
+      </w:pPr>
+      <w:proofErr w:type="spellStart"/>
+      <w:r>
+        <w:t>File_path</w:t>
+      </w:r>
+      <w:proofErr w:type="spellEnd"/>
+      <w:r>
+        <w:t>: dove trovare lato server il file caricato,</w:t>
+      </w:r>
+    </w:p>
+    <w:p>
+      <w:pPr>
+        <w:pStyle w:val="Paragrafoelenco"/>
+        <w:numPr>
+          <w:ilvl w:val="1"/>
+          <w:numId w:val="2"/>
+        </w:numPr>
+      </w:pPr>
+      <w:proofErr w:type="spellStart"/>
+      <w:r>
+        <w:t>Content_type</w:t>
+      </w:r>
+      <w:proofErr w:type="spellEnd"/>
+      <w:r>
+        <w:t>: il tipo MIME (es. pdf, .</w:t>
+      </w:r>
+      <w:proofErr w:type="spellStart"/>
+      <w:r>
+        <w:t>xlsx</w:t>
+      </w:r>
+      <w:proofErr w:type="spellEnd"/>
+      <w:r>
+        <w:t xml:space="preserve"> </w:t>
+      </w:r>
+      <w:proofErr w:type="spellStart"/>
+      <w:r>
+        <w:t>ecc</w:t>
+      </w:r>
+      <w:proofErr w:type="spellEnd"/>
+      <w:r>
+        <w:t>…)</w:t>
+      </w:r>
+    </w:p>
+    <w:p/>
+    <w:p/>
+    <w:p>
+      <w:pPr>
+        <w:rPr>
+          <w:b/>
+          <w:bCs/>
+        </w:rPr>
+      </w:pPr>
+    </w:p>
+    <w:p>
+      <w:pPr>
+        <w:rPr>
+          <w:b/>
+          <w:bCs/>
+        </w:rPr>
+      </w:pPr>
+    </w:p>
+    <w:p>
+      <w:pPr>
+        <w:rPr>
+          <w:b/>
+          <w:bCs/>
+        </w:rPr>
+      </w:pPr>
+    </w:p>
+    <w:p>
+      <w:pPr>
+        <w:rPr>
+          <w:b/>
+          <w:bCs/>
+        </w:rPr>
+      </w:pPr>
+    </w:p>
+    <w:p>
+      <w:pPr>
+        <w:rPr>
+          <w:b/>
+          <w:bCs/>
+        </w:rPr>
+      </w:pPr>
+      <w:r>
+        <w:rPr>
+          <w:b/>
+          <w:bCs/>
+        </w:rPr>
+        <w:lastRenderedPageBreak/>
+        <w:t>Schema ER</w:t>
+      </w:r>
+    </w:p>
+    <w:p/>
+    <w:p/>
+    <w:p>
+      <w:r>
+        <w:rPr>
+          <w:noProof/>
+        </w:rPr>
+        <w:drawing>
+          <wp:inline distT="0" distB="0" distL="0" distR="0" wp14:anchorId="403055C8" wp14:editId="59CEAE9C">
+            <wp:extent cx="6120130" cy="5962015"/>
+            <wp:effectExtent l="0" t="0" r="0" b="635"/>
+            <wp:docPr id="209727934" name="Elemento grafico 1"/>
+            <wp:cNvGraphicFramePr>
+              <a:graphicFrameLocks xmlns:a="http://schemas.openxmlformats.org/drawingml/2006/main" noChangeAspect="1"/>
+            </wp:cNvGraphicFramePr>
+            <a:graphic xmlns:a="http://schemas.openxmlformats.org/drawingml/2006/main">
+              <a:graphicData uri="http://schemas.openxmlformats.org/drawingml/2006/picture">
+                <pic:pic xmlns:pic="http://schemas.openxmlformats.org/drawingml/2006/picture">
+                  <pic:nvPicPr>
+                    <pic:cNvPr id="209727934" name="Elemento grafico 209727934"/>
+                    <pic:cNvPicPr/>
+                  </pic:nvPicPr>
+                  <pic:blipFill>
+                    <a:blip r:embed="rId10">
+                      <a:extLst>
+                        <a:ext uri="{96DAC541-7B7A-43D3-8B79-37D633B846F1}">
+                          <asvg:svgBlip xmlns:asvg="http://schemas.microsoft.com/office/drawing/2016/SVG/main" r:embed="rId11"/>
+                        </a:ext>
+                      </a:extLst>
+                    </a:blip>
+                    <a:stretch>
+                      <a:fillRect/>
+                    </a:stretch>
+                  </pic:blipFill>
+                  <pic:spPr>
+                    <a:xfrm>
+                      <a:off x="0" y="0"/>
+                      <a:ext cx="6120130" cy="5962015"/>
+                    </a:xfrm>
+                    <a:prstGeom prst="rect">
+                      <a:avLst/>
+                    </a:prstGeom>
+                  </pic:spPr>
+                </pic:pic>
+              </a:graphicData>
+            </a:graphic>
+          </wp:inline>
+        </w:drawing>
+      </w:r>
+    </w:p>
+    <w:p/>
+    <w:p/>
+    <w:p/>
+    <w:p/>
+    <w:p/>
+    <w:p/>
+    <w:p/>
+    <w:p>
+      <w:pPr>
+        <w:pStyle w:val="Titolo2"/>
+      </w:pPr>
+      <w:r>
+        <w:lastRenderedPageBreak/>
+        <w:t xml:space="preserve">3.5 </w:t>
+      </w:r>
+      <w:r>
+        <w:t>Access control and security</w:t>
+      </w:r>
+    </w:p>
+    <w:p/>
+    <w:p>
+      <w:r>
+        <w:t>La strategia di sicurezza del sistema E.W.M.S. è progettata per garantire la riservatezza e l'integrità dei dati attraverso un modello di controllo degli accessi basato sui ruoli (</w:t>
+      </w:r>
+      <w:proofErr w:type="spellStart"/>
+      <w:r>
+        <w:t>Role-Based</w:t>
+      </w:r>
+      <w:proofErr w:type="spellEnd"/>
+      <w:r>
+        <w:t xml:space="preserve"> Access Control).</w:t>
+      </w:r>
+      <w:r>
+        <w:t xml:space="preserve"> L’implementazione del controllo degli accessi verrà effettuata </w:t>
+      </w:r>
+      <w:r>
+        <w:t xml:space="preserve">a livello programmatico tramite l'utilizzo di </w:t>
+      </w:r>
+      <w:proofErr w:type="spellStart"/>
+      <w:r>
+        <w:rPr>
+          <w:b/>
+          <w:bCs/>
+        </w:rPr>
+        <w:t>Servlet</w:t>
+      </w:r>
+      <w:proofErr w:type="spellEnd"/>
+      <w:r>
+        <w:rPr>
+          <w:b/>
+          <w:bCs/>
+        </w:rPr>
+        <w:t xml:space="preserve"> Filters</w:t>
+      </w:r>
+      <w:r>
+        <w:t xml:space="preserve"> standard. Questi componenti intercettano ogni richiesta HTTP diretta al livello applicativo, verificando l'identità dell'utente e i suoi privilegi prima di consentire l'esecuzione di qualsiasi logica di business.</w:t>
+      </w:r>
+      <w:r>
+        <w:t xml:space="preserve"> V</w:t>
+      </w:r>
+      <w:r>
+        <w:t xml:space="preserve">iene definita di seguito </w:t>
+      </w:r>
+      <w:r>
+        <w:t xml:space="preserve">la </w:t>
+      </w:r>
+      <w:r>
+        <w:t>Matrice di Accesso</w:t>
+      </w:r>
+      <w:r>
+        <w:t xml:space="preserve"> che specifica quali operazioni </w:t>
+      </w:r>
+      <w:r>
+        <w:t>un attore</w:t>
+      </w:r>
+      <w:r>
+        <w:t xml:space="preserve"> </w:t>
+      </w:r>
+      <w:r>
+        <w:t>può effettuare su un oggetto</w:t>
+      </w:r>
+      <w:r>
+        <w:t>.</w:t>
+      </w:r>
+    </w:p>
+    <w:p>
+      <w:r>
+        <w:rPr>
+          <w:noProof/>
+        </w:rPr>
+        <mc:AlternateContent>
+          <mc:Choice Requires="wps">
+            <w:drawing>
+              <wp:anchor distT="0" distB="0" distL="114300" distR="114300" simplePos="0" relativeHeight="251659264" behindDoc="0" locked="0" layoutInCell="1" allowOverlap="1" wp14:anchorId="1C8516A0" wp14:editId="2484057C">
+                <wp:simplePos x="0" y="0"/>
+                <wp:positionH relativeFrom="margin">
+                  <wp:posOffset>-5715</wp:posOffset>
+                </wp:positionH>
+                <wp:positionV relativeFrom="paragraph">
+                  <wp:posOffset>295910</wp:posOffset>
+                </wp:positionV>
+                <wp:extent cx="1252538" cy="500063"/>
+                <wp:effectExtent l="0" t="0" r="24130" b="33655"/>
+                <wp:wrapNone/>
+                <wp:docPr id="154913990" name="Connettore diritto 1"/>
+                <wp:cNvGraphicFramePr/>
+                <a:graphic xmlns:a="http://schemas.openxmlformats.org/drawingml/2006/main">
+                  <a:graphicData uri="http://schemas.microsoft.com/office/word/2010/wordprocessingShape">
+                    <wps:wsp>
+                      <wps:cNvCnPr/>
+                      <wps:spPr>
+                        <a:xfrm>
+                          <a:off x="0" y="0"/>
+                          <a:ext cx="1252538" cy="500063"/>
+                        </a:xfrm>
+                        <a:prstGeom prst="line">
+                          <a:avLst/>
+                        </a:prstGeom>
+                      </wps:spPr>
+                      <wps:style>
+                        <a:lnRef idx="1">
+                          <a:schemeClr val="dk1"/>
+                        </a:lnRef>
+                        <a:fillRef idx="0">
+                          <a:schemeClr val="dk1"/>
+                        </a:fillRef>
+                        <a:effectRef idx="0">
+                          <a:schemeClr val="dk1"/>
+                        </a:effectRef>
+                        <a:fontRef idx="minor">
+                          <a:schemeClr val="tx1"/>
+                        </a:fontRef>
+                      </wps:style>
+                      <wps:bodyPr/>
+                    </wps:wsp>
+                  </a:graphicData>
+                </a:graphic>
+                <wp14:sizeRelH relativeFrom="margin">
+                  <wp14:pctWidth>0</wp14:pctWidth>
+                </wp14:sizeRelH>
+                <wp14:sizeRelV relativeFrom="margin">
+                  <wp14:pctHeight>0</wp14:pctHeight>
+                </wp14:sizeRelV>
+              </wp:anchor>
+            </w:drawing>
+          </mc:Choice>
+          <mc:Fallback>
+            <w:pict>
+              <v:line w14:anchorId="455A10FF" id="Connettore diritto 1" o:spid="_x0000_s1026" style="position:absolute;z-index:251659264;visibility:visible;mso-wrap-style:square;mso-width-percent:0;mso-height-percent:0;mso-wrap-distance-left:9pt;mso-wrap-distance-top:0;mso-wrap-distance-right:9pt;mso-wrap-distance-bottom:0;mso-position-horizontal:absolute;mso-position-horizontal-relative:margin;mso-position-vertical:absolute;mso-position-vertical-relative:text;mso-width-percent:0;mso-height-percent:0;mso-width-relative:margin;mso-height-relative:margin" from="-.45pt,23.3pt" to="98.2pt,62.7pt" o:gfxdata="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" strokecolor="black [3200]" strokeweight=".5pt">
+                <v:stroke joinstyle="miter"/>
+                <w10:wrap anchorx="margin"/>
+              </v:line>
+            </w:pict>
+          </mc:Fallback>
+        </mc:AlternateContent>
+      </w:r>
+    </w:p>
+    <w:tbl>
+      <w:tblPr>
+        <w:tblStyle w:val="Grigliatabella"/>
+        <w:tblW w:w="0" w:type="auto"/>
+        <w:tblLayout w:type="fixed"/>
+        <w:tblLook w:val="04A0" w:firstRow="1" w:lastRow="0" w:firstColumn="1" w:lastColumn="0" w:noHBand="0" w:noVBand="1"/>
+      </w:tblPr>
+      <w:tblGrid>
+        <w:gridCol w:w="1971"/>
+        <w:gridCol w:w="1993"/>
+        <w:gridCol w:w="2127"/>
+        <w:gridCol w:w="1842"/>
+        <w:gridCol w:w="1695"/>
+      </w:tblGrid>
+      <w:tr>
+        <w:trPr>
+          <w:trHeight w:val="783"/>
+        </w:trPr>
+        <w:tc>
+          <w:tcPr>
+            <w:tcW w:w="1971" w:type="dxa"/>
+            <w:vAlign w:val="center"/>
+          </w:tcPr>
+          <w:p>
+            <w:pPr>
+              <w:rPr>
+                <w:rFonts w:ascii="Cambria Math" w:eastAsiaTheme="minorEastAsia" w:hAnsi="Cambria Math" w:cs="Times New Roman"/>
+                <w:i/>
+                <w:iCs/>
+              </w:rPr>
+            </w:pPr>
+            <m:oMathPara>
+              <m:oMath>
+                <m:r>
+                  <w:rPr>
+                    <w:rFonts w:ascii="Cambria Math" w:hAnsi="Cambria Math" w:cs="Times New Roman"/>
+                    <w:szCs w:val="24"/>
+                  </w:rPr>
+                  <m:t>Attor</m:t>
+                </m:r>
+                <m:sSup>
+                  <m:sSupPr>
+                    <m:ctrlPr>
+                      <w:rPr>
+                        <w:rFonts w:ascii="Cambria Math" w:hAnsi="Cambria Math" w:cs="Times New Roman"/>
+                        <w:i/>
+                        <w:szCs w:val="24"/>
+                      </w:rPr>
+                    </m:ctrlPr>
+                  </m:sSupPr>
+                  <m:e>
+                    <m:r>
+                      <w:rPr>
+                        <w:rFonts w:ascii="Cambria Math" w:hAnsi="Cambria Math" w:cs="Times New Roman"/>
+                        <w:szCs w:val="24"/>
+                      </w:rPr>
+                      <m:t>e</m:t>
+                    </m:r>
+                  </m:e>
+                  <m:sup>
+                    <m:argPr>
+                      <m:argSz m:val="1"/>
+                    </m:argPr>
+                    <m:r>
+                      <w:rPr>
+                        <w:rFonts w:ascii="Cambria Math" w:hAnsi="Cambria Math" w:cs="Times New Roman"/>
+                        <w:szCs w:val="24"/>
+                      </w:rPr>
+                      <m:t xml:space="preserve">     </m:t>
+                    </m:r>
+                    <m:r>
+                      <m:rPr>
+                        <m:sty m:val="p"/>
+                      </m:rPr>
+                      <w:rPr>
+                        <w:rFonts w:ascii="Cambria Math" w:hAnsi="Cambria Math" w:cs="Times New Roman"/>
+                        <w:szCs w:val="24"/>
+                      </w:rPr>
+                      <m:t>Oggetto</m:t>
+                    </m:r>
+                  </m:sup>
+                </m:sSup>
+              </m:oMath>
+            </m:oMathPara>
+          </w:p>
+        </w:tc>
+        <w:tc>
+          <w:tcPr>
+            <w:tcW w:w="1993" w:type="dxa"/>
+            <w:vAlign w:val="center"/>
+          </w:tcPr>
+          <w:p>
+            <w:pPr>
+              <w:jc w:val="center"/>
+            </w:pPr>
+            <w:proofErr w:type="spellStart"/>
+            <w:r>
+              <w:t>CatalogoUtenti</w:t>
+            </w:r>
+            <w:proofErr w:type="spellEnd"/>
+          </w:p>
+        </w:tc>
+        <w:tc>
+          <w:tcPr>
+            <w:tcW w:w="2127" w:type="dxa"/>
+            <w:vAlign w:val="center"/>
+          </w:tcPr>
+          <w:p>
+            <w:pPr>
+              <w:jc w:val="center"/>
+            </w:pPr>
+            <w:proofErr w:type="spellStart"/>
+            <w:r>
+              <w:t>CatalogoNotifiche</w:t>
+            </w:r>
+            <w:proofErr w:type="spellEnd"/>
+          </w:p>
+        </w:tc>
+        <w:tc>
+          <w:tcPr>
+            <w:tcW w:w="1842" w:type="dxa"/>
+            <w:vAlign w:val="center"/>
+          </w:tcPr>
+          <w:p>
+            <w:pPr>
+              <w:jc w:val="center"/>
+            </w:pPr>
+            <w:proofErr w:type="spellStart"/>
+            <w:r>
+              <w:t>CatalogoTask</w:t>
+            </w:r>
+            <w:proofErr w:type="spellEnd"/>
+          </w:p>
+        </w:tc>
+        <w:tc>
+          <w:tcPr>
+            <w:tcW w:w="1695" w:type="dxa"/>
+            <w:vAlign w:val="center"/>
+          </w:tcPr>
+          <w:p>
+            <w:pPr>
+              <w:jc w:val="center"/>
+            </w:pPr>
+            <w:r>
+              <w:t>Allegato</w:t>
+            </w:r>
+          </w:p>
+        </w:tc>
+      </w:tr>
+      <w:tr>
+        <w:tc>
+          <w:tcPr>
+            <w:tcW w:w="1971" w:type="dxa"/>
+            <w:vAlign w:val="center"/>
+          </w:tcPr>
+          <w:p>
+            <w:r>
+              <w:t>Supervisore</w:t>
+            </w:r>
+          </w:p>
+          <w:p/>
+        </w:tc>
+        <w:tc>
+          <w:tcPr>
+            <w:tcW w:w="1993" w:type="dxa"/>
+          </w:tcPr>
+          <w:p>
+            <w:r>
+              <w:t>login</w:t>
+            </w:r>
+          </w:p>
+          <w:p>
+            <w:proofErr w:type="spellStart"/>
+            <w:r>
+              <w:t>change_pwd</w:t>
+            </w:r>
+            <w:proofErr w:type="spellEnd"/>
+          </w:p>
+        </w:tc>
+        <w:tc>
+          <w:tcPr>
+            <w:tcW w:w="2127" w:type="dxa"/>
+          </w:tcPr>
+          <w:p>
+            <w:proofErr w:type="spellStart"/>
+            <w:r>
+              <w:t>showNotification</w:t>
+            </w:r>
+            <w:proofErr w:type="spellEnd"/>
+            <w:r>
+              <w:br/>
+            </w:r>
+            <w:proofErr w:type="spellStart"/>
+            <w:r>
+              <w:t>sendWarning</w:t>
+            </w:r>
+            <w:proofErr w:type="spellEnd"/>
+          </w:p>
+          <w:p>
+            <w:proofErr w:type="spellStart"/>
+            <w:r>
+              <w:rPr>
+                <w:lang w:val="en-GB"/>
+              </w:rPr>
+              <w:t>holdTask</w:t>
+            </w:r>
+            <w:proofErr w:type="spellEnd"/>
+          </w:p>
+        </w:tc>
+        <w:tc>
+          <w:tcPr>
+            <w:tcW w:w="1842" w:type="dxa"/>
+            <w:vAlign w:val="center"/>
+          </w:tcPr>
+          <w:p>
+            <w:pPr>
+              <w:rPr>
+                <w:lang w:val="en-GB"/>
+              </w:rPr>
+            </w:pPr>
+            <w:proofErr w:type="spellStart"/>
+            <w:r>
+              <w:rPr>
+                <w:lang w:val="en-GB"/>
+              </w:rPr>
+              <w:t>createTask</w:t>
+            </w:r>
+            <w:proofErr w:type="spellEnd"/>
+          </w:p>
+          <w:p>
+            <w:pPr>
+              <w:rPr>
+                <w:lang w:val="en-GB"/>
+              </w:rPr>
+            </w:pPr>
+            <w:proofErr w:type="spellStart"/>
+            <w:r>
+              <w:rPr>
+                <w:lang w:val="en-GB"/>
+              </w:rPr>
+              <w:t>deleteTask</w:t>
+            </w:r>
+            <w:proofErr w:type="spellEnd"/>
+          </w:p>
+          <w:p>
+            <w:pPr>
+              <w:rPr>
+                <w:lang w:val="en-GB"/>
+              </w:rPr>
+            </w:pPr>
+            <w:proofErr w:type="spellStart"/>
+            <w:r>
+              <w:rPr>
+                <w:lang w:val="en-GB"/>
+              </w:rPr>
+              <w:t>showTasks</w:t>
+            </w:r>
+            <w:proofErr w:type="spellEnd"/>
+          </w:p>
+          <w:p>
+            <w:pPr>
+              <w:rPr>
+                <w:lang w:val="en-GB"/>
+              </w:rPr>
+            </w:pPr>
+            <w:proofErr w:type="spellStart"/>
+            <w:r>
+              <w:rPr>
+                <w:lang w:val="en-GB"/>
+              </w:rPr>
+              <w:t>fetchTask</w:t>
+            </w:r>
+            <w:proofErr w:type="spellEnd"/>
+          </w:p>
+          <w:p>
+            <w:pPr>
+              <w:rPr>
+                <w:lang w:val="en-GB"/>
+              </w:rPr>
+            </w:pPr>
+            <w:proofErr w:type="spellStart"/>
+            <w:r>
+              <w:rPr>
+                <w:lang w:val="en-GB"/>
+              </w:rPr>
+              <w:t>holdTask</w:t>
+            </w:r>
+            <w:proofErr w:type="spellEnd"/>
+          </w:p>
+        </w:tc>
+        <w:tc>
+          <w:tcPr>
+            <w:tcW w:w="1695" w:type="dxa"/>
+          </w:tcPr>
+          <w:p>
+            <w:r>
+              <w:t>upload</w:t>
+            </w:r>
+          </w:p>
+          <w:p>
+            <w:pPr>
+              <w:rPr>
+                <w:u w:val="single"/>
+              </w:rPr>
+            </w:pPr>
+            <w:r>
+              <w:t>download</w:t>
+            </w:r>
+          </w:p>
+        </w:tc>
+      </w:tr>
+      <w:tr>
+        <w:tc>
+          <w:tcPr>
+            <w:tcW w:w="1971" w:type="dxa"/>
+            <w:vAlign w:val="center"/>
+          </w:tcPr>
+          <w:p>
+            <w:r>
+              <w:t>Dipendente</w:t>
+            </w:r>
+          </w:p>
+        </w:tc>
+        <w:tc>
+          <w:tcPr>
+            <w:tcW w:w="1993" w:type="dxa"/>
+          </w:tcPr>
+          <w:p>
+            <w:r>
+              <w:t>L</w:t>
+            </w:r>
+            <w:r>
+              <w:t>ogin</w:t>
+            </w:r>
+          </w:p>
+          <w:p>
+            <w:proofErr w:type="spellStart"/>
+            <w:r>
+              <w:t>c</w:t>
+            </w:r>
+            <w:r>
+              <w:t>hange</w:t>
+            </w:r>
+            <w:r>
+              <w:t>_</w:t>
+            </w:r>
+            <w:r>
+              <w:t>pwd</w:t>
+            </w:r>
+            <w:proofErr w:type="spellEnd"/>
+          </w:p>
+        </w:tc>
+        <w:tc>
+          <w:tcPr>
+            <w:tcW w:w="2127" w:type="dxa"/>
+          </w:tcPr>
+          <w:p>
+            <w:proofErr w:type="spellStart"/>
+            <w:r>
+              <w:t>showNotification</w:t>
+            </w:r>
+            <w:proofErr w:type="spellEnd"/>
+          </w:p>
+          <w:p>
+            <w:proofErr w:type="spellStart"/>
+            <w:r>
+              <w:rPr>
+                <w:lang w:val="en-GB"/>
+              </w:rPr>
+              <w:t>holdTask</w:t>
+            </w:r>
+            <w:proofErr w:type="spellEnd"/>
+          </w:p>
+        </w:tc>
+        <w:tc>
+          <w:tcPr>
+            <w:tcW w:w="1842" w:type="dxa"/>
+            <w:vAlign w:val="center"/>
+          </w:tcPr>
+          <w:p>
+            <w:pPr>
+              <w:rPr>
+                <w:lang w:val="en-GB"/>
+              </w:rPr>
+            </w:pPr>
+            <w:proofErr w:type="spellStart"/>
+            <w:r>
+              <w:rPr>
+                <w:lang w:val="en-GB"/>
+              </w:rPr>
+              <w:t>showTasks</w:t>
+            </w:r>
+            <w:proofErr w:type="spellEnd"/>
+          </w:p>
+          <w:p>
+            <w:pPr>
+              <w:rPr>
+                <w:lang w:val="en-GB"/>
+              </w:rPr>
+            </w:pPr>
+            <w:proofErr w:type="spellStart"/>
+            <w:r>
+              <w:rPr>
+                <w:lang w:val="en-GB"/>
+              </w:rPr>
+              <w:t>fetchTask</w:t>
+            </w:r>
+            <w:proofErr w:type="spellEnd"/>
+          </w:p>
+          <w:p>
+            <w:pPr>
+              <w:rPr>
+                <w:lang w:val="en-GB"/>
+              </w:rPr>
+            </w:pPr>
+            <w:proofErr w:type="spellStart"/>
+            <w:r>
+              <w:rPr>
+                <w:lang w:val="en-GB"/>
+              </w:rPr>
+              <w:t>inizializzaTask</w:t>
+            </w:r>
+            <w:proofErr w:type="spellEnd"/>
+          </w:p>
+          <w:p>
+            <w:pPr>
+              <w:rPr>
+                <w:lang w:val="en-GB"/>
+              </w:rPr>
+            </w:pPr>
+            <w:proofErr w:type="spellStart"/>
+            <w:r>
+              <w:rPr>
+                <w:lang w:val="en-GB"/>
+              </w:rPr>
+              <w:t>completeTask</w:t>
+            </w:r>
+            <w:proofErr w:type="spellEnd"/>
+          </w:p>
+          <w:p>
+            <w:pPr>
+              <w:rPr>
+                <w:lang w:val="en-GB"/>
+              </w:rPr>
+            </w:pPr>
+            <w:proofErr w:type="spellStart"/>
+            <w:r>
+              <w:rPr>
+                <w:lang w:val="en-GB"/>
+              </w:rPr>
+              <w:t>h</w:t>
+            </w:r>
+            <w:r>
+              <w:rPr>
+                <w:lang w:val="en-GB"/>
+              </w:rPr>
+              <w:t>oldTask</w:t>
+            </w:r>
+            <w:proofErr w:type="spellEnd"/>
+          </w:p>
+        </w:tc>
+        <w:tc>
+          <w:tcPr>
+            <w:tcW w:w="1695" w:type="dxa"/>
+          </w:tcPr>
+          <w:p>
+            <w:pPr>
+              <w:rPr>
+                <w:lang w:val="en-GB"/>
+              </w:rPr>
+            </w:pPr>
+            <w:r>
+              <w:rPr>
+                <w:lang w:val="en-GB"/>
+              </w:rPr>
+              <w:t>download</w:t>
+            </w:r>
+          </w:p>
+        </w:tc>
+      </w:tr>
+      <w:tr>
+        <w:tc>
+          <w:tcPr>
+            <w:tcW w:w="1971" w:type="dxa"/>
+            <w:vAlign w:val="center"/>
+          </w:tcPr>
+          <w:p>
+            <w:r>
+              <w:t>Gestore degli account</w:t>
+            </w:r>
+          </w:p>
+        </w:tc>
+        <w:tc>
+          <w:tcPr>
+            <w:tcW w:w="1993" w:type="dxa"/>
+          </w:tcPr>
+          <w:p>
+            <w:pPr>
+              <w:rPr>
+                <w:lang w:val="en-GB"/>
+              </w:rPr>
+            </w:pPr>
+            <w:r>
+              <w:rPr>
+                <w:lang w:val="en-GB"/>
+              </w:rPr>
+              <w:t>L</w:t>
+            </w:r>
+            <w:r>
+              <w:rPr>
+                <w:lang w:val="en-GB"/>
+              </w:rPr>
+              <w:t>ogin</w:t>
+            </w:r>
+          </w:p>
+          <w:p>
+            <w:pPr>
+              <w:rPr>
+                <w:lang w:val="en-GB"/>
+              </w:rPr>
+            </w:pPr>
+            <w:proofErr w:type="spellStart"/>
+            <w:r>
+              <w:rPr>
+                <w:lang w:val="en-GB"/>
+              </w:rPr>
+              <w:t>c</w:t>
+            </w:r>
+            <w:r>
+              <w:rPr>
+                <w:lang w:val="en-GB"/>
+              </w:rPr>
+              <w:t>hange</w:t>
+            </w:r>
+            <w:r>
+              <w:rPr>
+                <w:lang w:val="en-GB"/>
+              </w:rPr>
+              <w:t>_</w:t>
+            </w:r>
+            <w:r>
+              <w:rPr>
+                <w:lang w:val="en-GB"/>
+              </w:rPr>
+              <w:t>pwd</w:t>
+            </w:r>
+            <w:proofErr w:type="spellEnd"/>
+          </w:p>
+          <w:p>
+            <w:pPr>
+              <w:rPr>
+                <w:lang w:val="en-GB"/>
+              </w:rPr>
+            </w:pPr>
+            <w:proofErr w:type="spellStart"/>
+            <w:r>
+              <w:rPr>
+                <w:lang w:val="en-GB"/>
+              </w:rPr>
+              <w:t>addAccount</w:t>
+            </w:r>
+            <w:proofErr w:type="spellEnd"/>
+          </w:p>
+          <w:p>
+            <w:pPr>
+              <w:rPr>
+                <w:lang w:val="en-GB"/>
+              </w:rPr>
+            </w:pPr>
+            <w:proofErr w:type="spellStart"/>
+            <w:r>
+              <w:rPr>
+                <w:lang w:val="en-GB"/>
+              </w:rPr>
+              <w:t>showAccount</w:t>
+            </w:r>
+            <w:proofErr w:type="spellEnd"/>
+          </w:p>
+          <w:p>
+            <w:pPr>
+              <w:rPr>
+                <w:lang w:val="en-GB"/>
+              </w:rPr>
+            </w:pPr>
+            <w:proofErr w:type="spellStart"/>
+            <w:r>
+              <w:rPr>
+                <w:lang w:val="en-GB"/>
+              </w:rPr>
+              <w:t>generateNewPwd</w:t>
+            </w:r>
+            <w:proofErr w:type="spellEnd"/>
+          </w:p>
+          <w:p>
+            <w:proofErr w:type="spellStart"/>
+            <w:r>
+              <w:t>modifyRole</w:t>
+            </w:r>
+            <w:proofErr w:type="spellEnd"/>
+          </w:p>
+          <w:p>
+            <w:proofErr w:type="spellStart"/>
+            <w:r>
+              <w:t>modifySupervisor</w:t>
+            </w:r>
+            <w:proofErr w:type="spellEnd"/>
+          </w:p>
+          <w:p>
+            <w:proofErr w:type="spellStart"/>
+            <w:r>
+              <w:t>deleteAccount</w:t>
+            </w:r>
+            <w:proofErr w:type="spellEnd"/>
+          </w:p>
+        </w:tc>
+        <w:tc>
+          <w:tcPr>
+            <w:tcW w:w="2127" w:type="dxa"/>
+          </w:tcPr>
+          <w:p/>
+        </w:tc>
+        <w:tc>
+          <w:tcPr>
+            <w:tcW w:w="1842" w:type="dxa"/>
+            <w:vAlign w:val="center"/>
+          </w:tcPr>
+          <w:p/>
+        </w:tc>
+        <w:tc>
+          <w:tcPr>
+            <w:tcW w:w="1695" w:type="dxa"/>
+          </w:tcPr>
+          <w:p/>
+        </w:tc>
+      </w:tr>
+    </w:tbl>
     <w:p/>
     <w:p/>
     <w:p/>
@@ -838,113 +2139,548 @@
     <w:p/>
     <w:p/>
     <w:p/>
+    <w:p>
+      <w:pPr>
+        <w:pStyle w:val="Titolo2"/>
+      </w:pPr>
+      <w:r>
+        <w:lastRenderedPageBreak/>
+        <w:t xml:space="preserve">3.6 </w:t>
+      </w:r>
+      <w:r>
+        <w:t>Global software control</w:t>
+      </w:r>
+    </w:p>
+    <w:p>
+      <w:r>
+        <w:t>Il controllo del flusso software nel sistema E.W.M.S. segue il modello Event-</w:t>
+      </w:r>
+      <w:proofErr w:type="spellStart"/>
+      <w:r>
+        <w:t>Driven</w:t>
+      </w:r>
+      <w:proofErr w:type="spellEnd"/>
+      <w:r>
+        <w:t>, tipico delle applicazioni web interattive.</w:t>
+      </w:r>
+      <w:r>
+        <w:t xml:space="preserve"> L</w:t>
+      </w:r>
+      <w:r>
+        <w:t>'esecuzione è innescata dalle azioni degli utenti (richieste HTTP) e gestita dal Web Container (Apache Tomcat).</w:t>
+      </w:r>
+    </w:p>
+    <w:p/>
+    <w:p>
+      <w:pPr>
+        <w:pStyle w:val="Titolo3"/>
+        <w:ind w:left="-284" w:firstLine="708"/>
+      </w:pPr>
+      <w:r>
+        <w:t>3.6.1 Flusso delle richieste</w:t>
+      </w:r>
+    </w:p>
+    <w:p>
+      <w:r>
+        <w:tab/>
+        <w:t xml:space="preserve">Il flusso di controllo principale è del tipo sincrono </w:t>
+      </w:r>
+      <w:proofErr w:type="spellStart"/>
+      <w:r>
+        <w:t>Request-Response</w:t>
+      </w:r>
+      <w:proofErr w:type="spellEnd"/>
+      <w:r>
+        <w:t>:</w:t>
+      </w:r>
+    </w:p>
+    <w:p>
+      <w:pPr>
+        <w:pStyle w:val="Paragrafoelenco"/>
+        <w:numPr>
+          <w:ilvl w:val="0"/>
+          <w:numId w:val="3"/>
+        </w:numPr>
+      </w:pPr>
+      <w:r>
+        <w:t>L’evento scatenante è una richiesta http (GET o POST) originata dal browser lato client che interagisce con la pagina;</w:t>
+      </w:r>
+    </w:p>
+    <w:p>
+      <w:pPr>
+        <w:pStyle w:val="Paragrafoelenco"/>
+        <w:numPr>
+          <w:ilvl w:val="0"/>
+          <w:numId w:val="3"/>
+        </w:numPr>
+      </w:pPr>
+      <w:r>
+        <w:t xml:space="preserve">Il web-container intercetterà la richiesta, istanzierà un nuovo </w:t>
+      </w:r>
+      <w:proofErr w:type="spellStart"/>
+      <w:r>
+        <w:t>thread</w:t>
+      </w:r>
+      <w:proofErr w:type="spellEnd"/>
+      <w:r>
+        <w:t xml:space="preserve"> dedicato e lo indirizza alla </w:t>
+      </w:r>
+      <w:proofErr w:type="spellStart"/>
+      <w:r>
+        <w:t>servlet</w:t>
+      </w:r>
+      <w:proofErr w:type="spellEnd"/>
+      <w:r>
+        <w:t xml:space="preserve"> specificata</w:t>
+      </w:r>
+    </w:p>
+    <w:p>
+      <w:pPr>
+        <w:pStyle w:val="Paragrafoelenco"/>
+        <w:numPr>
+          <w:ilvl w:val="0"/>
+          <w:numId w:val="3"/>
+        </w:numPr>
+      </w:pPr>
+      <w:r>
+        <w:t xml:space="preserve">La </w:t>
+      </w:r>
+      <w:proofErr w:type="spellStart"/>
+      <w:r>
+        <w:t>servlet</w:t>
+      </w:r>
+      <w:proofErr w:type="spellEnd"/>
+      <w:r>
+        <w:t xml:space="preserve"> esegue la logica di business</w:t>
+      </w:r>
+    </w:p>
+    <w:p>
+      <w:pPr>
+        <w:pStyle w:val="Paragrafoelenco"/>
+        <w:numPr>
+          <w:ilvl w:val="0"/>
+          <w:numId w:val="3"/>
+        </w:numPr>
+      </w:pPr>
+      <w:r>
+        <w:t>Al termine il controllo passa a una pagina JSP che genere l’HTML di risposta inviato al client.</w:t>
+      </w:r>
+    </w:p>
+    <w:p>
+      <w:pPr>
+        <w:pStyle w:val="Titolo3"/>
+        <w:ind w:left="-284" w:firstLine="708"/>
+      </w:pPr>
+      <w:bookmarkStart w:id="0" w:name="_Hlk214907318"/>
+      <w:r>
+        <w:t>3.6</w:t>
+      </w:r>
+      <w:r>
+        <w:t>.2</w:t>
+      </w:r>
+      <w:r>
+        <w:t xml:space="preserve"> </w:t>
+      </w:r>
+      <w:r>
+        <w:t>Concorrenza</w:t>
+      </w:r>
+      <w:bookmarkEnd w:id="0"/>
+      <w:r>
+        <w:br/>
+      </w:r>
+    </w:p>
+    <w:p>
+      <w:pPr>
+        <w:ind w:left="708"/>
+      </w:pPr>
+      <w:r>
+        <w:t xml:space="preserve">Essendo EWMS un applicativo web, la concorrenza sarà gestista dal Web-container. </w:t>
+      </w:r>
+      <w:r>
+        <w:t>Tomcat mant</w:t>
+      </w:r>
+      <w:r>
+        <w:t>iene</w:t>
+      </w:r>
+      <w:r>
+        <w:t xml:space="preserve"> un </w:t>
+      </w:r>
+      <w:proofErr w:type="spellStart"/>
+      <w:r>
+        <w:t>Thread</w:t>
+      </w:r>
+      <w:proofErr w:type="spellEnd"/>
+      <w:r>
+        <w:t xml:space="preserve"> Pool; ogni richiesta HTTP </w:t>
+      </w:r>
+      <w:r>
+        <w:t xml:space="preserve">verrà quindi </w:t>
+      </w:r>
+      <w:r>
+        <w:t xml:space="preserve">eseguita in un </w:t>
+      </w:r>
+      <w:proofErr w:type="spellStart"/>
+      <w:r>
+        <w:t>thread</w:t>
+      </w:r>
+      <w:proofErr w:type="spellEnd"/>
+      <w:r>
+        <w:t xml:space="preserve"> separato.</w:t>
+      </w:r>
+    </w:p>
+    <w:p>
+      <w:pPr>
+        <w:ind w:left="708"/>
+      </w:pPr>
+      <w:r>
+        <w:t xml:space="preserve">Le </w:t>
+      </w:r>
+      <w:proofErr w:type="spellStart"/>
+      <w:r>
+        <w:t>servlet</w:t>
+      </w:r>
+      <w:proofErr w:type="spellEnd"/>
+      <w:r>
+        <w:t xml:space="preserve">, inoltre, sono oggetti di tipo </w:t>
+      </w:r>
+      <w:proofErr w:type="spellStart"/>
+      <w:r>
+        <w:t>stateless</w:t>
+      </w:r>
+      <w:proofErr w:type="spellEnd"/>
+      <w:r>
+        <w:t>, non conservano uno stato e n</w:t>
+      </w:r>
+      <w:r>
+        <w:t xml:space="preserve">on utilizzano variabili di istanza mutabili per conservare dati specifici dell'utente, prevenendo </w:t>
+      </w:r>
+      <w:r>
+        <w:rPr>
+          <w:b/>
+          <w:bCs/>
+        </w:rPr>
+        <w:t xml:space="preserve">race </w:t>
+      </w:r>
+      <w:proofErr w:type="spellStart"/>
+      <w:r>
+        <w:rPr>
+          <w:b/>
+          <w:bCs/>
+        </w:rPr>
+        <w:t>condition</w:t>
+      </w:r>
+      <w:proofErr w:type="spellEnd"/>
+      <w:r>
+        <w:t xml:space="preserve"> </w:t>
+      </w:r>
+      <w:r>
+        <w:t>quando più t</w:t>
+      </w:r>
+      <w:proofErr w:type="spellStart"/>
+      <w:r>
+        <w:t>hread</w:t>
+      </w:r>
+      <w:proofErr w:type="spellEnd"/>
+      <w:r>
+        <w:t xml:space="preserve"> accedono alla stessa </w:t>
+      </w:r>
+      <w:proofErr w:type="spellStart"/>
+      <w:r>
+        <w:t>Servlet</w:t>
+      </w:r>
+      <w:proofErr w:type="spellEnd"/>
+      <w:r>
+        <w:t xml:space="preserve"> contemporaneamente.</w:t>
+      </w:r>
+    </w:p>
+    <w:p>
+      <w:pPr>
+        <w:ind w:left="708"/>
+      </w:pPr>
+      <w:r>
+        <w:t xml:space="preserve">Lo stato dell’utente verrà gestito grazie all’utilizzo di un oggetto </w:t>
+      </w:r>
+      <w:proofErr w:type="spellStart"/>
+      <w:r>
+        <w:t>HttpSession</w:t>
+      </w:r>
+      <w:proofErr w:type="spellEnd"/>
+      <w:r>
+        <w:t xml:space="preserve"> unico per ogni utente </w:t>
+      </w:r>
+      <w:r>
+        <w:t xml:space="preserve">garantendo </w:t>
+      </w:r>
+      <w:r>
+        <w:t xml:space="preserve">così </w:t>
+      </w:r>
+      <w:r>
+        <w:t>l'isolamento dei dati.</w:t>
+      </w:r>
+    </w:p>
+    <w:p>
+      <w:r>
+        <w:tab/>
+      </w:r>
+    </w:p>
+    <w:p>
+      <w:pPr>
+        <w:pStyle w:val="Titolo3"/>
+        <w:ind w:left="426"/>
+      </w:pPr>
+      <w:r>
+        <w:t>3.6.</w:t>
+      </w:r>
+      <w:r>
+        <w:t>3</w:t>
+      </w:r>
+      <w:r>
+        <w:t xml:space="preserve"> </w:t>
+      </w:r>
+      <w:r>
+        <w:t>Sincronizzazione e integrità dei dati</w:t>
+      </w:r>
+    </w:p>
+    <w:p>
+      <w:pPr>
+        <w:ind w:left="708"/>
+      </w:pPr>
+      <w:r>
+        <w:t xml:space="preserve">La sincronizzazione tra i sottosistemi e l'accesso concorrente al database </w:t>
+      </w:r>
+      <w:proofErr w:type="gramStart"/>
+      <w:r>
+        <w:t>sono gestiti</w:t>
+      </w:r>
+      <w:proofErr w:type="gramEnd"/>
+      <w:r>
+        <w:t xml:space="preserve"> attraverso:</w:t>
+      </w:r>
+    </w:p>
+    <w:p>
+      <w:pPr>
+        <w:numPr>
+          <w:ilvl w:val="0"/>
+          <w:numId w:val="4"/>
+        </w:numPr>
+      </w:pPr>
+      <w:r>
+        <w:rPr>
+          <w:b/>
+          <w:bCs/>
+        </w:rPr>
+        <w:t>Transazioni Database (ACID):</w:t>
+      </w:r>
+      <w:r>
+        <w:t xml:space="preserve"> Per operazioni critiche che coinvolgono più scritture, la consistenza è delegata al DBMS tramite transazioni. In caso di errore in uno dei passaggi, l'intera operazione viene annullata (</w:t>
+      </w:r>
+      <w:proofErr w:type="spellStart"/>
+      <w:r>
+        <w:t>Rollback</w:t>
+      </w:r>
+      <w:proofErr w:type="spellEnd"/>
+      <w:r>
+        <w:t>).</w:t>
+      </w:r>
+    </w:p>
+    <w:p>
+      <w:pPr>
+        <w:numPr>
+          <w:ilvl w:val="0"/>
+          <w:numId w:val="4"/>
+        </w:numPr>
+      </w:pPr>
+      <w:r>
+        <w:rPr>
+          <w:b/>
+          <w:bCs/>
+        </w:rPr>
+        <w:t>Connection Pooling:</w:t>
+      </w:r>
+      <w:r>
+        <w:t xml:space="preserve"> L'accesso al database è sincronizzato tramite un </w:t>
+      </w:r>
+      <w:proofErr w:type="spellStart"/>
+      <w:r>
+        <w:t>DataSource</w:t>
+      </w:r>
+      <w:proofErr w:type="spellEnd"/>
+      <w:r>
+        <w:t xml:space="preserve"> (Connection Pool). Questo componente gestisce una coda di connessioni disponibili, mettendo in attesa i </w:t>
+      </w:r>
+      <w:proofErr w:type="spellStart"/>
+      <w:r>
+        <w:t>thread</w:t>
+      </w:r>
+      <w:proofErr w:type="spellEnd"/>
+      <w:r>
+        <w:t xml:space="preserve"> se tutte le connessioni sono occupate, prevenendo il sovraccarico del database.</w:t>
+      </w:r>
+    </w:p>
+    <w:p>
+      <w:pPr>
+        <w:numPr>
+          <w:ilvl w:val="0"/>
+          <w:numId w:val="4"/>
+        </w:numPr>
+      </w:pPr>
+      <w:r>
+        <w:rPr>
+          <w:b/>
+          <w:bCs/>
+        </w:rPr>
+        <w:t>Chiamate tra Sottosistemi:</w:t>
+      </w:r>
+      <w:r>
+        <w:t xml:space="preserve"> La comunicazione tra i moduli logici avviene tramite invocazione sincrona di metodi Java.</w:t>
+      </w:r>
+    </w:p>
+    <w:p/>
+    <w:p>
+      <w:r>
+        <w:tab/>
+      </w:r>
+    </w:p>
     <w:p/>
     <w:p/>
     <w:p/>
     <w:p/>
     <w:p/>
     <w:p/>
+    <w:p>
+      <w:r>
+        <w:t>I sottosistemi individuati sono:</w:t>
+      </w:r>
+    </w:p>
+    <w:p>
+      <w:proofErr w:type="spellStart"/>
+      <w:r>
+        <w:t>EWMSClient</w:t>
+      </w:r>
+      <w:proofErr w:type="spellEnd"/>
+      <w:r>
+        <w:t>: per gestire l’interazione con l’utente</w:t>
+      </w:r>
+      <w:r>
+        <w:t xml:space="preserve"> e </w:t>
+      </w:r>
+      <w:r>
+        <w:t>la gestione delle operazioni lato client</w:t>
+      </w:r>
+    </w:p>
+    <w:p>
+      <w:proofErr w:type="spellStart"/>
+      <w:r>
+        <w:t>EWMSServer</w:t>
+      </w:r>
+      <w:proofErr w:type="spellEnd"/>
+      <w:r>
+        <w:t xml:space="preserve">: responsabile per il controllo di accesso e concorrenza, delega agli altri </w:t>
+      </w:r>
+      <w:proofErr w:type="spellStart"/>
+      <w:r>
+        <w:t>subsystem</w:t>
+      </w:r>
+      <w:proofErr w:type="spellEnd"/>
+      <w:r>
+        <w:t xml:space="preserve"> la logica applicativa. </w:t>
+      </w:r>
+    </w:p>
+    <w:p>
+      <w:proofErr w:type="spellStart"/>
+      <w:r>
+        <w:t>Access</w:t>
+      </w:r>
+      <w:r>
+        <w:t>Management</w:t>
+      </w:r>
+      <w:proofErr w:type="spellEnd"/>
+      <w:r>
+        <w:t>: per gestire le operazioni di login e logout del sistema</w:t>
+      </w:r>
+      <w:r>
+        <w:t>.</w:t>
+      </w:r>
+    </w:p>
+    <w:p>
+      <w:proofErr w:type="spellStart"/>
+      <w:r>
+        <w:t>Account</w:t>
+      </w:r>
+      <w:r>
+        <w:t>M</w:t>
+      </w:r>
+      <w:r>
+        <w:t>anagemen</w:t>
+      </w:r>
+      <w:r>
+        <w:t>t</w:t>
+      </w:r>
+      <w:proofErr w:type="spellEnd"/>
+      <w:r>
+        <w:t xml:space="preserve">: </w:t>
+      </w:r>
+      <w:r>
+        <w:t>operazioni di gestione del gestore degli account</w:t>
+      </w:r>
+      <w:r>
+        <w:t>, e di modifica profilo personale</w:t>
+      </w:r>
+      <w:r>
+        <w:t>.</w:t>
+      </w:r>
+    </w:p>
+    <w:p>
+      <w:proofErr w:type="spellStart"/>
+      <w:r>
+        <w:t>TaskManagement</w:t>
+      </w:r>
+      <w:proofErr w:type="spellEnd"/>
+      <w:r>
+        <w:t>: Gestisce tutti i Servizi le</w:t>
+      </w:r>
+      <w:r>
+        <w:t xml:space="preserve">gati al ciclo di vita </w:t>
+      </w:r>
+      <w:proofErr w:type="gramStart"/>
+      <w:r>
+        <w:t>delle task</w:t>
+      </w:r>
+      <w:proofErr w:type="gramEnd"/>
+    </w:p>
     <w:p/>
-    <w:p/>
-    <w:p/>
-    <w:p/>
-    <w:p/>
-    <w:p/>
-    <w:p/>
-    <w:p/>
-    <w:p/>
-    <w:p/>
-    <w:p/>
-    <w:p>
-      <w:r>
-        <w:t>I sottosistemi individuati sono:</w:t>
-      </w:r>
-    </w:p>
-    <w:p>
-      <w:r>
-        <w:t>EWMSClient</w:t>
-      </w:r>
-      <w:r>
-        <w:t>: per gestire l’interazione con l’utente</w:t>
-      </w:r>
-      <w:r>
-        <w:t xml:space="preserve"> e </w:t>
-      </w:r>
-      <w:r>
-        <w:t>la gestione delle operazioni lato client</w:t>
-      </w:r>
-    </w:p>
-    <w:p>
-      <w:r>
-        <w:t xml:space="preserve">EWMSServer: responsabile per il controllo di accesso e concorrenza, delega agli altri subsystem la logica applicativa. </w:t>
-      </w:r>
-    </w:p>
-    <w:p>
-      <w:r>
-        <w:t>Access</w:t>
+    <w:p>
+      <w:proofErr w:type="spellStart"/>
+      <w:r>
+        <w:t>NotificheManagement</w:t>
+      </w:r>
+      <w:proofErr w:type="spellEnd"/>
+      <w:r>
+        <w:t>: serve a gestire i servizi di notifica</w:t>
+      </w:r>
+      <w:r>
+        <w:t>.</w:t>
+      </w:r>
+    </w:p>
+    <w:p>
+      <w:proofErr w:type="spellStart"/>
+      <w:r>
+        <w:t>Persistence</w:t>
       </w:r>
       <w:r>
         <w:t>Management</w:t>
       </w:r>
-      <w:r>
-        <w:t>: per gestire le operazioni di login e logout del sistema</w:t>
-      </w:r>
-      <w:r>
-        <w:t>.</w:t>
-      </w:r>
-    </w:p>
-    <w:p>
-      <w:r>
-        <w:t>Account</w:t>
-      </w:r>
-      <w:r>
-        <w:t>M</w:t>
-      </w:r>
-      <w:r>
-        <w:t>anagemen</w:t>
-      </w:r>
-      <w:r>
-        <w:t>t</w:t>
-      </w:r>
-      <w:r>
-        <w:t xml:space="preserve">: </w:t>
-      </w:r>
-      <w:r>
-        <w:t>operazioni di gestione del gestore degli account</w:t>
-      </w:r>
-      <w:r>
-        <w:t>, e di modifica profilo personale</w:t>
-      </w:r>
-      <w:r>
-        <w:t>.</w:t>
-      </w:r>
-    </w:p>
-    <w:p>
-      <w:r>
-        <w:t>TaskManagement: Gestisce tutti i Servizi le</w:t>
-      </w:r>
-      <w:r>
-        <w:t>gati al ciclo di vita delle task</w:t>
-      </w:r>
-    </w:p>
-    <w:p/>
-    <w:p>
-      <w:r>
-        <w:t>NotificheManagement: serve a gestire i servizi di notifica</w:t>
-      </w:r>
-      <w:r>
-        <w:t>.</w:t>
-      </w:r>
-    </w:p>
-    <w:p>
-      <w:r>
-        <w:t>Persistence</w:t>
-      </w:r>
-      <w:r>
-        <w:t>Management</w:t>
-      </w:r>
-      <w:r>
-        <w:t>: Servizi di persistenza delle entity class</w:t>
+      <w:proofErr w:type="spellEnd"/>
+      <w:r>
+        <w:t xml:space="preserve">: Servizi di persistenza delle </w:t>
+      </w:r>
+      <w:proofErr w:type="spellStart"/>
+      <w:r>
+        <w:t>entity</w:t>
+      </w:r>
+      <w:proofErr w:type="spellEnd"/>
+      <w:r>
+        <w:t xml:space="preserve"> class</w:t>
       </w:r>
       <w:r>
         <w:t>, controlla la logica di accesso ai dati.</w:t>
@@ -1013,6 +2749,155 @@
 <file path=word/numbering.xml><?xml version="1.0" encoding="utf-8"?>
 <w:numbering xmlns:wpc="http://schemas.microsoft.com/office/word/2010/wordprocessingCanvas" xmlns:cx="http://schemas.microsoft.com/office/drawing/2014/chartex" xmlns:cx1="http://schemas.microsoft.com/office/drawing/2015/9/8/chartex" xmlns:cx2="http://schemas.microsoft.com/office/drawing/2015/10/21/chartex" xmlns:cx3="http://schemas.microsoft.com/office/drawing/2016/5/9/chartex" xmlns:cx4="http://schemas.microsoft.com/office/drawing/2016/5/10/chartex" xmlns:cx5="http://schemas.microsoft.com/office/drawing/2016/5/11/chartex" xmlns:cx6="http://schemas.microsoft.com/office/drawing/2016/5/12/chartex" xmlns:cx7="http://schemas.microsoft.com/office/drawing/2016/5/13/chartex" xmlns:cx8="http://schemas.microsoft.com/office/drawing/2016/5/14/chartex" xmlns:mc="http://schemas.openxmlformats.org/markup-compatibility/2006" xmlns:aink="http://schemas.microsoft.com/office/drawing/2016/ink" xmlns:am3d="http://schemas.microsoft.com/office/drawing/2017/model3d" xmlns:o="urn:schemas-microsoft-com:office:office" xmlns:oel="http://schemas.microsoft.com/office/2019/extlst" xmlns:r="http://schemas.openxmlformats.org/officeDocument/2006/relationships" xmlns:m="http://schemas.openxmlformats.org/officeDocument/2006/math" xmlns:v="urn:schemas-microsoft-com:vml" xmlns:wp14="http://schemas.microsoft.com/office/word/2010/wordprocessingDrawing" xmlns:wp="http://schemas.openxmlformats.org/drawingml/2006/wordprocessingDrawing" xmlns:w10="urn:schemas-microsoft-com:office:word" xmlns:w="http://schemas.openxmlformats.org/wordprocessingml/2006/main" xmlns:w14="http://schemas.microsoft.com/office/word/2010/wordml" xmlns:w15="http://schemas.microsoft.com/office/word/2012/wordml" xmlns:w16cex="http://schemas.microsoft.com/office/word/2018/wordml/cex" xmlns:w16cid="http://schemas.microsoft.com/office/word/2016/wordml/cid" xmlns:w16="http://schemas.microsoft.com/office/word/2018/wordml" xmlns:w16du="http://schemas.microsoft.com/office/word/2023/wordml/word16du" xmlns:w16sdtdh="http://schemas.microsoft.com/office/word/2020/wordml/sdtdatahash" xmlns:w16sdtfl="http://schemas.microsoft.com/office/word/2024/wordml/sdtformatlock" xmlns:w16se="http://schemas.microsoft.com/office/word/2015/wordml/symex" xmlns:wpg="http://schemas.microsoft.com/office/word/2010/wordprocessingGroup" xmlns:wpi="http://schemas.microsoft.com/office/word/2010/wordprocessingInk" xmlns:wne="http://schemas.microsoft.com/office/word/2006/wordml" xmlns:wps="http://schemas.microsoft.com/office/word/2010/wordprocessingShape" mc:Ignorable="w14 w15 w16se w16cid w16 w16cex w16sdtdh w16sdtfl w16du wp14">
   <w:abstractNum w:abstractNumId="0" w15:restartNumberingAfterBreak="0">
+    <w:nsid w:val="04042CEE"/>
+    <w:multiLevelType w:val="multilevel"/>
+    <w:tmpl w:val="A9F8F9AA"/>
+    <w:lvl w:ilvl="0">
+      <w:start w:val="1"/>
+      <w:numFmt w:val="bullet"/>
+      <w:lvlText w:val=""/>
+      <w:lvlJc w:val="left"/>
+      <w:pPr>
+        <w:tabs>
+          <w:tab w:val="num" w:pos="720"/>
+        </w:tabs>
+        <w:ind w:left="720" w:hanging="360"/>
+      </w:pPr>
+      <w:rPr>
+        <w:rFonts w:ascii="Symbol" w:hAnsi="Symbol" w:hint="default"/>
+        <w:sz w:val="20"/>
+      </w:rPr>
+    </w:lvl>
+    <w:lvl w:ilvl="1" w:tentative="1">
+      <w:start w:val="1"/>
+      <w:numFmt w:val="bullet"/>
+      <w:lvlText w:val="o"/>
+      <w:lvlJc w:val="left"/>
+      <w:pPr>
+        <w:tabs>
+          <w:tab w:val="num" w:pos="1440"/>
+        </w:tabs>
+        <w:ind w:left="1440" w:hanging="360"/>
+      </w:pPr>
+      <w:rPr>
+        <w:rFonts w:ascii="Courier New" w:hAnsi="Courier New" w:hint="default"/>
+        <w:sz w:val="20"/>
+      </w:rPr>
+    </w:lvl>
+    <w:lvl w:ilvl="2" w:tentative="1">
+      <w:start w:val="1"/>
+      <w:numFmt w:val="bullet"/>
+      <w:lvlText w:val=""/>
+      <w:lvlJc w:val="left"/>
+      <w:pPr>
+        <w:tabs>
+          <w:tab w:val="num" w:pos="2160"/>
+        </w:tabs>
+        <w:ind w:left="2160" w:hanging="360"/>
+      </w:pPr>
+      <w:rPr>
+        <w:rFonts w:ascii="Wingdings" w:hAnsi="Wingdings" w:hint="default"/>
+        <w:sz w:val="20"/>
+      </w:rPr>
+    </w:lvl>
+    <w:lvl w:ilvl="3" w:tentative="1">
+      <w:start w:val="1"/>
+      <w:numFmt w:val="bullet"/>
+      <w:lvlText w:val=""/>
+      <w:lvlJc w:val="left"/>
+      <w:pPr>
+        <w:tabs>
+          <w:tab w:val="num" w:pos="2880"/>
+        </w:tabs>
+        <w:ind w:left="2880" w:hanging="360"/>
+      </w:pPr>
+      <w:rPr>
+        <w:rFonts w:ascii="Wingdings" w:hAnsi="Wingdings" w:hint="default"/>
+        <w:sz w:val="20"/>
+      </w:rPr>
+    </w:lvl>
+    <w:lvl w:ilvl="4" w:tentative="1">
+      <w:start w:val="1"/>
+      <w:numFmt w:val="bullet"/>
+      <w:lvlText w:val=""/>
+      <w:lvlJc w:val="left"/>
+      <w:pPr>
+        <w:tabs>
+          <w:tab w:val="num" w:pos="3600"/>
+        </w:tabs>
+        <w:ind w:left="3600" w:hanging="360"/>
+      </w:pPr>
+      <w:rPr>
+        <w:rFonts w:ascii="Wingdings" w:hAnsi="Wingdings" w:hint="default"/>
+        <w:sz w:val="20"/>
+      </w:rPr>
+    </w:lvl>
+    <w:lvl w:ilvl="5" w:tentative="1">
+      <w:start w:val="1"/>
+      <w:numFmt w:val="bullet"/>
+      <w:lvlText w:val=""/>
+      <w:lvlJc w:val="left"/>
+      <w:pPr>
+        <w:tabs>
+          <w:tab w:val="num" w:pos="4320"/>
+        </w:tabs>
+        <w:ind w:left="4320" w:hanging="360"/>
+      </w:pPr>
+      <w:rPr>
+        <w:rFonts w:ascii="Wingdings" w:hAnsi="Wingdings" w:hint="default"/>
+        <w:sz w:val="20"/>
+      </w:rPr>
+    </w:lvl>
+    <w:lvl w:ilvl="6" w:tentative="1">
+      <w:start w:val="1"/>
+      <w:numFmt w:val="bullet"/>
+      <w:lvlText w:val=""/>
+      <w:lvlJc w:val="left"/>
+      <w:pPr>
+        <w:tabs>
+          <w:tab w:val="num" w:pos="5040"/>
+        </w:tabs>
+        <w:ind w:left="5040" w:hanging="360"/>
+      </w:pPr>
+      <w:rPr>
+        <w:rFonts w:ascii="Wingdings" w:hAnsi="Wingdings" w:hint="default"/>
+        <w:sz w:val="20"/>
+      </w:rPr>
+    </w:lvl>
+    <w:lvl w:ilvl="7" w:tentative="1">
+      <w:start w:val="1"/>
+      <w:numFmt w:val="bullet"/>
+      <w:lvlText w:val=""/>
+      <w:lvlJc w:val="left"/>
+      <w:pPr>
+        <w:tabs>
+          <w:tab w:val="num" w:pos="5760"/>
+        </w:tabs>
+        <w:ind w:left="5760" w:hanging="360"/>
+      </w:pPr>
+      <w:rPr>
+        <w:rFonts w:ascii="Wingdings" w:hAnsi="Wingdings" w:hint="default"/>
+        <w:sz w:val="20"/>
+      </w:rPr>
+    </w:lvl>
+    <w:lvl w:ilvl="8" w:tentative="1">
+      <w:start w:val="1"/>
+      <w:numFmt w:val="bullet"/>
+      <w:lvlText w:val=""/>
+      <w:lvlJc w:val="left"/>
+      <w:pPr>
+        <w:tabs>
+          <w:tab w:val="num" w:pos="6480"/>
+        </w:tabs>
+        <w:ind w:left="6480" w:hanging="360"/>
+      </w:pPr>
+      <w:rPr>
+        <w:rFonts w:ascii="Wingdings" w:hAnsi="Wingdings" w:hint="default"/>
+        <w:sz w:val="20"/>
+      </w:rPr>
+    </w:lvl>
+  </w:abstractNum>
+  <w:abstractNum w:abstractNumId="1" w15:restartNumberingAfterBreak="0">
     <w:nsid w:val="4E3D350D"/>
     <w:multiLevelType w:val="hybridMultilevel"/>
     <w:tmpl w:val="C1403E7E"/>
@@ -1098,7 +2983,96 @@
       </w:pPr>
     </w:lvl>
   </w:abstractNum>
-  <w:abstractNum w:abstractNumId="1" w15:restartNumberingAfterBreak="0">
+  <w:abstractNum w:abstractNumId="2" w15:restartNumberingAfterBreak="0">
+    <w:nsid w:val="799D4F2B"/>
+    <w:multiLevelType w:val="hybridMultilevel"/>
+    <w:tmpl w:val="0672907A"/>
+    <w:lvl w:ilvl="0" w:tplc="0410000F">
+      <w:start w:val="1"/>
+      <w:numFmt w:val="decimal"/>
+      <w:lvlText w:val="%1."/>
+      <w:lvlJc w:val="left"/>
+      <w:pPr>
+        <w:ind w:left="720" w:hanging="360"/>
+      </w:pPr>
+      <w:rPr>
+        <w:rFonts w:hint="default"/>
+      </w:rPr>
+    </w:lvl>
+    <w:lvl w:ilvl="1" w:tplc="04100019" w:tentative="1">
+      <w:start w:val="1"/>
+      <w:numFmt w:val="lowerLetter"/>
+      <w:lvlText w:val="%2."/>
+      <w:lvlJc w:val="left"/>
+      <w:pPr>
+        <w:ind w:left="1440" w:hanging="360"/>
+      </w:pPr>
+    </w:lvl>
+    <w:lvl w:ilvl="2" w:tplc="0410001B" w:tentative="1">
+      <w:start w:val="1"/>
+      <w:numFmt w:val="lowerRoman"/>
+      <w:lvlText w:val="%3."/>
+      <w:lvlJc w:val="right"/>
+      <w:pPr>
+        <w:ind w:left="2160" w:hanging="180"/>
+      </w:pPr>
+    </w:lvl>
+    <w:lvl w:ilvl="3" w:tplc="0410000F" w:tentative="1">
+      <w:start w:val="1"/>
+      <w:numFmt w:val="decimal"/>
+      <w:lvlText w:val="%4."/>
+      <w:lvlJc w:val="left"/>
+      <w:pPr>
+        <w:ind w:left="2880" w:hanging="360"/>
+      </w:pPr>
+    </w:lvl>
+    <w:lvl w:ilvl="4" w:tplc="04100019" w:tentative="1">
+      <w:start w:val="1"/>
+      <w:numFmt w:val="lowerLetter"/>
+      <w:lvlText w:val="%5."/>
+      <w:lvlJc w:val="left"/>
+      <w:pPr>
+        <w:ind w:left="3600" w:hanging="360"/>
+      </w:pPr>
+    </w:lvl>
+    <w:lvl w:ilvl="5" w:tplc="0410001B" w:tentative="1">
+      <w:start w:val="1"/>
+      <w:numFmt w:val="lowerRoman"/>
+      <w:lvlText w:val="%6."/>
+      <w:lvlJc w:val="right"/>
+      <w:pPr>
+        <w:ind w:left="4320" w:hanging="180"/>
+      </w:pPr>
+    </w:lvl>
+    <w:lvl w:ilvl="6" w:tplc="0410000F" w:tentative="1">
+      <w:start w:val="1"/>
+      <w:numFmt w:val="decimal"/>
+      <w:lvlText w:val="%7."/>
+      <w:lvlJc w:val="left"/>
+      <w:pPr>
+        <w:ind w:left="5040" w:hanging="360"/>
+      </w:pPr>
+    </w:lvl>
+    <w:lvl w:ilvl="7" w:tplc="04100019" w:tentative="1">
+      <w:start w:val="1"/>
+      <w:numFmt w:val="lowerLetter"/>
+      <w:lvlText w:val="%8."/>
+      <w:lvlJc w:val="left"/>
+      <w:pPr>
+        <w:ind w:left="5760" w:hanging="360"/>
+      </w:pPr>
+    </w:lvl>
+    <w:lvl w:ilvl="8" w:tplc="0410001B" w:tentative="1">
+      <w:start w:val="1"/>
+      <w:numFmt w:val="lowerRoman"/>
+      <w:lvlText w:val="%9."/>
+      <w:lvlJc w:val="right"/>
+      <w:pPr>
+        <w:ind w:left="6480" w:hanging="180"/>
+      </w:pPr>
+    </w:lvl>
+  </w:abstractNum>
+  <w:abstractNum w:abstractNumId="3" w15:restartNumberingAfterBreak="0">
     <w:nsid w:val="7E752170"/>
     <w:multiLevelType w:val="hybridMultilevel"/>
     <w:tmpl w:val="88C0D706"/>
@@ -1114,7 +3088,7 @@
         <w:rFonts w:ascii="Times New Roman" w:eastAsiaTheme="minorHAnsi" w:hAnsi="Times New Roman" w:cs="Times New Roman" w:hint="default"/>
       </w:rPr>
     </w:lvl>
-    <w:lvl w:ilvl="1" w:tplc="04100003" w:tentative="1">
+    <w:lvl w:ilvl="1" w:tplc="04100003">
       <w:start w:val="1"/>
       <w:numFmt w:val="bullet"/>
       <w:lvlText w:val="o"/>
@@ -1212,10 +3186,16 @@
     </w:lvl>
   </w:abstractNum>
   <w:num w:numId="1" w16cid:durableId="873422198">
-    <w:abstractNumId w:val="0"/>
+    <w:abstractNumId w:val="1"/>
   </w:num>
   <w:num w:numId="2" w16cid:durableId="1843158215">
-    <w:abstractNumId w:val="1"/>
+    <w:abstractNumId w:val="3"/>
+  </w:num>
+  <w:num w:numId="3" w16cid:durableId="225266068">
+    <w:abstractNumId w:val="2"/>
+  </w:num>
+  <w:num w:numId="4" w16cid:durableId="1255675544">
+    <w:abstractNumId w:val="0"/>
   </w:num>
 </w:numbering>
 </file>
@@ -2156,6 +4136,61 @@
       </w:tblBorders>
     </w:tblPr>
   </w:style>
+  <w:style w:type="paragraph" w:styleId="NormaleWeb">
+    <w:name w:val="Normal (Web)"/>
+    <w:basedOn w:val="Normale"/>
+    <w:uiPriority w:val="99"/>
+    <w:unhideWhenUsed/>
+    <w:rsid w:val="00E948ED"/>
+    <w:pPr>
+      <w:spacing w:before="100" w:beforeAutospacing="1" w:after="100" w:afterAutospacing="1" w:line="240" w:lineRule="auto"/>
+    </w:pPr>
+    <w:rPr>
+      <w:rFonts w:eastAsia="Times New Roman" w:cs="Times New Roman"/>
+      <w:kern w:val="0"/>
+      <w:szCs w:val="24"/>
+      <w:lang w:eastAsia="it-IT"/>
+      <w14:ligatures w14:val="none"/>
+    </w:rPr>
+  </w:style>
+  <w:style w:type="character" w:customStyle="1" w:styleId="citation-76">
+    <w:name w:val="citation-76"/>
+    <w:basedOn w:val="Carpredefinitoparagrafo"/>
+    <w:rsid w:val="00E948ED"/>
+  </w:style>
+  <w:style w:type="character" w:styleId="Collegamentoipertestuale">
+    <w:name w:val="Hyperlink"/>
+    <w:basedOn w:val="Carpredefinitoparagrafo"/>
+    <w:uiPriority w:val="99"/>
+    <w:unhideWhenUsed/>
+    <w:rsid w:val="00E948ED"/>
+    <w:rPr>
+      <w:color w:val="467886" w:themeColor="hyperlink"/>
+      <w:u w:val="single"/>
+    </w:rPr>
+  </w:style>
+  <w:style w:type="character" w:styleId="Menzionenonrisolta">
+    <w:name w:val="Unresolved Mention"/>
+    <w:basedOn w:val="Carpredefinitoparagrafo"/>
+    <w:uiPriority w:val="99"/>
+    <w:semiHidden/>
+    <w:unhideWhenUsed/>
+    <w:rsid w:val="00E948ED"/>
+    <w:rPr>
+      <w:color w:val="605E5C"/>
+      <w:shd w:val="clear" w:color="auto" w:fill="E1DFDD"/>
+    </w:rPr>
+  </w:style>
+  <w:style w:type="character" w:styleId="Testosegnaposto">
+    <w:name w:val="Placeholder Text"/>
+    <w:basedOn w:val="Carpredefinitoparagrafo"/>
+    <w:uiPriority w:val="99"/>
+    <w:semiHidden/>
+    <w:rsid w:val="00256978"/>
+    <w:rPr>
+      <w:color w:val="666666"/>
+    </w:rPr>
+  </w:style>
 </w:styles>
 </file>
 

</xml_diff>

<commit_message>
Mod: modificato SDD_EWMS - completato l'assemblaggio Add: aggiunto SDD_EWMS alla cartella deliverables
</commit_message>
<xml_diff>
--- a/Workspace/SDD/PuntiSingoli/3.2 - Subsystem decomposition.docx
+++ b/Workspace/SDD/PuntiSingoli/3.2 - Subsystem decomposition.docx
@@ -2,15 +2,6 @@
 <file path=word/document.xml><?xml version="1.0" encoding="utf-8"?>
 <w:document xmlns:wpc="http://schemas.microsoft.com/office/word/2010/wordprocessingCanvas" xmlns:cx="http://schemas.microsoft.com/office/drawing/2014/chartex" xmlns:cx1="http://schemas.microsoft.com/office/drawing/2015/9/8/chartex" xmlns:cx2="http://schemas.microsoft.com/office/drawing/2015/10/21/chartex" xmlns:cx3="http://schemas.microsoft.com/office/drawing/2016/5/9/chartex" xmlns:cx4="http://schemas.microsoft.com/office/drawing/2016/5/10/chartex" xmlns:cx5="http://schemas.microsoft.com/office/drawing/2016/5/11/chartex" xmlns:cx6="http://schemas.microsoft.com/office/drawing/2016/5/12/chartex" xmlns:cx7="http://schemas.microsoft.com/office/drawing/2016/5/13/chartex" xmlns:cx8="http://schemas.microsoft.com/office/drawing/2016/5/14/chartex" xmlns:mc="http://schemas.openxmlformats.org/markup-compatibility/2006" xmlns:aink="http://schemas.microsoft.com/office/drawing/2016/ink" xmlns:am3d="http://schemas.microsoft.com/office/drawing/2017/model3d" xmlns:o="urn:schemas-microsoft-com:office:office" xmlns:oel="http://schemas.microsoft.com/office/2019/extlst" xmlns:r="http://schemas.openxmlformats.org/officeDocument/2006/relationships" xmlns:m="http://schemas.openxmlformats.org/officeDocument/2006/math" xmlns:v="urn:schemas-microsoft-com:vml" xmlns:wp14="http://schemas.microsoft.com/office/word/2010/wordprocessingDrawing" xmlns:wp="http://schemas.openxmlformats.org/drawingml/2006/wordprocessingDrawing" xmlns:w10="urn:schemas-microsoft-com:office:word" xmlns:w="http://schemas.openxmlformats.org/wordprocessingml/2006/main" xmlns:w14="http://schemas.microsoft.com/office/word/2010/wordml" xmlns:w15="http://schemas.microsoft.com/office/word/2012/wordml" xmlns:w16cex="http://schemas.microsoft.com/office/word/2018/wordml/cex" xmlns:w16cid="http://schemas.microsoft.com/office/word/2016/wordml/cid" xmlns:w16="http://schemas.microsoft.com/office/word/2018/wordml" xmlns:w16du="http://schemas.microsoft.com/office/word/2023/wordml/word16du" xmlns:w16sdtdh="http://schemas.microsoft.com/office/word/2020/wordml/sdtdatahash" xmlns:w16sdtfl="http://schemas.microsoft.com/office/word/2024/wordml/sdtformatlock" xmlns:w16se="http://schemas.microsoft.com/office/word/2015/wordml/symex" xmlns:wpg="http://schemas.microsoft.com/office/word/2010/wordprocessingGroup" xmlns:wpi="http://schemas.microsoft.com/office/word/2010/wordprocessingInk" xmlns:wne="http://schemas.microsoft.com/office/word/2006/wordml" xmlns:wps="http://schemas.microsoft.com/office/word/2010/wordprocessingShape" mc:Ignorable="w14 w15 w16se w16cid w16 w16cex w16sdtdh w16sdtfl w16du wp14">
   <w:body>
-    <w:p>
-      <w:pPr>
-        <w:pStyle w:val="Titolo1"/>
-        <w:ind w:left="-426"/>
-      </w:pPr>
-      <w:r>
-        <w:t>3. Architettura del software proposto</w:t>
-      </w:r>
-    </w:p>
     <w:p>
       <w:pPr>
         <w:pStyle w:val="Titolo2"/>
@@ -293,7 +284,6 @@
                 <w:b/>
                 <w:bCs/>
               </w:rPr>
-              <w:lastRenderedPageBreak/>
               <w:t>Nome</w:t>
             </w:r>
           </w:p>
@@ -329,6 +319,7 @@
           <w:p>
             <w:proofErr w:type="spellStart"/>
             <w:r>
+              <w:lastRenderedPageBreak/>
               <w:t>EWMSClient</w:t>
             </w:r>
             <w:proofErr w:type="spellEnd"/>
@@ -727,7 +718,6 @@
           <w:b/>
           <w:bCs/>
         </w:rPr>
-        <w:lastRenderedPageBreak/>
         <w:t>Componenti off-the-</w:t>
       </w:r>
       <w:proofErr w:type="spellStart"/>
@@ -1283,7 +1273,6 @@
           <w:b/>
           <w:bCs/>
         </w:rPr>
-        <w:lastRenderedPageBreak/>
         <w:t>Schema ER</w:t>
       </w:r>
     </w:p>
@@ -1410,10 +1399,7 @@
         <w:t xml:space="preserve"> che specifica quali operazioni </w:t>
       </w:r>
       <w:r>
-        <w:t>un attore</w:t>
-      </w:r>
-      <w:r>
-        <w:t xml:space="preserve"> </w:t>
+        <w:t xml:space="preserve">un attore </w:t>
       </w:r>
       <w:r>
         <w:t>può effettuare su un oggetto</w:t>
@@ -2000,13 +1986,7 @@
               <w:rPr>
                 <w:lang w:val="en-GB"/>
               </w:rPr>
-              <w:t>L</w:t>
-            </w:r>
-            <w:r>
-              <w:rPr>
-                <w:lang w:val="en-GB"/>
-              </w:rPr>
-              <w:t>ogin</w:t>
+              <w:t>Login</w:t>
             </w:r>
           </w:p>
           <w:p>
@@ -2020,25 +2000,7 @@
               <w:rPr>
                 <w:lang w:val="en-GB"/>
               </w:rPr>
-              <w:t>c</w:t>
-            </w:r>
-            <w:r>
-              <w:rPr>
-                <w:lang w:val="en-GB"/>
-              </w:rPr>
-              <w:t>hange</w:t>
-            </w:r>
-            <w:r>
-              <w:rPr>
-                <w:lang w:val="en-GB"/>
-              </w:rPr>
-              <w:t>_</w:t>
-            </w:r>
-            <w:r>
-              <w:rPr>
-                <w:lang w:val="en-GB"/>
-              </w:rPr>
-              <w:t>pwd</w:t>
+              <w:t>change_pwd</w:t>
             </w:r>
             <w:proofErr w:type="spellEnd"/>
           </w:p>
@@ -2273,16 +2235,7 @@
       </w:pPr>
       <w:bookmarkStart w:id="0" w:name="_Hlk214907318"/>
       <w:r>
-        <w:t>3.6</w:t>
-      </w:r>
-      <w:r>
-        <w:t>.2</w:t>
-      </w:r>
-      <w:r>
-        <w:t xml:space="preserve"> </w:t>
-      </w:r>
-      <w:r>
-        <w:t>Concorrenza</w:t>
+        <w:t>3.6.2 Concorrenza</w:t>
       </w:r>
       <w:bookmarkEnd w:id="0"/>
       <w:r>
@@ -2374,11 +2327,11 @@
         <w:t xml:space="preserve"> </w:t>
       </w:r>
       <w:r>
-        <w:t>quando più t</w:t>
+        <w:t xml:space="preserve">quando più </w:t>
       </w:r>
       <w:proofErr w:type="spellStart"/>
       <w:r>
-        <w:t>hread</w:t>
+        <w:t>thread</w:t>
       </w:r>
       <w:proofErr w:type="spellEnd"/>
       <w:r>
@@ -2429,16 +2382,7 @@
         <w:ind w:left="426"/>
       </w:pPr>
       <w:r>
-        <w:t>3.6.</w:t>
-      </w:r>
-      <w:r>
-        <w:t>3</w:t>
-      </w:r>
-      <w:r>
-        <w:t xml:space="preserve"> </w:t>
-      </w:r>
-      <w:r>
-        <w:t>Sincronizzazione e integrità dei dati</w:t>
+        <w:t>3.6.3 Sincronizzazione e integrità dei dati</w:t>
       </w:r>
     </w:p>
     <w:p>
@@ -2541,201 +2485,1858 @@
         <w:tab/>
       </w:r>
     </w:p>
+    <w:p>
+      <w:pPr>
+        <w:pStyle w:val="Titolo2"/>
+      </w:pPr>
+      <w:bookmarkStart w:id="1" w:name="_Hlk214989697"/>
+      <w:bookmarkStart w:id="2" w:name="copia"/>
+      <w:bookmarkEnd w:id="2"/>
+      <w:r>
+        <w:lastRenderedPageBreak/>
+        <w:t xml:space="preserve">3.7 </w:t>
+      </w:r>
+      <w:proofErr w:type="spellStart"/>
+      <w:r>
+        <w:t>Boundary</w:t>
+      </w:r>
+      <w:proofErr w:type="spellEnd"/>
+      <w:r>
+        <w:t xml:space="preserve"> </w:t>
+      </w:r>
+      <w:proofErr w:type="spellStart"/>
+      <w:r>
+        <w:t>conditions</w:t>
+      </w:r>
+      <w:proofErr w:type="spellEnd"/>
+    </w:p>
+    <w:p/>
+    <w:p>
+      <w:r>
+        <w:t xml:space="preserve">In questa sezione viene descritto il comportamento </w:t>
+      </w:r>
+      <w:r>
+        <w:t>del sistema E.W.M.S. durante le fasi di avvio, arresto e in presenza di errori critici</w:t>
+      </w:r>
+      <w:r>
+        <w:t xml:space="preserve">. </w:t>
+      </w:r>
+      <w:r>
+        <w:t xml:space="preserve">L'obiettivo è garantire l'integrità dei dati e fornire </w:t>
+      </w:r>
+      <w:proofErr w:type="gramStart"/>
+      <w:r>
+        <w:t>feedback</w:t>
+      </w:r>
+      <w:proofErr w:type="gramEnd"/>
+      <w:r>
+        <w:t xml:space="preserve"> adeguati agli utenti</w:t>
+      </w:r>
+      <w:r>
+        <w:t xml:space="preserve"> e ai programmatori che interverranno in caso di malfunzionamenti</w:t>
+      </w:r>
+      <w:r>
+        <w:t>.</w:t>
+      </w:r>
+    </w:p>
+    <w:p>
+      <w:pPr>
+        <w:pStyle w:val="Titolo3"/>
+      </w:pPr>
+      <w:r>
+        <w:t xml:space="preserve">3.7.1 Inizializzazione </w:t>
+      </w:r>
+    </w:p>
+    <w:p>
+      <w:r>
+        <w:t xml:space="preserve">L'avvio del sistema coincide con il </w:t>
+      </w:r>
+      <w:proofErr w:type="spellStart"/>
+      <w:r>
+        <w:t>deploy</w:t>
+      </w:r>
+      <w:proofErr w:type="spellEnd"/>
+      <w:r>
+        <w:t xml:space="preserve"> </w:t>
+      </w:r>
+      <w:r>
+        <w:t>del file</w:t>
+      </w:r>
+      <w:r>
+        <w:t xml:space="preserve"> </w:t>
+      </w:r>
+      <w:proofErr w:type="spellStart"/>
+      <w:r>
+        <w:t>EWMS.war</w:t>
+      </w:r>
+      <w:proofErr w:type="spellEnd"/>
+      <w:r>
+        <w:t xml:space="preserve"> all'interno del Web Container (Apache Tomcat) o con il riavvio del servizio Tomcat stesso. Durante la fase di inizializzazione, il sistema esegue le seguenti operazioni sequenziali:</w:t>
+      </w:r>
+    </w:p>
+    <w:p>
+      <w:pPr>
+        <w:numPr>
+          <w:ilvl w:val="0"/>
+          <w:numId w:val="5"/>
+        </w:numPr>
+      </w:pPr>
+      <w:r>
+        <w:rPr>
+          <w:b/>
+          <w:bCs/>
+        </w:rPr>
+        <w:t>Caricamento Configurazione:</w:t>
+      </w:r>
+      <w:r>
+        <w:t xml:space="preserve"> Il sistema legge i parametri di configurazione dal file web.xml </w:t>
+      </w:r>
+      <w:r>
+        <w:t>e</w:t>
+      </w:r>
+      <w:r>
+        <w:t xml:space="preserve"> dalle variabili d'ambiente del server.</w:t>
+      </w:r>
+    </w:p>
+    <w:p>
+      <w:pPr>
+        <w:numPr>
+          <w:ilvl w:val="0"/>
+          <w:numId w:val="5"/>
+        </w:numPr>
+      </w:pPr>
+      <w:r>
+        <w:rPr>
+          <w:b/>
+          <w:bCs/>
+        </w:rPr>
+        <w:t>Inizializzazione Connection Pool:</w:t>
+      </w:r>
+      <w:r>
+        <w:t xml:space="preserve"> Viene istanziato il </w:t>
+      </w:r>
+      <w:proofErr w:type="spellStart"/>
+      <w:r>
+        <w:t>DataSource</w:t>
+      </w:r>
+      <w:proofErr w:type="spellEnd"/>
+      <w:r>
+        <w:t xml:space="preserve"> per la connessione al database MySQL. </w:t>
+      </w:r>
+    </w:p>
+    <w:p>
+      <w:pPr>
+        <w:numPr>
+          <w:ilvl w:val="1"/>
+          <w:numId w:val="5"/>
+        </w:numPr>
+      </w:pPr>
+      <w:r>
+        <w:rPr>
+          <w:i/>
+          <w:iCs/>
+        </w:rPr>
+        <w:t>Eccezione:</w:t>
+      </w:r>
+      <w:r>
+        <w:t xml:space="preserve"> Se il database non è raggiungibile, l'applicazione non completa l'avvio e logga un errore critico (FATAL), impedendo l'accesso agli utenti.</w:t>
+      </w:r>
+    </w:p>
+    <w:p>
+      <w:pPr>
+        <w:numPr>
+          <w:ilvl w:val="0"/>
+          <w:numId w:val="5"/>
+        </w:numPr>
+      </w:pPr>
+      <w:r>
+        <w:rPr>
+          <w:b/>
+          <w:bCs/>
+        </w:rPr>
+        <w:t>Verifica File System:</w:t>
+      </w:r>
+      <w:r>
+        <w:t xml:space="preserve"> Il sistema controlla l'esistenza e i permessi di scrittura della directory dedicata agli allegati (definita nella sezione 3.4). Se la cartella non esiste, il sistema tenta di crearla.</w:t>
+      </w:r>
+    </w:p>
+    <w:p>
+      <w:pPr>
+        <w:numPr>
+          <w:ilvl w:val="0"/>
+          <w:numId w:val="5"/>
+        </w:numPr>
+      </w:pPr>
+      <w:r>
+        <w:rPr>
+          <w:b/>
+          <w:bCs/>
+        </w:rPr>
+        <w:t>Ready State:</w:t>
+      </w:r>
+      <w:r>
+        <w:t xml:space="preserve"> Una volta completati questi passaggi, l'applicazione inizia ad accettare le richieste HTTP in ingresso.</w:t>
+      </w:r>
+    </w:p>
+    <w:p>
+      <w:pPr>
+        <w:ind w:left="360"/>
+      </w:pPr>
+    </w:p>
+    <w:p>
+      <w:pPr>
+        <w:pStyle w:val="Titolo3"/>
+      </w:pPr>
+      <w:r>
+        <w:t xml:space="preserve">3.7.2 Terminazione </w:t>
+      </w:r>
+    </w:p>
+    <w:p>
+      <w:r>
+        <w:t>La terminazione del sistema coincide all’arresto o l’</w:t>
+      </w:r>
+      <w:proofErr w:type="spellStart"/>
+      <w:r>
+        <w:t>undeploy</w:t>
+      </w:r>
+      <w:proofErr w:type="spellEnd"/>
+      <w:r>
+        <w:t>, tramite il servizio Tomcat</w:t>
+      </w:r>
+      <w:r>
+        <w:t>. Il sistema garantisce:</w:t>
+      </w:r>
+    </w:p>
+    <w:p>
+      <w:pPr>
+        <w:numPr>
+          <w:ilvl w:val="0"/>
+          <w:numId w:val="6"/>
+        </w:numPr>
+      </w:pPr>
+      <w:r>
+        <w:rPr>
+          <w:b/>
+          <w:bCs/>
+        </w:rPr>
+        <w:t>Chiusura Sessioni:</w:t>
+      </w:r>
+      <w:r>
+        <w:t xml:space="preserve"> Le sessioni utente attive vengono invalidate. I dati di sessione non persistenti vengono persi, mentre lo stato dei task su database rimane consistente.</w:t>
+      </w:r>
+    </w:p>
+    <w:p>
+      <w:pPr>
+        <w:numPr>
+          <w:ilvl w:val="0"/>
+          <w:numId w:val="6"/>
+        </w:numPr>
+      </w:pPr>
+      <w:r>
+        <w:rPr>
+          <w:b/>
+          <w:bCs/>
+        </w:rPr>
+        <w:t>Rilascio Risorse Database:</w:t>
+      </w:r>
+      <w:r>
+        <w:t xml:space="preserve"> Il Connection Pool viene chiuso forzatamente. Tutte le connessioni JDBC attive vengono terminate e i driver database deregistrati per evitare </w:t>
+      </w:r>
+      <w:proofErr w:type="spellStart"/>
+      <w:r>
+        <w:rPr>
+          <w:i/>
+          <w:iCs/>
+        </w:rPr>
+        <w:t>memory</w:t>
+      </w:r>
+      <w:proofErr w:type="spellEnd"/>
+      <w:r>
+        <w:rPr>
+          <w:i/>
+          <w:iCs/>
+        </w:rPr>
+        <w:t xml:space="preserve"> leaks</w:t>
+      </w:r>
+      <w:r>
+        <w:t xml:space="preserve"> nel server.</w:t>
+      </w:r>
+    </w:p>
+    <w:p>
+      <w:pPr>
+        <w:numPr>
+          <w:ilvl w:val="0"/>
+          <w:numId w:val="6"/>
+        </w:numPr>
+      </w:pPr>
+      <w:r>
+        <w:rPr>
+          <w:b/>
+          <w:bCs/>
+        </w:rPr>
+        <w:t xml:space="preserve">Completamento </w:t>
+      </w:r>
+      <w:proofErr w:type="spellStart"/>
+      <w:r>
+        <w:rPr>
+          <w:b/>
+          <w:bCs/>
+        </w:rPr>
+        <w:t>Thread</w:t>
+      </w:r>
+      <w:proofErr w:type="spellEnd"/>
+      <w:r>
+        <w:rPr>
+          <w:b/>
+          <w:bCs/>
+        </w:rPr>
+        <w:t>:</w:t>
+      </w:r>
+      <w:r>
+        <w:t xml:space="preserve"> Se vi sono operazioni di upload file in corso, il sistema tenta di completarle (entro un </w:t>
+      </w:r>
+      <w:proofErr w:type="spellStart"/>
+      <w:r>
+        <w:t>timeout</w:t>
+      </w:r>
+      <w:proofErr w:type="spellEnd"/>
+      <w:r>
+        <w:t xml:space="preserve"> prestabilito) o di abortirle in modo pulito cancellando i file parziali.</w:t>
+      </w:r>
+      <w:r>
+        <w:br/>
+      </w:r>
+    </w:p>
+    <w:p>
+      <w:pPr>
+        <w:pStyle w:val="Titolo3"/>
+      </w:pPr>
+      <w:r>
+        <w:t xml:space="preserve">3.7.3 Comportamento in caso di errore </w:t>
+      </w:r>
+    </w:p>
+    <w:p>
+      <w:r>
+        <w:t xml:space="preserve">Il sistema deve gestire i malfunzionamenti garantendo che l'utente non veda mai </w:t>
+      </w:r>
+      <w:proofErr w:type="spellStart"/>
+      <w:r>
+        <w:t>stack</w:t>
+      </w:r>
+      <w:proofErr w:type="spellEnd"/>
+      <w:r>
+        <w:t xml:space="preserve"> trace o errori di codice.</w:t>
+      </w:r>
+    </w:p>
+    <w:p>
+      <w:pPr>
+        <w:pStyle w:val="Paragrafoelenco"/>
+        <w:numPr>
+          <w:ilvl w:val="0"/>
+          <w:numId w:val="10"/>
+        </w:numPr>
+      </w:pPr>
+      <w:r>
+        <w:rPr>
+          <w:b/>
+          <w:bCs/>
+        </w:rPr>
+        <w:t>Errori Applicativi (Software Bugs / Eccezioni)</w:t>
+      </w:r>
+      <w:r>
+        <w:t xml:space="preserve"> In caso di </w:t>
+      </w:r>
+      <w:proofErr w:type="spellStart"/>
+      <w:r>
+        <w:t>NullPointerException</w:t>
+      </w:r>
+      <w:proofErr w:type="spellEnd"/>
+      <w:r>
+        <w:t xml:space="preserve"> o altre eccezioni non gestite (HTTP 500):</w:t>
+      </w:r>
+    </w:p>
+    <w:p>
+      <w:pPr>
+        <w:numPr>
+          <w:ilvl w:val="0"/>
+          <w:numId w:val="7"/>
+        </w:numPr>
+        <w:tabs>
+          <w:tab w:val="num" w:pos="720"/>
+        </w:tabs>
+      </w:pPr>
+      <w:r>
+        <w:rPr>
+          <w:b/>
+          <w:bCs/>
+        </w:rPr>
+        <w:lastRenderedPageBreak/>
+        <w:t>Log:</w:t>
+      </w:r>
+      <w:r>
+        <w:t xml:space="preserve"> L'errore completo (con </w:t>
+      </w:r>
+      <w:proofErr w:type="spellStart"/>
+      <w:r>
+        <w:t>stack</w:t>
+      </w:r>
+      <w:proofErr w:type="spellEnd"/>
+      <w:r>
+        <w:t xml:space="preserve"> trace) viene scritto nei file di log del server (es. Log4j/SLF4J) per l'analisi da parte degli sviluppatori.</w:t>
+      </w:r>
+    </w:p>
+    <w:p>
+      <w:pPr>
+        <w:numPr>
+          <w:ilvl w:val="0"/>
+          <w:numId w:val="7"/>
+        </w:numPr>
+        <w:tabs>
+          <w:tab w:val="num" w:pos="720"/>
+        </w:tabs>
+      </w:pPr>
+      <w:r>
+        <w:rPr>
+          <w:b/>
+          <w:bCs/>
+        </w:rPr>
+        <w:t>User Experience:</w:t>
+      </w:r>
+      <w:r>
+        <w:t xml:space="preserve"> L'utente viene reindirizzato automaticamente a una pagina di </w:t>
+      </w:r>
+      <w:r>
+        <w:t>errore</w:t>
+      </w:r>
+      <w:r>
+        <w:t xml:space="preserve"> (error500.jsp) che comunica "Si è verificato un errore imprevisto" e invita a riprovare più tardi, senza mostrare dettagli tecnici sensibili.</w:t>
+      </w:r>
+    </w:p>
+    <w:p>
+      <w:pPr>
+        <w:pStyle w:val="Paragrafoelenco"/>
+        <w:numPr>
+          <w:ilvl w:val="0"/>
+          <w:numId w:val="10"/>
+        </w:numPr>
+      </w:pPr>
+      <w:r>
+        <w:rPr>
+          <w:b/>
+          <w:bCs/>
+        </w:rPr>
+        <w:t>Indisponibilità del Database</w:t>
+      </w:r>
+      <w:r>
+        <w:t xml:space="preserve"> Se il database MySQL diventa irraggiungibile durante l'operatività:</w:t>
+      </w:r>
+    </w:p>
+    <w:p>
+      <w:pPr>
+        <w:numPr>
+          <w:ilvl w:val="0"/>
+          <w:numId w:val="8"/>
+        </w:numPr>
+      </w:pPr>
+      <w:r>
+        <w:t xml:space="preserve">Il Connection Pool solleverà eccezioni </w:t>
+      </w:r>
+      <w:proofErr w:type="spellStart"/>
+      <w:r>
+        <w:t>SQLTransientConnectionException</w:t>
+      </w:r>
+      <w:proofErr w:type="spellEnd"/>
+      <w:r>
+        <w:t>.</w:t>
+      </w:r>
+    </w:p>
+    <w:p>
+      <w:pPr>
+        <w:numPr>
+          <w:ilvl w:val="0"/>
+          <w:numId w:val="8"/>
+        </w:numPr>
+      </w:pPr>
+      <w:r>
+        <w:t>Il sistema intercetta queste eccezioni e mostra una pagina specifica di "Servizio non disponibile momentaneamente", impedendo ulteriori tentativi di scrittura che potrebbero portare a inconsistenza.</w:t>
+      </w:r>
+    </w:p>
+    <w:p>
+      <w:pPr>
+        <w:pStyle w:val="Paragrafoelenco"/>
+        <w:numPr>
+          <w:ilvl w:val="0"/>
+          <w:numId w:val="10"/>
+        </w:numPr>
+      </w:pPr>
+      <w:r>
+        <w:rPr>
+          <w:b/>
+          <w:bCs/>
+        </w:rPr>
+        <w:t>Errori di Navigazione (HTTP 404)</w:t>
+      </w:r>
+      <w:r>
+        <w:t xml:space="preserve"> Se l'utente tenta di accedere a una risorsa inesistente o a un URL malformato:</w:t>
+      </w:r>
+    </w:p>
+    <w:p>
+      <w:pPr>
+        <w:numPr>
+          <w:ilvl w:val="0"/>
+          <w:numId w:val="9"/>
+        </w:numPr>
+        <w:tabs>
+          <w:tab w:val="num" w:pos="720"/>
+        </w:tabs>
+      </w:pPr>
+      <w:r>
+        <w:t>Il sistema mostra una pagina personalizzata (error404.jsp) con un link per tornare alla Dashboard principale, mantenendo l'utente all'interno dell'esperienza applicativa.</w:t>
+      </w:r>
+    </w:p>
+    <w:p>
+      <w:pPr>
+        <w:pStyle w:val="Paragrafoelenco"/>
+        <w:numPr>
+          <w:ilvl w:val="0"/>
+          <w:numId w:val="10"/>
+        </w:numPr>
+      </w:pPr>
+      <w:r>
+        <w:rPr>
+          <w:b/>
+          <w:bCs/>
+        </w:rPr>
+        <w:t>Violazioni di Sicurezza</w:t>
+      </w:r>
+      <w:r>
+        <w:t xml:space="preserve"> Come definito nella sezione 3.5, tentativi di accesso non autorizzato (es. URL Forcing) non generano errori di sistema, ma reindirizzano l'utente alla pagina di Login o mostrano una pagina di errore 403 (</w:t>
+      </w:r>
+      <w:proofErr w:type="spellStart"/>
+      <w:r>
+        <w:t>Forbidden</w:t>
+      </w:r>
+      <w:proofErr w:type="spellEnd"/>
+      <w:r>
+        <w:t>) standardizzata.</w:t>
+      </w:r>
+    </w:p>
+    <w:p/>
+    <w:p/>
+    <w:p>
+      <w:pPr>
+        <w:pStyle w:val="Titolo1"/>
+        <w:numPr>
+          <w:ilvl w:val="0"/>
+          <w:numId w:val="6"/>
+        </w:numPr>
+      </w:pPr>
+      <w:r>
+        <w:t>Subsystem Services</w:t>
+      </w:r>
+    </w:p>
+    <w:p/>
+    <w:p>
+      <w:r>
+        <w:t xml:space="preserve">In questa sezione verranno descritti i servizi offerti da ciascun </w:t>
+      </w:r>
+      <w:proofErr w:type="spellStart"/>
+      <w:r>
+        <w:t>subsystem</w:t>
+      </w:r>
+      <w:proofErr w:type="spellEnd"/>
+      <w:r>
+        <w:t xml:space="preserve"> applicativo.</w:t>
+      </w:r>
+    </w:p>
+    <w:p/>
+    <w:p>
+      <w:pPr>
+        <w:pStyle w:val="Titolo3"/>
+        <w:numPr>
+          <w:ilvl w:val="1"/>
+          <w:numId w:val="3"/>
+        </w:numPr>
+      </w:pPr>
+      <w:proofErr w:type="spellStart"/>
+      <w:r>
+        <w:t>AccessManagement</w:t>
+      </w:r>
+      <w:proofErr w:type="spellEnd"/>
+      <w:r>
+        <w:t xml:space="preserve"> </w:t>
+      </w:r>
+    </w:p>
+    <w:p/>
+    <w:p>
+      <w:pPr>
+        <w:ind w:left="360"/>
+      </w:pPr>
+      <w:proofErr w:type="spellStart"/>
+      <w:r>
+        <w:rPr>
+          <w:b/>
+          <w:bCs/>
+        </w:rPr>
+        <w:t>SessionService</w:t>
+      </w:r>
+      <w:proofErr w:type="spellEnd"/>
+      <w:r>
+        <w:t>: gestisce il controllo degli accessi e la sicurezza della sessione. È utilizzato da tutti gli altri sistemi e dal livello client per verificare l’identità e i permessi.</w:t>
+      </w:r>
+    </w:p>
+    <w:tbl>
+      <w:tblPr>
+        <w:tblStyle w:val="Grigliatabella"/>
+        <w:tblW w:w="0" w:type="auto"/>
+        <w:tblInd w:w="360" w:type="dxa"/>
+        <w:tblLook w:val="04A0" w:firstRow="1" w:lastRow="0" w:firstColumn="1" w:lastColumn="0" w:noHBand="0" w:noVBand="1"/>
+      </w:tblPr>
+      <w:tblGrid>
+        <w:gridCol w:w="4634"/>
+        <w:gridCol w:w="4634"/>
+      </w:tblGrid>
+      <w:tr>
+        <w:trPr>
+          <w:trHeight w:val="551"/>
+        </w:trPr>
+        <w:tc>
+          <w:tcPr>
+            <w:tcW w:w="4634" w:type="dxa"/>
+            <w:vAlign w:val="center"/>
+          </w:tcPr>
+          <w:p>
+            <w:pPr>
+              <w:jc w:val="center"/>
+              <w:rPr>
+                <w:b/>
+                <w:bCs/>
+              </w:rPr>
+            </w:pPr>
+            <w:r>
+              <w:rPr>
+                <w:b/>
+                <w:bCs/>
+              </w:rPr>
+              <w:t>Operazione</w:t>
+            </w:r>
+          </w:p>
+        </w:tc>
+        <w:tc>
+          <w:tcPr>
+            <w:tcW w:w="4634" w:type="dxa"/>
+            <w:vAlign w:val="center"/>
+          </w:tcPr>
+          <w:p>
+            <w:pPr>
+              <w:jc w:val="center"/>
+              <w:rPr>
+                <w:b/>
+                <w:bCs/>
+              </w:rPr>
+            </w:pPr>
+            <w:r>
+              <w:rPr>
+                <w:b/>
+                <w:bCs/>
+              </w:rPr>
+              <w:t>Descrizione</w:t>
+            </w:r>
+          </w:p>
+        </w:tc>
+      </w:tr>
+      <w:tr>
+        <w:tc>
+          <w:tcPr>
+            <w:tcW w:w="4634" w:type="dxa"/>
+          </w:tcPr>
+          <w:p>
+            <w:r>
+              <w:t>login</w:t>
+            </w:r>
+          </w:p>
+        </w:tc>
+        <w:tc>
+          <w:tcPr>
+            <w:tcW w:w="4634" w:type="dxa"/>
+          </w:tcPr>
+          <w:p>
+            <w:r>
+              <w:t>Verifica le credenziali dell’utente e crea una nuova sessione.</w:t>
+            </w:r>
+          </w:p>
+        </w:tc>
+      </w:tr>
+      <w:tr>
+        <w:trPr>
+          <w:trHeight w:val="390"/>
+        </w:trPr>
+        <w:tc>
+          <w:tcPr>
+            <w:tcW w:w="4634" w:type="dxa"/>
+          </w:tcPr>
+          <w:p>
+            <w:r>
+              <w:t>Logout</w:t>
+            </w:r>
+          </w:p>
+        </w:tc>
+        <w:tc>
+          <w:tcPr>
+            <w:tcW w:w="4634" w:type="dxa"/>
+          </w:tcPr>
+          <w:p>
+            <w:r>
+              <w:t>Invalida la sessione corrente dell’utente</w:t>
+            </w:r>
+            <w:r>
+              <w:t>.</w:t>
+            </w:r>
+          </w:p>
+        </w:tc>
+      </w:tr>
+      <w:tr>
+        <w:trPr>
+          <w:trHeight w:val="390"/>
+        </w:trPr>
+        <w:tc>
+          <w:tcPr>
+            <w:tcW w:w="4634" w:type="dxa"/>
+          </w:tcPr>
+          <w:p>
+            <w:proofErr w:type="spellStart"/>
+            <w:r>
+              <w:t>checkPermission</w:t>
+            </w:r>
+            <w:proofErr w:type="spellEnd"/>
+          </w:p>
+        </w:tc>
+        <w:tc>
+          <w:tcPr>
+            <w:tcW w:w="4634" w:type="dxa"/>
+          </w:tcPr>
+          <w:p>
+            <w:r>
+              <w:t>Verifica se l’utente corrente ha i permessi per eseguire un’azione specifica</w:t>
+            </w:r>
+            <w:r>
+              <w:t>.</w:t>
+            </w:r>
+          </w:p>
+        </w:tc>
+      </w:tr>
+    </w:tbl>
+    <w:p>
+      <w:pPr>
+        <w:ind w:left="360"/>
+      </w:pPr>
+    </w:p>
+    <w:p/>
+    <w:p>
+      <w:pPr>
+        <w:pStyle w:val="Titolo3"/>
+        <w:numPr>
+          <w:ilvl w:val="1"/>
+          <w:numId w:val="3"/>
+        </w:numPr>
+      </w:pPr>
+      <w:proofErr w:type="spellStart"/>
+      <w:r>
+        <w:lastRenderedPageBreak/>
+        <w:t>AccountManagement</w:t>
+      </w:r>
+      <w:proofErr w:type="spellEnd"/>
+    </w:p>
+    <w:p/>
+    <w:p>
+      <w:proofErr w:type="spellStart"/>
+      <w:r>
+        <w:rPr>
+          <w:b/>
+          <w:bCs/>
+        </w:rPr>
+        <w:t>PersonalProfileService</w:t>
+      </w:r>
+      <w:proofErr w:type="spellEnd"/>
+      <w:r>
+        <w:t xml:space="preserve">: gestisce tutte le operazioni </w:t>
+      </w:r>
+      <w:r>
+        <w:t>che un utente autenticato può eseguire sul proprio account</w:t>
+      </w:r>
+    </w:p>
+    <w:p/>
+    <w:tbl>
+      <w:tblPr>
+        <w:tblStyle w:val="Grigliatabella"/>
+        <w:tblW w:w="0" w:type="auto"/>
+        <w:tblInd w:w="360" w:type="dxa"/>
+        <w:tblLook w:val="04A0" w:firstRow="1" w:lastRow="0" w:firstColumn="1" w:lastColumn="0" w:noHBand="0" w:noVBand="1"/>
+      </w:tblPr>
+      <w:tblGrid>
+        <w:gridCol w:w="4634"/>
+        <w:gridCol w:w="4634"/>
+      </w:tblGrid>
+      <w:tr>
+        <w:trPr>
+          <w:trHeight w:val="551"/>
+        </w:trPr>
+        <w:tc>
+          <w:tcPr>
+            <w:tcW w:w="4634" w:type="dxa"/>
+            <w:vAlign w:val="center"/>
+          </w:tcPr>
+          <w:p>
+            <w:pPr>
+              <w:spacing w:after="160" w:line="259" w:lineRule="auto"/>
+              <w:rPr>
+                <w:b/>
+                <w:bCs/>
+              </w:rPr>
+            </w:pPr>
+            <w:r>
+              <w:rPr>
+                <w:b/>
+                <w:bCs/>
+              </w:rPr>
+              <w:t>Operazione</w:t>
+            </w:r>
+          </w:p>
+        </w:tc>
+        <w:tc>
+          <w:tcPr>
+            <w:tcW w:w="4634" w:type="dxa"/>
+            <w:vAlign w:val="center"/>
+          </w:tcPr>
+          <w:p>
+            <w:pPr>
+              <w:spacing w:after="160" w:line="259" w:lineRule="auto"/>
+              <w:rPr>
+                <w:b/>
+                <w:bCs/>
+              </w:rPr>
+            </w:pPr>
+            <w:r>
+              <w:rPr>
+                <w:b/>
+                <w:bCs/>
+              </w:rPr>
+              <w:t>Descrizione</w:t>
+            </w:r>
+          </w:p>
+        </w:tc>
+      </w:tr>
+      <w:tr>
+        <w:tc>
+          <w:tcPr>
+            <w:tcW w:w="4634" w:type="dxa"/>
+          </w:tcPr>
+          <w:p>
+            <w:pPr>
+              <w:spacing w:after="160" w:line="259" w:lineRule="auto"/>
+            </w:pPr>
+            <w:proofErr w:type="spellStart"/>
+            <w:r>
+              <w:t>getMyProfile</w:t>
+            </w:r>
+            <w:proofErr w:type="spellEnd"/>
+          </w:p>
+        </w:tc>
+        <w:tc>
+          <w:tcPr>
+            <w:tcW w:w="4634" w:type="dxa"/>
+          </w:tcPr>
+          <w:p>
+            <w:pPr>
+              <w:spacing w:after="160" w:line="259" w:lineRule="auto"/>
+            </w:pPr>
+            <w:r>
+              <w:t>Recupera i dettagli dell’account dell’utente correntemente loggato</w:t>
+            </w:r>
+            <w:r>
+              <w:t>.</w:t>
+            </w:r>
+          </w:p>
+        </w:tc>
+      </w:tr>
+      <w:tr>
+        <w:tc>
+          <w:tcPr>
+            <w:tcW w:w="4634" w:type="dxa"/>
+          </w:tcPr>
+          <w:p>
+            <w:proofErr w:type="spellStart"/>
+            <w:r>
+              <w:t>changePwd</w:t>
+            </w:r>
+            <w:proofErr w:type="spellEnd"/>
+          </w:p>
+        </w:tc>
+        <w:tc>
+          <w:tcPr>
+            <w:tcW w:w="4634" w:type="dxa"/>
+          </w:tcPr>
+          <w:p>
+            <w:r>
+              <w:t>Permette all’utente di aggiornare la propria password</w:t>
+            </w:r>
+            <w:r>
+              <w:t>.</w:t>
+            </w:r>
+          </w:p>
+        </w:tc>
+      </w:tr>
+    </w:tbl>
+    <w:p/>
+    <w:p>
+      <w:proofErr w:type="spellStart"/>
+      <w:r>
+        <w:rPr>
+          <w:b/>
+          <w:bCs/>
+        </w:rPr>
+        <w:t>ProfileManagementService</w:t>
+      </w:r>
+      <w:proofErr w:type="spellEnd"/>
+      <w:r>
+        <w:t>: gestisce le operazioni amministrative riservate al ruolo del Gestore degli account</w:t>
+      </w:r>
+    </w:p>
+    <w:p/>
+    <w:tbl>
+      <w:tblPr>
+        <w:tblStyle w:val="Grigliatabella"/>
+        <w:tblW w:w="0" w:type="auto"/>
+        <w:tblInd w:w="360" w:type="dxa"/>
+        <w:tblLook w:val="04A0" w:firstRow="1" w:lastRow="0" w:firstColumn="1" w:lastColumn="0" w:noHBand="0" w:noVBand="1"/>
+      </w:tblPr>
+      <w:tblGrid>
+        <w:gridCol w:w="4634"/>
+        <w:gridCol w:w="4634"/>
+      </w:tblGrid>
+      <w:tr>
+        <w:trPr>
+          <w:trHeight w:val="551"/>
+        </w:trPr>
+        <w:tc>
+          <w:tcPr>
+            <w:tcW w:w="4634" w:type="dxa"/>
+            <w:vAlign w:val="center"/>
+          </w:tcPr>
+          <w:p>
+            <w:pPr>
+              <w:spacing w:after="160" w:line="259" w:lineRule="auto"/>
+              <w:rPr>
+                <w:b/>
+                <w:bCs/>
+              </w:rPr>
+            </w:pPr>
+            <w:r>
+              <w:rPr>
+                <w:b/>
+                <w:bCs/>
+              </w:rPr>
+              <w:t>Operazione</w:t>
+            </w:r>
+          </w:p>
+        </w:tc>
+        <w:tc>
+          <w:tcPr>
+            <w:tcW w:w="4634" w:type="dxa"/>
+            <w:vAlign w:val="center"/>
+          </w:tcPr>
+          <w:p>
+            <w:pPr>
+              <w:spacing w:after="160" w:line="259" w:lineRule="auto"/>
+              <w:rPr>
+                <w:b/>
+                <w:bCs/>
+              </w:rPr>
+            </w:pPr>
+            <w:r>
+              <w:rPr>
+                <w:b/>
+                <w:bCs/>
+              </w:rPr>
+              <w:t>Descrizione</w:t>
+            </w:r>
+          </w:p>
+        </w:tc>
+      </w:tr>
+      <w:tr>
+        <w:tc>
+          <w:tcPr>
+            <w:tcW w:w="4634" w:type="dxa"/>
+          </w:tcPr>
+          <w:p>
+            <w:pPr>
+              <w:spacing w:after="160" w:line="259" w:lineRule="auto"/>
+            </w:pPr>
+            <w:proofErr w:type="spellStart"/>
+            <w:r>
+              <w:t>addAccount</w:t>
+            </w:r>
+            <w:proofErr w:type="spellEnd"/>
+          </w:p>
+        </w:tc>
+        <w:tc>
+          <w:tcPr>
+            <w:tcW w:w="4634" w:type="dxa"/>
+          </w:tcPr>
+          <w:p>
+            <w:pPr>
+              <w:spacing w:after="160" w:line="259" w:lineRule="auto"/>
+            </w:pPr>
+            <w:r>
+              <w:t>Permette di aggiungere un nuovo account al sistema</w:t>
+            </w:r>
+            <w:r>
+              <w:t>.</w:t>
+            </w:r>
+          </w:p>
+        </w:tc>
+      </w:tr>
+      <w:tr>
+        <w:tc>
+          <w:tcPr>
+            <w:tcW w:w="4634" w:type="dxa"/>
+          </w:tcPr>
+          <w:p>
+            <w:proofErr w:type="spellStart"/>
+            <w:r>
+              <w:t>getAccount</w:t>
+            </w:r>
+            <w:proofErr w:type="spellEnd"/>
+          </w:p>
+        </w:tc>
+        <w:tc>
+          <w:tcPr>
+            <w:tcW w:w="4634" w:type="dxa"/>
+          </w:tcPr>
+          <w:p>
+            <w:r>
+              <w:t>Permette di recuperare i dati di un account selezionato dal client</w:t>
+            </w:r>
+            <w:r>
+              <w:t>.</w:t>
+            </w:r>
+          </w:p>
+        </w:tc>
+      </w:tr>
+      <w:tr>
+        <w:tc>
+          <w:tcPr>
+            <w:tcW w:w="4634" w:type="dxa"/>
+          </w:tcPr>
+          <w:p>
+            <w:proofErr w:type="spellStart"/>
+            <w:r>
+              <w:t>generateNewPwd</w:t>
+            </w:r>
+            <w:proofErr w:type="spellEnd"/>
+          </w:p>
+        </w:tc>
+        <w:tc>
+          <w:tcPr>
+            <w:tcW w:w="4634" w:type="dxa"/>
+          </w:tcPr>
+          <w:p>
+            <w:r>
+              <w:t>Permette di rimpiazzare la password preesistente di un account con una nuova</w:t>
+            </w:r>
+            <w:r>
+              <w:t>.</w:t>
+            </w:r>
+          </w:p>
+        </w:tc>
+      </w:tr>
+      <w:tr>
+        <w:tc>
+          <w:tcPr>
+            <w:tcW w:w="4634" w:type="dxa"/>
+          </w:tcPr>
+          <w:p>
+            <w:proofErr w:type="spellStart"/>
+            <w:r>
+              <w:t>modifyRole</w:t>
+            </w:r>
+            <w:proofErr w:type="spellEnd"/>
+          </w:p>
+        </w:tc>
+        <w:tc>
+          <w:tcPr>
+            <w:tcW w:w="4634" w:type="dxa"/>
+          </w:tcPr>
+          <w:p>
+            <w:r>
+              <w:t>Permette di cambiare il ruolo assegnato ad un account</w:t>
+            </w:r>
+            <w:r>
+              <w:t>.</w:t>
+            </w:r>
+          </w:p>
+        </w:tc>
+      </w:tr>
+      <w:tr>
+        <w:tc>
+          <w:tcPr>
+            <w:tcW w:w="4634" w:type="dxa"/>
+          </w:tcPr>
+          <w:p>
+            <w:proofErr w:type="spellStart"/>
+            <w:r>
+              <w:t>modifySupervisor</w:t>
+            </w:r>
+            <w:proofErr w:type="spellEnd"/>
+          </w:p>
+        </w:tc>
+        <w:tc>
+          <w:tcPr>
+            <w:tcW w:w="4634" w:type="dxa"/>
+          </w:tcPr>
+          <w:p>
+            <w:r>
+              <w:t>Permette di cambiare supervisore ad un dipendente</w:t>
+            </w:r>
+            <w:r>
+              <w:t>.</w:t>
+            </w:r>
+          </w:p>
+        </w:tc>
+      </w:tr>
+      <w:tr>
+        <w:tc>
+          <w:tcPr>
+            <w:tcW w:w="4634" w:type="dxa"/>
+          </w:tcPr>
+          <w:p>
+            <w:proofErr w:type="spellStart"/>
+            <w:r>
+              <w:t>deleteAccount</w:t>
+            </w:r>
+            <w:proofErr w:type="spellEnd"/>
+          </w:p>
+        </w:tc>
+        <w:tc>
+          <w:tcPr>
+            <w:tcW w:w="4634" w:type="dxa"/>
+          </w:tcPr>
+          <w:p>
+            <w:r>
+              <w:t>Permette di eliminare un account dal sistema</w:t>
+            </w:r>
+            <w:r>
+              <w:t>.</w:t>
+            </w:r>
+            <w:r>
+              <w:t xml:space="preserve"> </w:t>
+            </w:r>
+          </w:p>
+        </w:tc>
+      </w:tr>
+    </w:tbl>
     <w:p/>
     <w:p/>
     <w:p/>
+    <w:p>
+      <w:pPr>
+        <w:pStyle w:val="Titolo3"/>
+        <w:numPr>
+          <w:ilvl w:val="1"/>
+          <w:numId w:val="3"/>
+        </w:numPr>
+      </w:pPr>
+      <w:proofErr w:type="spellStart"/>
+      <w:r>
+        <w:t>TaskManagement</w:t>
+      </w:r>
+      <w:proofErr w:type="spellEnd"/>
+    </w:p>
+    <w:p/>
+    <w:p/>
+    <w:p>
+      <w:proofErr w:type="spellStart"/>
+      <w:r>
+        <w:rPr>
+          <w:b/>
+          <w:bCs/>
+        </w:rPr>
+        <w:t>TaskCommonService</w:t>
+      </w:r>
+      <w:proofErr w:type="spellEnd"/>
+      <w:r>
+        <w:t xml:space="preserve">: </w:t>
+      </w:r>
+      <w:r>
+        <w:t>espone le operazioni di lettura e le azioni condivise accessibili sia ai Dipendenti che ai Supervisori.</w:t>
+      </w:r>
+    </w:p>
     <w:p/>
     <w:p/>
     <w:p/>
-    <w:p>
-      <w:r>
-        <w:t>I sottosistemi individuati sono:</w:t>
-      </w:r>
-    </w:p>
+    <w:tbl>
+      <w:tblPr>
+        <w:tblStyle w:val="Grigliatabella"/>
+        <w:tblW w:w="0" w:type="auto"/>
+        <w:tblInd w:w="360" w:type="dxa"/>
+        <w:tblLook w:val="04A0" w:firstRow="1" w:lastRow="0" w:firstColumn="1" w:lastColumn="0" w:noHBand="0" w:noVBand="1"/>
+      </w:tblPr>
+      <w:tblGrid>
+        <w:gridCol w:w="4634"/>
+        <w:gridCol w:w="4634"/>
+      </w:tblGrid>
+      <w:tr>
+        <w:trPr>
+          <w:trHeight w:val="551"/>
+        </w:trPr>
+        <w:tc>
+          <w:tcPr>
+            <w:tcW w:w="4634" w:type="dxa"/>
+            <w:vAlign w:val="center"/>
+          </w:tcPr>
+          <w:p>
+            <w:pPr>
+              <w:spacing w:after="160" w:line="259" w:lineRule="auto"/>
+              <w:rPr>
+                <w:b/>
+                <w:bCs/>
+              </w:rPr>
+            </w:pPr>
+            <w:r>
+              <w:rPr>
+                <w:b/>
+                <w:bCs/>
+              </w:rPr>
+              <w:lastRenderedPageBreak/>
+              <w:t>Operazione</w:t>
+            </w:r>
+          </w:p>
+        </w:tc>
+        <w:tc>
+          <w:tcPr>
+            <w:tcW w:w="4634" w:type="dxa"/>
+            <w:vAlign w:val="center"/>
+          </w:tcPr>
+          <w:p>
+            <w:pPr>
+              <w:spacing w:after="160" w:line="259" w:lineRule="auto"/>
+              <w:rPr>
+                <w:b/>
+                <w:bCs/>
+              </w:rPr>
+            </w:pPr>
+            <w:r>
+              <w:rPr>
+                <w:b/>
+                <w:bCs/>
+              </w:rPr>
+              <w:t>Descrizione</w:t>
+            </w:r>
+          </w:p>
+        </w:tc>
+      </w:tr>
+      <w:tr>
+        <w:tc>
+          <w:tcPr>
+            <w:tcW w:w="4634" w:type="dxa"/>
+          </w:tcPr>
+          <w:p>
+            <w:pPr>
+              <w:spacing w:after="160" w:line="259" w:lineRule="auto"/>
+            </w:pPr>
+            <w:proofErr w:type="spellStart"/>
+            <w:r>
+              <w:t>getTask</w:t>
+            </w:r>
+            <w:proofErr w:type="spellEnd"/>
+          </w:p>
+        </w:tc>
+        <w:tc>
+          <w:tcPr>
+            <w:tcW w:w="4634" w:type="dxa"/>
+          </w:tcPr>
+          <w:p>
+            <w:pPr>
+              <w:spacing w:after="160" w:line="259" w:lineRule="auto"/>
+            </w:pPr>
+            <w:r>
+              <w:t>Recupera le informazioni complete di un task</w:t>
+            </w:r>
+            <w:r>
+              <w:t>.</w:t>
+            </w:r>
+            <w:r>
+              <w:t xml:space="preserve"> </w:t>
+            </w:r>
+          </w:p>
+        </w:tc>
+      </w:tr>
+      <w:tr>
+        <w:tc>
+          <w:tcPr>
+            <w:tcW w:w="4634" w:type="dxa"/>
+          </w:tcPr>
+          <w:p>
+            <w:proofErr w:type="spellStart"/>
+            <w:r>
+              <w:t>filterTask</w:t>
+            </w:r>
+            <w:proofErr w:type="spellEnd"/>
+          </w:p>
+        </w:tc>
+        <w:tc>
+          <w:tcPr>
+            <w:tcW w:w="4634" w:type="dxa"/>
+          </w:tcPr>
+          <w:p>
+            <w:r>
+              <w:t xml:space="preserve">Permette di filtrare task per stato (da completare, inizializzate </w:t>
+            </w:r>
+            <w:proofErr w:type="spellStart"/>
+            <w:r>
+              <w:t>ecc</w:t>
+            </w:r>
+            <w:proofErr w:type="spellEnd"/>
+            <w:r>
+              <w:t>…)</w:t>
+            </w:r>
+            <w:r>
+              <w:t>.</w:t>
+            </w:r>
+          </w:p>
+        </w:tc>
+      </w:tr>
+      <w:tr>
+        <w:tc>
+          <w:tcPr>
+            <w:tcW w:w="4634" w:type="dxa"/>
+          </w:tcPr>
+          <w:p>
+            <w:proofErr w:type="spellStart"/>
+            <w:r>
+              <w:t>holdTask</w:t>
+            </w:r>
+            <w:proofErr w:type="spellEnd"/>
+          </w:p>
+        </w:tc>
+        <w:tc>
+          <w:tcPr>
+            <w:tcW w:w="4634" w:type="dxa"/>
+          </w:tcPr>
+          <w:p>
+            <w:r>
+              <w:t>Permette di cambiare sospendere un task e cambiare di conseguenza lo stato</w:t>
+            </w:r>
+            <w:r>
+              <w:t>.</w:t>
+            </w:r>
+          </w:p>
+        </w:tc>
+      </w:tr>
+      <w:tr>
+        <w:tc>
+          <w:tcPr>
+            <w:tcW w:w="4634" w:type="dxa"/>
+          </w:tcPr>
+          <w:p>
+            <w:proofErr w:type="spellStart"/>
+            <w:r>
+              <w:t>dowloadAllegato</w:t>
+            </w:r>
+            <w:proofErr w:type="spellEnd"/>
+          </w:p>
+        </w:tc>
+        <w:tc>
+          <w:tcPr>
+            <w:tcW w:w="4634" w:type="dxa"/>
+          </w:tcPr>
+          <w:p>
+            <w:r>
+              <w:t>Permette di scaricare un allegato dal task in cui è stato caricato</w:t>
+            </w:r>
+            <w:r>
+              <w:t>.</w:t>
+            </w:r>
+          </w:p>
+        </w:tc>
+      </w:tr>
+    </w:tbl>
+    <w:p/>
+    <w:p/>
+    <w:p/>
     <w:p>
       <w:proofErr w:type="spellStart"/>
       <w:r>
-        <w:t>EWMSClient</w:t>
+        <w:rPr>
+          <w:b/>
+          <w:bCs/>
+        </w:rPr>
+        <w:t>TaskSupervisoreService</w:t>
       </w:r>
       <w:proofErr w:type="spellEnd"/>
       <w:r>
-        <w:t>: per gestire l’interazione con l’utente</w:t>
-      </w:r>
-      <w:r>
-        <w:t xml:space="preserve"> e </w:t>
-      </w:r>
-      <w:r>
-        <w:t>la gestione delle operazioni lato client</w:t>
-      </w:r>
-    </w:p>
+        <w:t>: espone tutte le operazioni eseguibil</w:t>
+      </w:r>
+      <w:r>
+        <w:t>i</w:t>
+      </w:r>
+      <w:r>
+        <w:t xml:space="preserve"> da un Supervisore</w:t>
+      </w:r>
+      <w:r>
+        <w:t xml:space="preserve"> sul ciclo di vita di un task</w:t>
+      </w:r>
+    </w:p>
+    <w:p/>
+    <w:p/>
+    <w:tbl>
+      <w:tblPr>
+        <w:tblStyle w:val="Grigliatabella"/>
+        <w:tblW w:w="0" w:type="auto"/>
+        <w:tblInd w:w="360" w:type="dxa"/>
+        <w:tblLook w:val="04A0" w:firstRow="1" w:lastRow="0" w:firstColumn="1" w:lastColumn="0" w:noHBand="0" w:noVBand="1"/>
+      </w:tblPr>
+      <w:tblGrid>
+        <w:gridCol w:w="4634"/>
+        <w:gridCol w:w="4634"/>
+      </w:tblGrid>
+      <w:tr>
+        <w:trPr>
+          <w:trHeight w:val="551"/>
+        </w:trPr>
+        <w:tc>
+          <w:tcPr>
+            <w:tcW w:w="4634" w:type="dxa"/>
+            <w:vAlign w:val="center"/>
+          </w:tcPr>
+          <w:p>
+            <w:pPr>
+              <w:spacing w:after="160" w:line="259" w:lineRule="auto"/>
+              <w:rPr>
+                <w:b/>
+                <w:bCs/>
+              </w:rPr>
+            </w:pPr>
+            <w:r>
+              <w:rPr>
+                <w:b/>
+                <w:bCs/>
+              </w:rPr>
+              <w:t>Operazione</w:t>
+            </w:r>
+          </w:p>
+        </w:tc>
+        <w:tc>
+          <w:tcPr>
+            <w:tcW w:w="4634" w:type="dxa"/>
+            <w:vAlign w:val="center"/>
+          </w:tcPr>
+          <w:p>
+            <w:pPr>
+              <w:spacing w:after="160" w:line="259" w:lineRule="auto"/>
+              <w:rPr>
+                <w:b/>
+                <w:bCs/>
+              </w:rPr>
+            </w:pPr>
+            <w:r>
+              <w:rPr>
+                <w:b/>
+                <w:bCs/>
+              </w:rPr>
+              <w:t>Descrizione</w:t>
+            </w:r>
+          </w:p>
+        </w:tc>
+      </w:tr>
+      <w:tr>
+        <w:tc>
+          <w:tcPr>
+            <w:tcW w:w="4634" w:type="dxa"/>
+          </w:tcPr>
+          <w:p>
+            <w:pPr>
+              <w:spacing w:after="160" w:line="259" w:lineRule="auto"/>
+            </w:pPr>
+            <w:proofErr w:type="spellStart"/>
+            <w:r>
+              <w:t>createTask</w:t>
+            </w:r>
+            <w:proofErr w:type="spellEnd"/>
+          </w:p>
+        </w:tc>
+        <w:tc>
+          <w:tcPr>
+            <w:tcW w:w="4634" w:type="dxa"/>
+          </w:tcPr>
+          <w:p>
+            <w:pPr>
+              <w:spacing w:after="160" w:line="259" w:lineRule="auto"/>
+            </w:pPr>
+            <w:r>
+              <w:t>Permette di assegnare un task ad un dipendente</w:t>
+            </w:r>
+            <w:r>
+              <w:t>.</w:t>
+            </w:r>
+          </w:p>
+        </w:tc>
+      </w:tr>
+      <w:tr>
+        <w:tc>
+          <w:tcPr>
+            <w:tcW w:w="4634" w:type="dxa"/>
+          </w:tcPr>
+          <w:p>
+            <w:proofErr w:type="spellStart"/>
+            <w:r>
+              <w:t>deleteTask</w:t>
+            </w:r>
+            <w:proofErr w:type="spellEnd"/>
+          </w:p>
+        </w:tc>
+        <w:tc>
+          <w:tcPr>
+            <w:tcW w:w="4634" w:type="dxa"/>
+          </w:tcPr>
+          <w:p>
+            <w:r>
+              <w:t>Permette di rimuovere un task precedentemente assegnato dal sistema e notifica il dipendente.</w:t>
+            </w:r>
+          </w:p>
+        </w:tc>
+      </w:tr>
+      <w:tr>
+        <w:tc>
+          <w:tcPr>
+            <w:tcW w:w="4634" w:type="dxa"/>
+          </w:tcPr>
+          <w:p>
+            <w:proofErr w:type="spellStart"/>
+            <w:r>
+              <w:t>sendWarning</w:t>
+            </w:r>
+            <w:proofErr w:type="spellEnd"/>
+          </w:p>
+        </w:tc>
+        <w:tc>
+          <w:tcPr>
+            <w:tcW w:w="4634" w:type="dxa"/>
+          </w:tcPr>
+          <w:p>
+            <w:r>
+              <w:t xml:space="preserve">Invia un sollecito o un avviso formale al dipendente </w:t>
+            </w:r>
+            <w:r>
+              <w:t>assegnato al</w:t>
+            </w:r>
+            <w:r>
+              <w:t xml:space="preserve"> task.</w:t>
+            </w:r>
+          </w:p>
+        </w:tc>
+      </w:tr>
+    </w:tbl>
+    <w:p/>
+    <w:p/>
     <w:p>
       <w:proofErr w:type="spellStart"/>
       <w:r>
-        <w:t>EWMSServer</w:t>
+        <w:rPr>
+          <w:b/>
+          <w:bCs/>
+        </w:rPr>
+        <w:t>TaskDipendenteService</w:t>
       </w:r>
       <w:proofErr w:type="spellEnd"/>
       <w:r>
-        <w:t xml:space="preserve">: responsabile per il controllo di accesso e concorrenza, delega agli altri </w:t>
+        <w:t>: espone tutte le operazioni eseguibili da un Dipendente sul ciclo di vita di un task.</w:t>
+      </w:r>
+    </w:p>
+    <w:p/>
+    <w:tbl>
+      <w:tblPr>
+        <w:tblStyle w:val="Grigliatabella"/>
+        <w:tblW w:w="0" w:type="auto"/>
+        <w:tblInd w:w="360" w:type="dxa"/>
+        <w:tblLook w:val="04A0" w:firstRow="1" w:lastRow="0" w:firstColumn="1" w:lastColumn="0" w:noHBand="0" w:noVBand="1"/>
+      </w:tblPr>
+      <w:tblGrid>
+        <w:gridCol w:w="4634"/>
+        <w:gridCol w:w="4634"/>
+      </w:tblGrid>
+      <w:tr>
+        <w:trPr>
+          <w:trHeight w:val="551"/>
+        </w:trPr>
+        <w:tc>
+          <w:tcPr>
+            <w:tcW w:w="4634" w:type="dxa"/>
+            <w:vAlign w:val="center"/>
+          </w:tcPr>
+          <w:p>
+            <w:pPr>
+              <w:spacing w:after="160" w:line="259" w:lineRule="auto"/>
+              <w:rPr>
+                <w:b/>
+                <w:bCs/>
+              </w:rPr>
+            </w:pPr>
+            <w:r>
+              <w:rPr>
+                <w:b/>
+                <w:bCs/>
+              </w:rPr>
+              <w:t>Operazione</w:t>
+            </w:r>
+          </w:p>
+        </w:tc>
+        <w:tc>
+          <w:tcPr>
+            <w:tcW w:w="4634" w:type="dxa"/>
+            <w:vAlign w:val="center"/>
+          </w:tcPr>
+          <w:p>
+            <w:pPr>
+              <w:spacing w:after="160" w:line="259" w:lineRule="auto"/>
+              <w:rPr>
+                <w:b/>
+                <w:bCs/>
+              </w:rPr>
+            </w:pPr>
+            <w:r>
+              <w:rPr>
+                <w:b/>
+                <w:bCs/>
+              </w:rPr>
+              <w:t>Descrizione</w:t>
+            </w:r>
+          </w:p>
+        </w:tc>
+      </w:tr>
+      <w:tr>
+        <w:tc>
+          <w:tcPr>
+            <w:tcW w:w="4634" w:type="dxa"/>
+          </w:tcPr>
+          <w:p>
+            <w:pPr>
+              <w:spacing w:after="160" w:line="259" w:lineRule="auto"/>
+            </w:pPr>
+            <w:proofErr w:type="spellStart"/>
+            <w:r>
+              <w:t>inizializzaTask</w:t>
+            </w:r>
+            <w:proofErr w:type="spellEnd"/>
+          </w:p>
+        </w:tc>
+        <w:tc>
+          <w:tcPr>
+            <w:tcW w:w="4634" w:type="dxa"/>
+          </w:tcPr>
+          <w:p>
+            <w:pPr>
+              <w:spacing w:after="160" w:line="259" w:lineRule="auto"/>
+            </w:pPr>
+            <w:r>
+              <w:t>Segnala l'inizio dei lavori</w:t>
+            </w:r>
+            <w:r>
+              <w:t xml:space="preserve"> da parte di un dipendente</w:t>
+            </w:r>
+            <w:r>
+              <w:t>, portando il task dallo stato "Da completare" a "In elaborazione"</w:t>
+            </w:r>
+            <w:r>
+              <w:t>.</w:t>
+            </w:r>
+          </w:p>
+        </w:tc>
+      </w:tr>
+      <w:tr>
+        <w:tc>
+          <w:tcPr>
+            <w:tcW w:w="4634" w:type="dxa"/>
+          </w:tcPr>
+          <w:p>
+            <w:proofErr w:type="spellStart"/>
+            <w:r>
+              <w:t>completeTask</w:t>
+            </w:r>
+            <w:proofErr w:type="spellEnd"/>
+          </w:p>
+        </w:tc>
+        <w:tc>
+          <w:tcPr>
+            <w:tcW w:w="4634" w:type="dxa"/>
+          </w:tcPr>
+          <w:p>
+            <w:r>
+              <w:t>Segnala la conclusione del lavoro, portando il task nello stato finale "Completato"</w:t>
+            </w:r>
+            <w:r>
+              <w:t>.</w:t>
+            </w:r>
+          </w:p>
+        </w:tc>
+      </w:tr>
+    </w:tbl>
+    <w:p>
+      <w:pPr>
+        <w:pStyle w:val="Titolo3"/>
+      </w:pPr>
+    </w:p>
+    <w:p>
+      <w:pPr>
+        <w:pStyle w:val="Titolo3"/>
+        <w:numPr>
+          <w:ilvl w:val="1"/>
+          <w:numId w:val="3"/>
+        </w:numPr>
+      </w:pPr>
+      <w:r>
+        <w:t xml:space="preserve"> </w:t>
       </w:r>
       <w:proofErr w:type="spellStart"/>
       <w:r>
-        <w:t>subsystem</w:t>
+        <w:t>NotificheManagement</w:t>
       </w:r>
       <w:proofErr w:type="spellEnd"/>
-      <w:r>
-        <w:t xml:space="preserve"> la logica applicativa. </w:t>
-      </w:r>
-    </w:p>
+    </w:p>
+    <w:p/>
     <w:p>
       <w:proofErr w:type="spellStart"/>
       <w:r>
-        <w:t>Access</w:t>
-      </w:r>
-      <w:r>
-        <w:t>Management</w:t>
+        <w:rPr>
+          <w:b/>
+          <w:bCs/>
+        </w:rPr>
+        <w:t>NotificheService</w:t>
       </w:r>
       <w:proofErr w:type="spellEnd"/>
       <w:r>
-        <w:t>: per gestire le operazioni di login e logout del sistema</w:t>
-      </w:r>
-      <w:r>
-        <w:t>.</w:t>
-      </w:r>
-    </w:p>
-    <w:p>
-      <w:proofErr w:type="spellStart"/>
-      <w:r>
-        <w:t>Account</w:t>
-      </w:r>
-      <w:r>
-        <w:t>M</w:t>
-      </w:r>
-      <w:r>
-        <w:t>anagemen</w:t>
-      </w:r>
-      <w:r>
-        <w:t>t</w:t>
-      </w:r>
-      <w:proofErr w:type="spellEnd"/>
-      <w:r>
-        <w:t xml:space="preserve">: </w:t>
-      </w:r>
-      <w:r>
-        <w:t>operazioni di gestione del gestore degli account</w:t>
-      </w:r>
-      <w:r>
-        <w:t>, e di modifica profilo personale</w:t>
-      </w:r>
-      <w:r>
-        <w:t>.</w:t>
-      </w:r>
-    </w:p>
-    <w:p>
-      <w:proofErr w:type="spellStart"/>
-      <w:r>
-        <w:t>TaskManagement</w:t>
-      </w:r>
-      <w:proofErr w:type="spellEnd"/>
-      <w:r>
-        <w:t>: Gestisce tutti i Servizi le</w:t>
-      </w:r>
-      <w:r>
-        <w:t xml:space="preserve">gati al ciclo di vita </w:t>
-      </w:r>
-      <w:proofErr w:type="gramStart"/>
-      <w:r>
-        <w:t>delle task</w:t>
-      </w:r>
-      <w:proofErr w:type="gramEnd"/>
+        <w:t xml:space="preserve">: gestisce la comunicazione asincrona e gli avvisi. </w:t>
+      </w:r>
     </w:p>
     <w:p/>
-    <w:p>
-      <w:proofErr w:type="spellStart"/>
-      <w:r>
-        <w:t>NotificheManagement</w:t>
-      </w:r>
-      <w:proofErr w:type="spellEnd"/>
-      <w:r>
-        <w:t>: serve a gestire i servizi di notifica</w:t>
-      </w:r>
-      <w:r>
-        <w:t>.</w:t>
-      </w:r>
-    </w:p>
-    <w:p>
-      <w:proofErr w:type="spellStart"/>
-      <w:r>
-        <w:t>Persistence</w:t>
-      </w:r>
-      <w:r>
-        <w:t>Management</w:t>
-      </w:r>
-      <w:proofErr w:type="spellEnd"/>
-      <w:r>
-        <w:t xml:space="preserve">: Servizi di persistenza delle </w:t>
-      </w:r>
-      <w:proofErr w:type="spellStart"/>
-      <w:r>
-        <w:t>entity</w:t>
-      </w:r>
-      <w:proofErr w:type="spellEnd"/>
-      <w:r>
-        <w:t xml:space="preserve"> class</w:t>
-      </w:r>
-      <w:r>
-        <w:t>, controlla la logica di accesso ai dati.</w:t>
-      </w:r>
-    </w:p>
+    <w:tbl>
+      <w:tblPr>
+        <w:tblStyle w:val="Grigliatabella"/>
+        <w:tblW w:w="0" w:type="auto"/>
+        <w:tblInd w:w="360" w:type="dxa"/>
+        <w:tblLook w:val="04A0" w:firstRow="1" w:lastRow="0" w:firstColumn="1" w:lastColumn="0" w:noHBand="0" w:noVBand="1"/>
+      </w:tblPr>
+      <w:tblGrid>
+        <w:gridCol w:w="4634"/>
+        <w:gridCol w:w="4634"/>
+      </w:tblGrid>
+      <w:tr>
+        <w:trPr>
+          <w:trHeight w:val="551"/>
+        </w:trPr>
+        <w:tc>
+          <w:tcPr>
+            <w:tcW w:w="4634" w:type="dxa"/>
+            <w:vAlign w:val="center"/>
+          </w:tcPr>
+          <w:p>
+            <w:pPr>
+              <w:spacing w:after="160" w:line="259" w:lineRule="auto"/>
+              <w:rPr>
+                <w:b/>
+                <w:bCs/>
+              </w:rPr>
+            </w:pPr>
+            <w:r>
+              <w:rPr>
+                <w:b/>
+                <w:bCs/>
+              </w:rPr>
+              <w:t>Operazione</w:t>
+            </w:r>
+          </w:p>
+        </w:tc>
+        <w:tc>
+          <w:tcPr>
+            <w:tcW w:w="4634" w:type="dxa"/>
+            <w:vAlign w:val="center"/>
+          </w:tcPr>
+          <w:p>
+            <w:pPr>
+              <w:spacing w:after="160" w:line="259" w:lineRule="auto"/>
+              <w:rPr>
+                <w:b/>
+                <w:bCs/>
+              </w:rPr>
+            </w:pPr>
+            <w:r>
+              <w:rPr>
+                <w:b/>
+                <w:bCs/>
+              </w:rPr>
+              <w:t>Descrizione</w:t>
+            </w:r>
+          </w:p>
+        </w:tc>
+      </w:tr>
+      <w:tr>
+        <w:tc>
+          <w:tcPr>
+            <w:tcW w:w="4634" w:type="dxa"/>
+          </w:tcPr>
+          <w:p>
+            <w:pPr>
+              <w:spacing w:after="160" w:line="259" w:lineRule="auto"/>
+            </w:pPr>
+            <w:proofErr w:type="spellStart"/>
+            <w:r>
+              <w:t>showNotification</w:t>
+            </w:r>
+            <w:proofErr w:type="spellEnd"/>
+          </w:p>
+        </w:tc>
+        <w:tc>
+          <w:tcPr>
+            <w:tcW w:w="4634" w:type="dxa"/>
+          </w:tcPr>
+          <w:p>
+            <w:pPr>
+              <w:spacing w:after="160" w:line="259" w:lineRule="auto"/>
+            </w:pPr>
+            <w:r>
+              <w:t>Recupera le notifiche per l’utente corrente</w:t>
+            </w:r>
+          </w:p>
+        </w:tc>
+      </w:tr>
+      <w:tr>
+        <w:tc>
+          <w:tcPr>
+            <w:tcW w:w="4634" w:type="dxa"/>
+          </w:tcPr>
+          <w:p>
+            <w:proofErr w:type="spellStart"/>
+            <w:r>
+              <w:t>send</w:t>
+            </w:r>
+            <w:proofErr w:type="spellEnd"/>
+          </w:p>
+        </w:tc>
+        <w:tc>
+          <w:tcPr>
+            <w:tcW w:w="4634" w:type="dxa"/>
+          </w:tcPr>
+          <w:p>
+            <w:r>
+              <w:t xml:space="preserve">Permette di inviare notifiche verso un determinato ricevente. </w:t>
+            </w:r>
+          </w:p>
+        </w:tc>
+      </w:tr>
+    </w:tbl>
     <w:p/>
-    <w:p>
-      <w:pPr>
-        <w:rPr>
-          <w:lang w:val="en-GB"/>
-        </w:rPr>
-      </w:pPr>
-      <w:r>
-        <w:rPr>
-          <w:lang w:val="en-GB"/>
-        </w:rPr>
-        <w:t xml:space="preserve">User sub </w:t>
-      </w:r>
-      <w:r>
-        <w:sym w:font="Wingdings" w:char="F0E0"/>
-      </w:r>
-      <w:r>
-        <w:rPr>
-          <w:lang w:val="en-GB"/>
-        </w:rPr>
-        <w:t xml:space="preserve"> account, task, not</w:t>
-      </w:r>
-      <w:r>
-        <w:rPr>
-          <w:lang w:val="en-GB"/>
-        </w:rPr>
-        <w:t>ification</w:t>
-      </w:r>
-      <w:r>
-        <w:rPr>
-          <w:lang w:val="en-GB"/>
-        </w:rPr>
-        <w:t xml:space="preserve"> subsystem </w:t>
-      </w:r>
-      <w:r>
-        <w:sym w:font="Wingdings" w:char="F0E0"/>
-      </w:r>
-      <w:r>
-        <w:rPr>
-          <w:lang w:val="en-GB"/>
-        </w:rPr>
-        <w:t xml:space="preserve"> </w:t>
-      </w:r>
-      <w:r>
-        <w:rPr>
-          <w:lang w:val="en-GB"/>
-        </w:rPr>
-        <w:t>persistence ??</w:t>
-      </w:r>
-    </w:p>
+    <w:bookmarkEnd w:id="1"/>
+    <w:p/>
     <w:sectPr>
       <w:pgSz w:w="11906" w:h="16838"/>
       <w:pgMar w:top="1417" w:right="1134" w:bottom="1134" w:left="1134" w:header="708" w:footer="708" w:gutter="0"/>
@@ -2898,6 +4499,753 @@
     </w:lvl>
   </w:abstractNum>
   <w:abstractNum w:abstractNumId="1" w15:restartNumberingAfterBreak="0">
+    <w:nsid w:val="056A7293"/>
+    <w:multiLevelType w:val="multilevel"/>
+    <w:tmpl w:val="CAF24DCE"/>
+    <w:lvl w:ilvl="0">
+      <w:start w:val="1"/>
+      <w:numFmt w:val="decimal"/>
+      <w:lvlText w:val="%1."/>
+      <w:lvlJc w:val="left"/>
+      <w:pPr>
+        <w:ind w:left="720" w:hanging="360"/>
+      </w:pPr>
+      <w:rPr>
+        <w:rFonts w:hint="default"/>
+      </w:rPr>
+    </w:lvl>
+    <w:lvl w:ilvl="1">
+      <w:start w:val="1"/>
+      <w:numFmt w:val="decimal"/>
+      <w:isLgl/>
+      <w:lvlText w:val="%1.%2"/>
+      <w:lvlJc w:val="left"/>
+      <w:pPr>
+        <w:ind w:left="768" w:hanging="408"/>
+      </w:pPr>
+      <w:rPr>
+        <w:rFonts w:hint="default"/>
+      </w:rPr>
+    </w:lvl>
+    <w:lvl w:ilvl="2">
+      <w:start w:val="1"/>
+      <w:numFmt w:val="decimal"/>
+      <w:isLgl/>
+      <w:lvlText w:val="%1.%2.%3"/>
+      <w:lvlJc w:val="left"/>
+      <w:pPr>
+        <w:ind w:left="1080" w:hanging="720"/>
+      </w:pPr>
+      <w:rPr>
+        <w:rFonts w:hint="default"/>
+      </w:rPr>
+    </w:lvl>
+    <w:lvl w:ilvl="3">
+      <w:start w:val="1"/>
+      <w:numFmt w:val="decimal"/>
+      <w:isLgl/>
+      <w:lvlText w:val="%1.%2.%3.%4"/>
+      <w:lvlJc w:val="left"/>
+      <w:pPr>
+        <w:ind w:left="1080" w:hanging="720"/>
+      </w:pPr>
+      <w:rPr>
+        <w:rFonts w:hint="default"/>
+      </w:rPr>
+    </w:lvl>
+    <w:lvl w:ilvl="4">
+      <w:start w:val="1"/>
+      <w:numFmt w:val="decimal"/>
+      <w:isLgl/>
+      <w:lvlText w:val="%1.%2.%3.%4.%5"/>
+      <w:lvlJc w:val="left"/>
+      <w:pPr>
+        <w:ind w:left="1440" w:hanging="1080"/>
+      </w:pPr>
+      <w:rPr>
+        <w:rFonts w:hint="default"/>
+      </w:rPr>
+    </w:lvl>
+    <w:lvl w:ilvl="5">
+      <w:start w:val="1"/>
+      <w:numFmt w:val="decimal"/>
+      <w:isLgl/>
+      <w:lvlText w:val="%1.%2.%3.%4.%5.%6"/>
+      <w:lvlJc w:val="left"/>
+      <w:pPr>
+        <w:ind w:left="1440" w:hanging="1080"/>
+      </w:pPr>
+      <w:rPr>
+        <w:rFonts w:hint="default"/>
+      </w:rPr>
+    </w:lvl>
+    <w:lvl w:ilvl="6">
+      <w:start w:val="1"/>
+      <w:numFmt w:val="decimal"/>
+      <w:isLgl/>
+      <w:lvlText w:val="%1.%2.%3.%4.%5.%6.%7"/>
+      <w:lvlJc w:val="left"/>
+      <w:pPr>
+        <w:ind w:left="1800" w:hanging="1440"/>
+      </w:pPr>
+      <w:rPr>
+        <w:rFonts w:hint="default"/>
+      </w:rPr>
+    </w:lvl>
+    <w:lvl w:ilvl="7">
+      <w:start w:val="1"/>
+      <w:numFmt w:val="decimal"/>
+      <w:isLgl/>
+      <w:lvlText w:val="%1.%2.%3.%4.%5.%6.%7.%8"/>
+      <w:lvlJc w:val="left"/>
+      <w:pPr>
+        <w:ind w:left="1800" w:hanging="1440"/>
+      </w:pPr>
+      <w:rPr>
+        <w:rFonts w:hint="default"/>
+      </w:rPr>
+    </w:lvl>
+    <w:lvl w:ilvl="8">
+      <w:start w:val="1"/>
+      <w:numFmt w:val="decimal"/>
+      <w:isLgl/>
+      <w:lvlText w:val="%1.%2.%3.%4.%5.%6.%7.%8.%9"/>
+      <w:lvlJc w:val="left"/>
+      <w:pPr>
+        <w:ind w:left="2160" w:hanging="1800"/>
+      </w:pPr>
+      <w:rPr>
+        <w:rFonts w:hint="default"/>
+      </w:rPr>
+    </w:lvl>
+  </w:abstractNum>
+  <w:abstractNum w:abstractNumId="2" w15:restartNumberingAfterBreak="0">
+    <w:nsid w:val="0A5E79E6"/>
+    <w:multiLevelType w:val="hybridMultilevel"/>
+    <w:tmpl w:val="C23AD760"/>
+    <w:lvl w:ilvl="0" w:tplc="04100015">
+      <w:start w:val="1"/>
+      <w:numFmt w:val="upperLetter"/>
+      <w:lvlText w:val="%1."/>
+      <w:lvlJc w:val="left"/>
+      <w:pPr>
+        <w:ind w:left="720" w:hanging="360"/>
+      </w:pPr>
+      <w:rPr>
+        <w:rFonts w:hint="default"/>
+        <w:b/>
+      </w:rPr>
+    </w:lvl>
+    <w:lvl w:ilvl="1" w:tplc="04100019" w:tentative="1">
+      <w:start w:val="1"/>
+      <w:numFmt w:val="lowerLetter"/>
+      <w:lvlText w:val="%2."/>
+      <w:lvlJc w:val="left"/>
+      <w:pPr>
+        <w:ind w:left="1440" w:hanging="360"/>
+      </w:pPr>
+    </w:lvl>
+    <w:lvl w:ilvl="2" w:tplc="0410001B" w:tentative="1">
+      <w:start w:val="1"/>
+      <w:numFmt w:val="lowerRoman"/>
+      <w:lvlText w:val="%3."/>
+      <w:lvlJc w:val="right"/>
+      <w:pPr>
+        <w:ind w:left="2160" w:hanging="180"/>
+      </w:pPr>
+    </w:lvl>
+    <w:lvl w:ilvl="3" w:tplc="0410000F" w:tentative="1">
+      <w:start w:val="1"/>
+      <w:numFmt w:val="decimal"/>
+      <w:lvlText w:val="%4."/>
+      <w:lvlJc w:val="left"/>
+      <w:pPr>
+        <w:ind w:left="2880" w:hanging="360"/>
+      </w:pPr>
+    </w:lvl>
+    <w:lvl w:ilvl="4" w:tplc="04100019" w:tentative="1">
+      <w:start w:val="1"/>
+      <w:numFmt w:val="lowerLetter"/>
+      <w:lvlText w:val="%5."/>
+      <w:lvlJc w:val="left"/>
+      <w:pPr>
+        <w:ind w:left="3600" w:hanging="360"/>
+      </w:pPr>
+    </w:lvl>
+    <w:lvl w:ilvl="5" w:tplc="0410001B" w:tentative="1">
+      <w:start w:val="1"/>
+      <w:numFmt w:val="lowerRoman"/>
+      <w:lvlText w:val="%6."/>
+      <w:lvlJc w:val="right"/>
+      <w:pPr>
+        <w:ind w:left="4320" w:hanging="180"/>
+      </w:pPr>
+    </w:lvl>
+    <w:lvl w:ilvl="6" w:tplc="0410000F" w:tentative="1">
+      <w:start w:val="1"/>
+      <w:numFmt w:val="decimal"/>
+      <w:lvlText w:val="%7."/>
+      <w:lvlJc w:val="left"/>
+      <w:pPr>
+        <w:ind w:left="5040" w:hanging="360"/>
+      </w:pPr>
+    </w:lvl>
+    <w:lvl w:ilvl="7" w:tplc="04100019" w:tentative="1">
+      <w:start w:val="1"/>
+      <w:numFmt w:val="lowerLetter"/>
+      <w:lvlText w:val="%8."/>
+      <w:lvlJc w:val="left"/>
+      <w:pPr>
+        <w:ind w:left="5760" w:hanging="360"/>
+      </w:pPr>
+    </w:lvl>
+    <w:lvl w:ilvl="8" w:tplc="0410001B" w:tentative="1">
+      <w:start w:val="1"/>
+      <w:numFmt w:val="lowerRoman"/>
+      <w:lvlText w:val="%9."/>
+      <w:lvlJc w:val="right"/>
+      <w:pPr>
+        <w:ind w:left="6480" w:hanging="180"/>
+      </w:pPr>
+    </w:lvl>
+  </w:abstractNum>
+  <w:abstractNum w:abstractNumId="3" w15:restartNumberingAfterBreak="0">
+    <w:nsid w:val="19841664"/>
+    <w:multiLevelType w:val="multilevel"/>
+    <w:tmpl w:val="59964BEE"/>
+    <w:lvl w:ilvl="0">
+      <w:start w:val="1"/>
+      <w:numFmt w:val="bullet"/>
+      <w:lvlText w:val=""/>
+      <w:lvlJc w:val="left"/>
+      <w:pPr>
+        <w:tabs>
+          <w:tab w:val="num" w:pos="1068"/>
+        </w:tabs>
+        <w:ind w:left="1068" w:hanging="360"/>
+      </w:pPr>
+      <w:rPr>
+        <w:rFonts w:ascii="Symbol" w:hAnsi="Symbol" w:hint="default"/>
+        <w:sz w:val="20"/>
+      </w:rPr>
+    </w:lvl>
+    <w:lvl w:ilvl="1" w:tentative="1">
+      <w:start w:val="1"/>
+      <w:numFmt w:val="bullet"/>
+      <w:lvlText w:val="o"/>
+      <w:lvlJc w:val="left"/>
+      <w:pPr>
+        <w:tabs>
+          <w:tab w:val="num" w:pos="1788"/>
+        </w:tabs>
+        <w:ind w:left="1788" w:hanging="360"/>
+      </w:pPr>
+      <w:rPr>
+        <w:rFonts w:ascii="Courier New" w:hAnsi="Courier New" w:hint="default"/>
+        <w:sz w:val="20"/>
+      </w:rPr>
+    </w:lvl>
+    <w:lvl w:ilvl="2" w:tentative="1">
+      <w:start w:val="1"/>
+      <w:numFmt w:val="bullet"/>
+      <w:lvlText w:val=""/>
+      <w:lvlJc w:val="left"/>
+      <w:pPr>
+        <w:tabs>
+          <w:tab w:val="num" w:pos="2508"/>
+        </w:tabs>
+        <w:ind w:left="2508" w:hanging="360"/>
+      </w:pPr>
+      <w:rPr>
+        <w:rFonts w:ascii="Wingdings" w:hAnsi="Wingdings" w:hint="default"/>
+        <w:sz w:val="20"/>
+      </w:rPr>
+    </w:lvl>
+    <w:lvl w:ilvl="3" w:tentative="1">
+      <w:start w:val="1"/>
+      <w:numFmt w:val="bullet"/>
+      <w:lvlText w:val=""/>
+      <w:lvlJc w:val="left"/>
+      <w:pPr>
+        <w:tabs>
+          <w:tab w:val="num" w:pos="3228"/>
+        </w:tabs>
+        <w:ind w:left="3228" w:hanging="360"/>
+      </w:pPr>
+      <w:rPr>
+        <w:rFonts w:ascii="Wingdings" w:hAnsi="Wingdings" w:hint="default"/>
+        <w:sz w:val="20"/>
+      </w:rPr>
+    </w:lvl>
+    <w:lvl w:ilvl="4" w:tentative="1">
+      <w:start w:val="1"/>
+      <w:numFmt w:val="bullet"/>
+      <w:lvlText w:val=""/>
+      <w:lvlJc w:val="left"/>
+      <w:pPr>
+        <w:tabs>
+          <w:tab w:val="num" w:pos="3948"/>
+        </w:tabs>
+        <w:ind w:left="3948" w:hanging="360"/>
+      </w:pPr>
+      <w:rPr>
+        <w:rFonts w:ascii="Wingdings" w:hAnsi="Wingdings" w:hint="default"/>
+        <w:sz w:val="20"/>
+      </w:rPr>
+    </w:lvl>
+    <w:lvl w:ilvl="5" w:tentative="1">
+      <w:start w:val="1"/>
+      <w:numFmt w:val="bullet"/>
+      <w:lvlText w:val=""/>
+      <w:lvlJc w:val="left"/>
+      <w:pPr>
+        <w:tabs>
+          <w:tab w:val="num" w:pos="4668"/>
+        </w:tabs>
+        <w:ind w:left="4668" w:hanging="360"/>
+      </w:pPr>
+      <w:rPr>
+        <w:rFonts w:ascii="Wingdings" w:hAnsi="Wingdings" w:hint="default"/>
+        <w:sz w:val="20"/>
+      </w:rPr>
+    </w:lvl>
+    <w:lvl w:ilvl="6" w:tentative="1">
+      <w:start w:val="1"/>
+      <w:numFmt w:val="bullet"/>
+      <w:lvlText w:val=""/>
+      <w:lvlJc w:val="left"/>
+      <w:pPr>
+        <w:tabs>
+          <w:tab w:val="num" w:pos="5388"/>
+        </w:tabs>
+        <w:ind w:left="5388" w:hanging="360"/>
+      </w:pPr>
+      <w:rPr>
+        <w:rFonts w:ascii="Wingdings" w:hAnsi="Wingdings" w:hint="default"/>
+        <w:sz w:val="20"/>
+      </w:rPr>
+    </w:lvl>
+    <w:lvl w:ilvl="7" w:tentative="1">
+      <w:start w:val="1"/>
+      <w:numFmt w:val="bullet"/>
+      <w:lvlText w:val=""/>
+      <w:lvlJc w:val="left"/>
+      <w:pPr>
+        <w:tabs>
+          <w:tab w:val="num" w:pos="6108"/>
+        </w:tabs>
+        <w:ind w:left="6108" w:hanging="360"/>
+      </w:pPr>
+      <w:rPr>
+        <w:rFonts w:ascii="Wingdings" w:hAnsi="Wingdings" w:hint="default"/>
+        <w:sz w:val="20"/>
+      </w:rPr>
+    </w:lvl>
+    <w:lvl w:ilvl="8" w:tentative="1">
+      <w:start w:val="1"/>
+      <w:numFmt w:val="bullet"/>
+      <w:lvlText w:val=""/>
+      <w:lvlJc w:val="left"/>
+      <w:pPr>
+        <w:tabs>
+          <w:tab w:val="num" w:pos="6828"/>
+        </w:tabs>
+        <w:ind w:left="6828" w:hanging="360"/>
+      </w:pPr>
+      <w:rPr>
+        <w:rFonts w:ascii="Wingdings" w:hAnsi="Wingdings" w:hint="default"/>
+        <w:sz w:val="20"/>
+      </w:rPr>
+    </w:lvl>
+  </w:abstractNum>
+  <w:abstractNum w:abstractNumId="4" w15:restartNumberingAfterBreak="0">
+    <w:nsid w:val="1FA4185E"/>
+    <w:multiLevelType w:val="multilevel"/>
+    <w:tmpl w:val="FDC64334"/>
+    <w:lvl w:ilvl="0">
+      <w:start w:val="1"/>
+      <w:numFmt w:val="bullet"/>
+      <w:lvlText w:val=""/>
+      <w:lvlJc w:val="left"/>
+      <w:pPr>
+        <w:tabs>
+          <w:tab w:val="num" w:pos="1068"/>
+        </w:tabs>
+        <w:ind w:left="1068" w:hanging="360"/>
+      </w:pPr>
+      <w:rPr>
+        <w:rFonts w:ascii="Symbol" w:hAnsi="Symbol" w:hint="default"/>
+        <w:sz w:val="20"/>
+      </w:rPr>
+    </w:lvl>
+    <w:lvl w:ilvl="1" w:tentative="1">
+      <w:start w:val="1"/>
+      <w:numFmt w:val="bullet"/>
+      <w:lvlText w:val="o"/>
+      <w:lvlJc w:val="left"/>
+      <w:pPr>
+        <w:tabs>
+          <w:tab w:val="num" w:pos="1788"/>
+        </w:tabs>
+        <w:ind w:left="1788" w:hanging="360"/>
+      </w:pPr>
+      <w:rPr>
+        <w:rFonts w:ascii="Courier New" w:hAnsi="Courier New" w:hint="default"/>
+        <w:sz w:val="20"/>
+      </w:rPr>
+    </w:lvl>
+    <w:lvl w:ilvl="2" w:tentative="1">
+      <w:start w:val="1"/>
+      <w:numFmt w:val="bullet"/>
+      <w:lvlText w:val=""/>
+      <w:lvlJc w:val="left"/>
+      <w:pPr>
+        <w:tabs>
+          <w:tab w:val="num" w:pos="2508"/>
+        </w:tabs>
+        <w:ind w:left="2508" w:hanging="360"/>
+      </w:pPr>
+      <w:rPr>
+        <w:rFonts w:ascii="Wingdings" w:hAnsi="Wingdings" w:hint="default"/>
+        <w:sz w:val="20"/>
+      </w:rPr>
+    </w:lvl>
+    <w:lvl w:ilvl="3" w:tentative="1">
+      <w:start w:val="1"/>
+      <w:numFmt w:val="bullet"/>
+      <w:lvlText w:val=""/>
+      <w:lvlJc w:val="left"/>
+      <w:pPr>
+        <w:tabs>
+          <w:tab w:val="num" w:pos="3228"/>
+        </w:tabs>
+        <w:ind w:left="3228" w:hanging="360"/>
+      </w:pPr>
+      <w:rPr>
+        <w:rFonts w:ascii="Wingdings" w:hAnsi="Wingdings" w:hint="default"/>
+        <w:sz w:val="20"/>
+      </w:rPr>
+    </w:lvl>
+    <w:lvl w:ilvl="4" w:tentative="1">
+      <w:start w:val="1"/>
+      <w:numFmt w:val="bullet"/>
+      <w:lvlText w:val=""/>
+      <w:lvlJc w:val="left"/>
+      <w:pPr>
+        <w:tabs>
+          <w:tab w:val="num" w:pos="3948"/>
+        </w:tabs>
+        <w:ind w:left="3948" w:hanging="360"/>
+      </w:pPr>
+      <w:rPr>
+        <w:rFonts w:ascii="Wingdings" w:hAnsi="Wingdings" w:hint="default"/>
+        <w:sz w:val="20"/>
+      </w:rPr>
+    </w:lvl>
+    <w:lvl w:ilvl="5" w:tentative="1">
+      <w:start w:val="1"/>
+      <w:numFmt w:val="bullet"/>
+      <w:lvlText w:val=""/>
+      <w:lvlJc w:val="left"/>
+      <w:pPr>
+        <w:tabs>
+          <w:tab w:val="num" w:pos="4668"/>
+        </w:tabs>
+        <w:ind w:left="4668" w:hanging="360"/>
+      </w:pPr>
+      <w:rPr>
+        <w:rFonts w:ascii="Wingdings" w:hAnsi="Wingdings" w:hint="default"/>
+        <w:sz w:val="20"/>
+      </w:rPr>
+    </w:lvl>
+    <w:lvl w:ilvl="6" w:tentative="1">
+      <w:start w:val="1"/>
+      <w:numFmt w:val="bullet"/>
+      <w:lvlText w:val=""/>
+      <w:lvlJc w:val="left"/>
+      <w:pPr>
+        <w:tabs>
+          <w:tab w:val="num" w:pos="5388"/>
+        </w:tabs>
+        <w:ind w:left="5388" w:hanging="360"/>
+      </w:pPr>
+      <w:rPr>
+        <w:rFonts w:ascii="Wingdings" w:hAnsi="Wingdings" w:hint="default"/>
+        <w:sz w:val="20"/>
+      </w:rPr>
+    </w:lvl>
+    <w:lvl w:ilvl="7" w:tentative="1">
+      <w:start w:val="1"/>
+      <w:numFmt w:val="bullet"/>
+      <w:lvlText w:val=""/>
+      <w:lvlJc w:val="left"/>
+      <w:pPr>
+        <w:tabs>
+          <w:tab w:val="num" w:pos="6108"/>
+        </w:tabs>
+        <w:ind w:left="6108" w:hanging="360"/>
+      </w:pPr>
+      <w:rPr>
+        <w:rFonts w:ascii="Wingdings" w:hAnsi="Wingdings" w:hint="default"/>
+        <w:sz w:val="20"/>
+      </w:rPr>
+    </w:lvl>
+    <w:lvl w:ilvl="8" w:tentative="1">
+      <w:start w:val="1"/>
+      <w:numFmt w:val="bullet"/>
+      <w:lvlText w:val=""/>
+      <w:lvlJc w:val="left"/>
+      <w:pPr>
+        <w:tabs>
+          <w:tab w:val="num" w:pos="6828"/>
+        </w:tabs>
+        <w:ind w:left="6828" w:hanging="360"/>
+      </w:pPr>
+      <w:rPr>
+        <w:rFonts w:ascii="Wingdings" w:hAnsi="Wingdings" w:hint="default"/>
+        <w:sz w:val="20"/>
+      </w:rPr>
+    </w:lvl>
+  </w:abstractNum>
+  <w:abstractNum w:abstractNumId="5" w15:restartNumberingAfterBreak="0">
+    <w:nsid w:val="446E6407"/>
+    <w:multiLevelType w:val="hybridMultilevel"/>
+    <w:tmpl w:val="62EC5944"/>
+    <w:lvl w:ilvl="0" w:tplc="0410000F">
+      <w:start w:val="1"/>
+      <w:numFmt w:val="decimal"/>
+      <w:lvlText w:val="%1."/>
+      <w:lvlJc w:val="left"/>
+      <w:pPr>
+        <w:ind w:left="720" w:hanging="360"/>
+      </w:pPr>
+      <w:rPr>
+        <w:rFonts w:hint="default"/>
+      </w:rPr>
+    </w:lvl>
+    <w:lvl w:ilvl="1" w:tplc="04100019">
+      <w:start w:val="1"/>
+      <w:numFmt w:val="lowerLetter"/>
+      <w:lvlText w:val="%2."/>
+      <w:lvlJc w:val="left"/>
+      <w:pPr>
+        <w:ind w:left="1440" w:hanging="360"/>
+      </w:pPr>
+    </w:lvl>
+    <w:lvl w:ilvl="2" w:tplc="0410001B" w:tentative="1">
+      <w:start w:val="1"/>
+      <w:numFmt w:val="lowerRoman"/>
+      <w:lvlText w:val="%3."/>
+      <w:lvlJc w:val="right"/>
+      <w:pPr>
+        <w:ind w:left="2160" w:hanging="180"/>
+      </w:pPr>
+    </w:lvl>
+    <w:lvl w:ilvl="3" w:tplc="0410000F" w:tentative="1">
+      <w:start w:val="1"/>
+      <w:numFmt w:val="decimal"/>
+      <w:lvlText w:val="%4."/>
+      <w:lvlJc w:val="left"/>
+      <w:pPr>
+        <w:ind w:left="2880" w:hanging="360"/>
+      </w:pPr>
+    </w:lvl>
+    <w:lvl w:ilvl="4" w:tplc="04100019" w:tentative="1">
+      <w:start w:val="1"/>
+      <w:numFmt w:val="lowerLetter"/>
+      <w:lvlText w:val="%5."/>
+      <w:lvlJc w:val="left"/>
+      <w:pPr>
+        <w:ind w:left="3600" w:hanging="360"/>
+      </w:pPr>
+    </w:lvl>
+    <w:lvl w:ilvl="5" w:tplc="0410001B" w:tentative="1">
+      <w:start w:val="1"/>
+      <w:numFmt w:val="lowerRoman"/>
+      <w:lvlText w:val="%6."/>
+      <w:lvlJc w:val="right"/>
+      <w:pPr>
+        <w:ind w:left="4320" w:hanging="180"/>
+      </w:pPr>
+    </w:lvl>
+    <w:lvl w:ilvl="6" w:tplc="0410000F" w:tentative="1">
+      <w:start w:val="1"/>
+      <w:numFmt w:val="decimal"/>
+      <w:lvlText w:val="%7."/>
+      <w:lvlJc w:val="left"/>
+      <w:pPr>
+        <w:ind w:left="5040" w:hanging="360"/>
+      </w:pPr>
+    </w:lvl>
+    <w:lvl w:ilvl="7" w:tplc="04100019" w:tentative="1">
+      <w:start w:val="1"/>
+      <w:numFmt w:val="lowerLetter"/>
+      <w:lvlText w:val="%8."/>
+      <w:lvlJc w:val="left"/>
+      <w:pPr>
+        <w:ind w:left="5760" w:hanging="360"/>
+      </w:pPr>
+    </w:lvl>
+    <w:lvl w:ilvl="8" w:tplc="0410001B" w:tentative="1">
+      <w:start w:val="1"/>
+      <w:numFmt w:val="lowerRoman"/>
+      <w:lvlText w:val="%9."/>
+      <w:lvlJc w:val="right"/>
+      <w:pPr>
+        <w:ind w:left="6480" w:hanging="180"/>
+      </w:pPr>
+    </w:lvl>
+  </w:abstractNum>
+  <w:abstractNum w:abstractNumId="6" w15:restartNumberingAfterBreak="0">
+    <w:nsid w:val="4D3F2381"/>
+    <w:multiLevelType w:val="multilevel"/>
+    <w:tmpl w:val="9552FE30"/>
+    <w:lvl w:ilvl="0">
+      <w:start w:val="1"/>
+      <w:numFmt w:val="bullet"/>
+      <w:lvlText w:val=""/>
+      <w:lvlJc w:val="left"/>
+      <w:pPr>
+        <w:tabs>
+          <w:tab w:val="num" w:pos="1068"/>
+        </w:tabs>
+        <w:ind w:left="1068" w:hanging="360"/>
+      </w:pPr>
+      <w:rPr>
+        <w:rFonts w:ascii="Symbol" w:hAnsi="Symbol" w:hint="default"/>
+        <w:sz w:val="20"/>
+      </w:rPr>
+    </w:lvl>
+    <w:lvl w:ilvl="1" w:tentative="1">
+      <w:start w:val="1"/>
+      <w:numFmt w:val="bullet"/>
+      <w:lvlText w:val="o"/>
+      <w:lvlJc w:val="left"/>
+      <w:pPr>
+        <w:tabs>
+          <w:tab w:val="num" w:pos="1788"/>
+        </w:tabs>
+        <w:ind w:left="1788" w:hanging="360"/>
+      </w:pPr>
+      <w:rPr>
+        <w:rFonts w:ascii="Courier New" w:hAnsi="Courier New" w:hint="default"/>
+        <w:sz w:val="20"/>
+      </w:rPr>
+    </w:lvl>
+    <w:lvl w:ilvl="2" w:tentative="1">
+      <w:start w:val="1"/>
+      <w:numFmt w:val="bullet"/>
+      <w:lvlText w:val=""/>
+      <w:lvlJc w:val="left"/>
+      <w:pPr>
+        <w:tabs>
+          <w:tab w:val="num" w:pos="2508"/>
+        </w:tabs>
+        <w:ind w:left="2508" w:hanging="360"/>
+      </w:pPr>
+      <w:rPr>
+        <w:rFonts w:ascii="Wingdings" w:hAnsi="Wingdings" w:hint="default"/>
+        <w:sz w:val="20"/>
+      </w:rPr>
+    </w:lvl>
+    <w:lvl w:ilvl="3" w:tentative="1">
+      <w:start w:val="1"/>
+      <w:numFmt w:val="bullet"/>
+      <w:lvlText w:val=""/>
+      <w:lvlJc w:val="left"/>
+      <w:pPr>
+        <w:tabs>
+          <w:tab w:val="num" w:pos="3228"/>
+        </w:tabs>
+        <w:ind w:left="3228" w:hanging="360"/>
+      </w:pPr>
+      <w:rPr>
+        <w:rFonts w:ascii="Wingdings" w:hAnsi="Wingdings" w:hint="default"/>
+        <w:sz w:val="20"/>
+      </w:rPr>
+    </w:lvl>
+    <w:lvl w:ilvl="4" w:tentative="1">
+      <w:start w:val="1"/>
+      <w:numFmt w:val="bullet"/>
+      <w:lvlText w:val=""/>
+      <w:lvlJc w:val="left"/>
+      <w:pPr>
+        <w:tabs>
+          <w:tab w:val="num" w:pos="3948"/>
+        </w:tabs>
+        <w:ind w:left="3948" w:hanging="360"/>
+      </w:pPr>
+      <w:rPr>
+        <w:rFonts w:ascii="Wingdings" w:hAnsi="Wingdings" w:hint="default"/>
+        <w:sz w:val="20"/>
+      </w:rPr>
+    </w:lvl>
+    <w:lvl w:ilvl="5" w:tentative="1">
+      <w:start w:val="1"/>
+      <w:numFmt w:val="bullet"/>
+      <w:lvlText w:val=""/>
+      <w:lvlJc w:val="left"/>
+      <w:pPr>
+        <w:tabs>
+          <w:tab w:val="num" w:pos="4668"/>
+        </w:tabs>
+        <w:ind w:left="4668" w:hanging="360"/>
+      </w:pPr>
+      <w:rPr>
+        <w:rFonts w:ascii="Wingdings" w:hAnsi="Wingdings" w:hint="default"/>
+        <w:sz w:val="20"/>
+      </w:rPr>
+    </w:lvl>
+    <w:lvl w:ilvl="6" w:tentative="1">
+      <w:start w:val="1"/>
+      <w:numFmt w:val="bullet"/>
+      <w:lvlText w:val=""/>
+      <w:lvlJc w:val="left"/>
+      <w:pPr>
+        <w:tabs>
+          <w:tab w:val="num" w:pos="5388"/>
+        </w:tabs>
+        <w:ind w:left="5388" w:hanging="360"/>
+      </w:pPr>
+      <w:rPr>
+        <w:rFonts w:ascii="Wingdings" w:hAnsi="Wingdings" w:hint="default"/>
+        <w:sz w:val="20"/>
+      </w:rPr>
+    </w:lvl>
+    <w:lvl w:ilvl="7" w:tentative="1">
+      <w:start w:val="1"/>
+      <w:numFmt w:val="bullet"/>
+      <w:lvlText w:val=""/>
+      <w:lvlJc w:val="left"/>
+      <w:pPr>
+        <w:tabs>
+          <w:tab w:val="num" w:pos="6108"/>
+        </w:tabs>
+        <w:ind w:left="6108" w:hanging="360"/>
+      </w:pPr>
+      <w:rPr>
+        <w:rFonts w:ascii="Wingdings" w:hAnsi="Wingdings" w:hint="default"/>
+        <w:sz w:val="20"/>
+      </w:rPr>
+    </w:lvl>
+    <w:lvl w:ilvl="8" w:tentative="1">
+      <w:start w:val="1"/>
+      <w:numFmt w:val="bullet"/>
+      <w:lvlText w:val=""/>
+      <w:lvlJc w:val="left"/>
+      <w:pPr>
+        <w:tabs>
+          <w:tab w:val="num" w:pos="6828"/>
+        </w:tabs>
+        <w:ind w:left="6828" w:hanging="360"/>
+      </w:pPr>
+      <w:rPr>
+        <w:rFonts w:ascii="Wingdings" w:hAnsi="Wingdings" w:hint="default"/>
+        <w:sz w:val="20"/>
+      </w:rPr>
+    </w:lvl>
+  </w:abstractNum>
+  <w:abstractNum w:abstractNumId="7" w15:restartNumberingAfterBreak="0">
     <w:nsid w:val="4E3D350D"/>
     <w:multiLevelType w:val="hybridMultilevel"/>
     <w:tmpl w:val="C1403E7E"/>
@@ -2983,96 +5331,600 @@
       </w:pPr>
     </w:lvl>
   </w:abstractNum>
-  <w:abstractNum w:abstractNumId="2" w15:restartNumberingAfterBreak="0">
-    <w:nsid w:val="799D4F2B"/>
-    <w:multiLevelType w:val="hybridMultilevel"/>
-    <w:tmpl w:val="0672907A"/>
-    <w:lvl w:ilvl="0" w:tplc="0410000F">
+  <w:abstractNum w:abstractNumId="8" w15:restartNumberingAfterBreak="0">
+    <w:nsid w:val="52845CB1"/>
+    <w:multiLevelType w:val="multilevel"/>
+    <w:tmpl w:val="6E623446"/>
+    <w:lvl w:ilvl="0">
       <w:start w:val="1"/>
       <w:numFmt w:val="decimal"/>
       <w:lvlText w:val="%1."/>
       <w:lvlJc w:val="left"/>
       <w:pPr>
+        <w:tabs>
+          <w:tab w:val="num" w:pos="720"/>
+        </w:tabs>
         <w:ind w:left="720" w:hanging="360"/>
       </w:pPr>
-      <w:rPr>
-        <w:rFonts w:hint="default"/>
-      </w:rPr>
-    </w:lvl>
-    <w:lvl w:ilvl="1" w:tplc="04100019" w:tentative="1">
-      <w:start w:val="1"/>
-      <w:numFmt w:val="lowerLetter"/>
-      <w:lvlText w:val="%2."/>
-      <w:lvlJc w:val="left"/>
-      <w:pPr>
+    </w:lvl>
+    <w:lvl w:ilvl="1">
+      <w:start w:val="1"/>
+      <w:numFmt w:val="bullet"/>
+      <w:lvlText w:val="o"/>
+      <w:lvlJc w:val="left"/>
+      <w:pPr>
+        <w:tabs>
+          <w:tab w:val="num" w:pos="1440"/>
+        </w:tabs>
         <w:ind w:left="1440" w:hanging="360"/>
       </w:pPr>
-    </w:lvl>
-    <w:lvl w:ilvl="2" w:tplc="0410001B" w:tentative="1">
-      <w:start w:val="1"/>
-      <w:numFmt w:val="lowerRoman"/>
+      <w:rPr>
+        <w:rFonts w:ascii="Courier New" w:hAnsi="Courier New" w:hint="default"/>
+        <w:sz w:val="20"/>
+      </w:rPr>
+    </w:lvl>
+    <w:lvl w:ilvl="2" w:tentative="1">
+      <w:start w:val="1"/>
+      <w:numFmt w:val="decimal"/>
       <w:lvlText w:val="%3."/>
-      <w:lvlJc w:val="right"/>
-      <w:pPr>
-        <w:ind w:left="2160" w:hanging="180"/>
-      </w:pPr>
-    </w:lvl>
-    <w:lvl w:ilvl="3" w:tplc="0410000F" w:tentative="1">
+      <w:lvlJc w:val="left"/>
+      <w:pPr>
+        <w:tabs>
+          <w:tab w:val="num" w:pos="2160"/>
+        </w:tabs>
+        <w:ind w:left="2160" w:hanging="360"/>
+      </w:pPr>
+    </w:lvl>
+    <w:lvl w:ilvl="3" w:tentative="1">
       <w:start w:val="1"/>
       <w:numFmt w:val="decimal"/>
       <w:lvlText w:val="%4."/>
       <w:lvlJc w:val="left"/>
       <w:pPr>
+        <w:tabs>
+          <w:tab w:val="num" w:pos="2880"/>
+        </w:tabs>
         <w:ind w:left="2880" w:hanging="360"/>
       </w:pPr>
     </w:lvl>
-    <w:lvl w:ilvl="4" w:tplc="04100019" w:tentative="1">
-      <w:start w:val="1"/>
-      <w:numFmt w:val="lowerLetter"/>
+    <w:lvl w:ilvl="4" w:tentative="1">
+      <w:start w:val="1"/>
+      <w:numFmt w:val="decimal"/>
       <w:lvlText w:val="%5."/>
       <w:lvlJc w:val="left"/>
       <w:pPr>
+        <w:tabs>
+          <w:tab w:val="num" w:pos="3600"/>
+        </w:tabs>
         <w:ind w:left="3600" w:hanging="360"/>
       </w:pPr>
     </w:lvl>
-    <w:lvl w:ilvl="5" w:tplc="0410001B" w:tentative="1">
-      <w:start w:val="1"/>
-      <w:numFmt w:val="lowerRoman"/>
+    <w:lvl w:ilvl="5" w:tentative="1">
+      <w:start w:val="1"/>
+      <w:numFmt w:val="decimal"/>
       <w:lvlText w:val="%6."/>
-      <w:lvlJc w:val="right"/>
-      <w:pPr>
-        <w:ind w:left="4320" w:hanging="180"/>
-      </w:pPr>
-    </w:lvl>
-    <w:lvl w:ilvl="6" w:tplc="0410000F" w:tentative="1">
+      <w:lvlJc w:val="left"/>
+      <w:pPr>
+        <w:tabs>
+          <w:tab w:val="num" w:pos="4320"/>
+        </w:tabs>
+        <w:ind w:left="4320" w:hanging="360"/>
+      </w:pPr>
+    </w:lvl>
+    <w:lvl w:ilvl="6" w:tentative="1">
       <w:start w:val="1"/>
       <w:numFmt w:val="decimal"/>
       <w:lvlText w:val="%7."/>
       <w:lvlJc w:val="left"/>
       <w:pPr>
+        <w:tabs>
+          <w:tab w:val="num" w:pos="5040"/>
+        </w:tabs>
         <w:ind w:left="5040" w:hanging="360"/>
       </w:pPr>
     </w:lvl>
-    <w:lvl w:ilvl="7" w:tplc="04100019" w:tentative="1">
-      <w:start w:val="1"/>
-      <w:numFmt w:val="lowerLetter"/>
+    <w:lvl w:ilvl="7" w:tentative="1">
+      <w:start w:val="1"/>
+      <w:numFmt w:val="decimal"/>
       <w:lvlText w:val="%8."/>
       <w:lvlJc w:val="left"/>
       <w:pPr>
+        <w:tabs>
+          <w:tab w:val="num" w:pos="5760"/>
+        </w:tabs>
         <w:ind w:left="5760" w:hanging="360"/>
       </w:pPr>
     </w:lvl>
-    <w:lvl w:ilvl="8" w:tplc="0410001B" w:tentative="1">
-      <w:start w:val="1"/>
-      <w:numFmt w:val="lowerRoman"/>
+    <w:lvl w:ilvl="8" w:tentative="1">
+      <w:start w:val="1"/>
+      <w:numFmt w:val="decimal"/>
       <w:lvlText w:val="%9."/>
-      <w:lvlJc w:val="right"/>
-      <w:pPr>
-        <w:ind w:left="6480" w:hanging="180"/>
+      <w:lvlJc w:val="left"/>
+      <w:pPr>
+        <w:tabs>
+          <w:tab w:val="num" w:pos="6480"/>
+        </w:tabs>
+        <w:ind w:left="6480" w:hanging="360"/>
       </w:pPr>
     </w:lvl>
   </w:abstractNum>
-  <w:abstractNum w:abstractNumId="3" w15:restartNumberingAfterBreak="0">
+  <w:abstractNum w:abstractNumId="9" w15:restartNumberingAfterBreak="0">
+    <w:nsid w:val="53047F6B"/>
+    <w:multiLevelType w:val="multilevel"/>
+    <w:tmpl w:val="CAF24DCE"/>
+    <w:lvl w:ilvl="0">
+      <w:start w:val="1"/>
+      <w:numFmt w:val="decimal"/>
+      <w:lvlText w:val="%1."/>
+      <w:lvlJc w:val="left"/>
+      <w:pPr>
+        <w:ind w:left="720" w:hanging="360"/>
+      </w:pPr>
+      <w:rPr>
+        <w:rFonts w:hint="default"/>
+      </w:rPr>
+    </w:lvl>
+    <w:lvl w:ilvl="1">
+      <w:start w:val="1"/>
+      <w:numFmt w:val="decimal"/>
+      <w:isLgl/>
+      <w:lvlText w:val="%1.%2"/>
+      <w:lvlJc w:val="left"/>
+      <w:pPr>
+        <w:ind w:left="768" w:hanging="408"/>
+      </w:pPr>
+      <w:rPr>
+        <w:rFonts w:hint="default"/>
+      </w:rPr>
+    </w:lvl>
+    <w:lvl w:ilvl="2">
+      <w:start w:val="1"/>
+      <w:numFmt w:val="decimal"/>
+      <w:isLgl/>
+      <w:lvlText w:val="%1.%2.%3"/>
+      <w:lvlJc w:val="left"/>
+      <w:pPr>
+        <w:ind w:left="1080" w:hanging="720"/>
+      </w:pPr>
+      <w:rPr>
+        <w:rFonts w:hint="default"/>
+      </w:rPr>
+    </w:lvl>
+    <w:lvl w:ilvl="3">
+      <w:start w:val="1"/>
+      <w:numFmt w:val="decimal"/>
+      <w:isLgl/>
+      <w:lvlText w:val="%1.%2.%3.%4"/>
+      <w:lvlJc w:val="left"/>
+      <w:pPr>
+        <w:ind w:left="1080" w:hanging="720"/>
+      </w:pPr>
+      <w:rPr>
+        <w:rFonts w:hint="default"/>
+      </w:rPr>
+    </w:lvl>
+    <w:lvl w:ilvl="4">
+      <w:start w:val="1"/>
+      <w:numFmt w:val="decimal"/>
+      <w:isLgl/>
+      <w:lvlText w:val="%1.%2.%3.%4.%5"/>
+      <w:lvlJc w:val="left"/>
+      <w:pPr>
+        <w:ind w:left="1440" w:hanging="1080"/>
+      </w:pPr>
+      <w:rPr>
+        <w:rFonts w:hint="default"/>
+      </w:rPr>
+    </w:lvl>
+    <w:lvl w:ilvl="5">
+      <w:start w:val="1"/>
+      <w:numFmt w:val="decimal"/>
+      <w:isLgl/>
+      <w:lvlText w:val="%1.%2.%3.%4.%5.%6"/>
+      <w:lvlJc w:val="left"/>
+      <w:pPr>
+        <w:ind w:left="1440" w:hanging="1080"/>
+      </w:pPr>
+      <w:rPr>
+        <w:rFonts w:hint="default"/>
+      </w:rPr>
+    </w:lvl>
+    <w:lvl w:ilvl="6">
+      <w:start w:val="1"/>
+      <w:numFmt w:val="decimal"/>
+      <w:isLgl/>
+      <w:lvlText w:val="%1.%2.%3.%4.%5.%6.%7"/>
+      <w:lvlJc w:val="left"/>
+      <w:pPr>
+        <w:ind w:left="1800" w:hanging="1440"/>
+      </w:pPr>
+      <w:rPr>
+        <w:rFonts w:hint="default"/>
+      </w:rPr>
+    </w:lvl>
+    <w:lvl w:ilvl="7">
+      <w:start w:val="1"/>
+      <w:numFmt w:val="decimal"/>
+      <w:isLgl/>
+      <w:lvlText w:val="%1.%2.%3.%4.%5.%6.%7.%8"/>
+      <w:lvlJc w:val="left"/>
+      <w:pPr>
+        <w:ind w:left="1800" w:hanging="1440"/>
+      </w:pPr>
+      <w:rPr>
+        <w:rFonts w:hint="default"/>
+      </w:rPr>
+    </w:lvl>
+    <w:lvl w:ilvl="8">
+      <w:start w:val="1"/>
+      <w:numFmt w:val="decimal"/>
+      <w:isLgl/>
+      <w:lvlText w:val="%1.%2.%3.%4.%5.%6.%7.%8.%9"/>
+      <w:lvlJc w:val="left"/>
+      <w:pPr>
+        <w:ind w:left="2160" w:hanging="1800"/>
+      </w:pPr>
+      <w:rPr>
+        <w:rFonts w:hint="default"/>
+      </w:rPr>
+    </w:lvl>
+  </w:abstractNum>
+  <w:abstractNum w:abstractNumId="10" w15:restartNumberingAfterBreak="0">
+    <w:nsid w:val="652224E1"/>
+    <w:multiLevelType w:val="multilevel"/>
+    <w:tmpl w:val="CAF24DCE"/>
+    <w:lvl w:ilvl="0">
+      <w:start w:val="1"/>
+      <w:numFmt w:val="decimal"/>
+      <w:lvlText w:val="%1."/>
+      <w:lvlJc w:val="left"/>
+      <w:pPr>
+        <w:ind w:left="720" w:hanging="360"/>
+      </w:pPr>
+      <w:rPr>
+        <w:rFonts w:hint="default"/>
+      </w:rPr>
+    </w:lvl>
+    <w:lvl w:ilvl="1">
+      <w:start w:val="1"/>
+      <w:numFmt w:val="decimal"/>
+      <w:isLgl/>
+      <w:lvlText w:val="%1.%2"/>
+      <w:lvlJc w:val="left"/>
+      <w:pPr>
+        <w:ind w:left="768" w:hanging="408"/>
+      </w:pPr>
+      <w:rPr>
+        <w:rFonts w:hint="default"/>
+      </w:rPr>
+    </w:lvl>
+    <w:lvl w:ilvl="2">
+      <w:start w:val="1"/>
+      <w:numFmt w:val="decimal"/>
+      <w:isLgl/>
+      <w:lvlText w:val="%1.%2.%3"/>
+      <w:lvlJc w:val="left"/>
+      <w:pPr>
+        <w:ind w:left="1080" w:hanging="720"/>
+      </w:pPr>
+      <w:rPr>
+        <w:rFonts w:hint="default"/>
+      </w:rPr>
+    </w:lvl>
+    <w:lvl w:ilvl="3">
+      <w:start w:val="1"/>
+      <w:numFmt w:val="decimal"/>
+      <w:isLgl/>
+      <w:lvlText w:val="%1.%2.%3.%4"/>
+      <w:lvlJc w:val="left"/>
+      <w:pPr>
+        <w:ind w:left="1080" w:hanging="720"/>
+      </w:pPr>
+      <w:rPr>
+        <w:rFonts w:hint="default"/>
+      </w:rPr>
+    </w:lvl>
+    <w:lvl w:ilvl="4">
+      <w:start w:val="1"/>
+      <w:numFmt w:val="decimal"/>
+      <w:isLgl/>
+      <w:lvlText w:val="%1.%2.%3.%4.%5"/>
+      <w:lvlJc w:val="left"/>
+      <w:pPr>
+        <w:ind w:left="1440" w:hanging="1080"/>
+      </w:pPr>
+      <w:rPr>
+        <w:rFonts w:hint="default"/>
+      </w:rPr>
+    </w:lvl>
+    <w:lvl w:ilvl="5">
+      <w:start w:val="1"/>
+      <w:numFmt w:val="decimal"/>
+      <w:isLgl/>
+      <w:lvlText w:val="%1.%2.%3.%4.%5.%6"/>
+      <w:lvlJc w:val="left"/>
+      <w:pPr>
+        <w:ind w:left="1440" w:hanging="1080"/>
+      </w:pPr>
+      <w:rPr>
+        <w:rFonts w:hint="default"/>
+      </w:rPr>
+    </w:lvl>
+    <w:lvl w:ilvl="6">
+      <w:start w:val="1"/>
+      <w:numFmt w:val="decimal"/>
+      <w:isLgl/>
+      <w:lvlText w:val="%1.%2.%3.%4.%5.%6.%7"/>
+      <w:lvlJc w:val="left"/>
+      <w:pPr>
+        <w:ind w:left="1800" w:hanging="1440"/>
+      </w:pPr>
+      <w:rPr>
+        <w:rFonts w:hint="default"/>
+      </w:rPr>
+    </w:lvl>
+    <w:lvl w:ilvl="7">
+      <w:start w:val="1"/>
+      <w:numFmt w:val="decimal"/>
+      <w:isLgl/>
+      <w:lvlText w:val="%1.%2.%3.%4.%5.%6.%7.%8"/>
+      <w:lvlJc w:val="left"/>
+      <w:pPr>
+        <w:ind w:left="1800" w:hanging="1440"/>
+      </w:pPr>
+      <w:rPr>
+        <w:rFonts w:hint="default"/>
+      </w:rPr>
+    </w:lvl>
+    <w:lvl w:ilvl="8">
+      <w:start w:val="1"/>
+      <w:numFmt w:val="decimal"/>
+      <w:isLgl/>
+      <w:lvlText w:val="%1.%2.%3.%4.%5.%6.%7.%8.%9"/>
+      <w:lvlJc w:val="left"/>
+      <w:pPr>
+        <w:ind w:left="2160" w:hanging="1800"/>
+      </w:pPr>
+      <w:rPr>
+        <w:rFonts w:hint="default"/>
+      </w:rPr>
+    </w:lvl>
+  </w:abstractNum>
+  <w:abstractNum w:abstractNumId="11" w15:restartNumberingAfterBreak="0">
+    <w:nsid w:val="799D4F2B"/>
+    <w:multiLevelType w:val="multilevel"/>
+    <w:tmpl w:val="CAF24DCE"/>
+    <w:lvl w:ilvl="0">
+      <w:start w:val="1"/>
+      <w:numFmt w:val="decimal"/>
+      <w:lvlText w:val="%1."/>
+      <w:lvlJc w:val="left"/>
+      <w:pPr>
+        <w:ind w:left="720" w:hanging="360"/>
+      </w:pPr>
+      <w:rPr>
+        <w:rFonts w:hint="default"/>
+      </w:rPr>
+    </w:lvl>
+    <w:lvl w:ilvl="1">
+      <w:start w:val="1"/>
+      <w:numFmt w:val="decimal"/>
+      <w:isLgl/>
+      <w:lvlText w:val="%1.%2"/>
+      <w:lvlJc w:val="left"/>
+      <w:pPr>
+        <w:ind w:left="768" w:hanging="408"/>
+      </w:pPr>
+      <w:rPr>
+        <w:rFonts w:hint="default"/>
+      </w:rPr>
+    </w:lvl>
+    <w:lvl w:ilvl="2">
+      <w:start w:val="1"/>
+      <w:numFmt w:val="decimal"/>
+      <w:isLgl/>
+      <w:lvlText w:val="%1.%2.%3"/>
+      <w:lvlJc w:val="left"/>
+      <w:pPr>
+        <w:ind w:left="1080" w:hanging="720"/>
+      </w:pPr>
+      <w:rPr>
+        <w:rFonts w:hint="default"/>
+      </w:rPr>
+    </w:lvl>
+    <w:lvl w:ilvl="3">
+      <w:start w:val="1"/>
+      <w:numFmt w:val="decimal"/>
+      <w:isLgl/>
+      <w:lvlText w:val="%1.%2.%3.%4"/>
+      <w:lvlJc w:val="left"/>
+      <w:pPr>
+        <w:ind w:left="1080" w:hanging="720"/>
+      </w:pPr>
+      <w:rPr>
+        <w:rFonts w:hint="default"/>
+      </w:rPr>
+    </w:lvl>
+    <w:lvl w:ilvl="4">
+      <w:start w:val="1"/>
+      <w:numFmt w:val="decimal"/>
+      <w:isLgl/>
+      <w:lvlText w:val="%1.%2.%3.%4.%5"/>
+      <w:lvlJc w:val="left"/>
+      <w:pPr>
+        <w:ind w:left="1440" w:hanging="1080"/>
+      </w:pPr>
+      <w:rPr>
+        <w:rFonts w:hint="default"/>
+      </w:rPr>
+    </w:lvl>
+    <w:lvl w:ilvl="5">
+      <w:start w:val="1"/>
+      <w:numFmt w:val="decimal"/>
+      <w:isLgl/>
+      <w:lvlText w:val="%1.%2.%3.%4.%5.%6"/>
+      <w:lvlJc w:val="left"/>
+      <w:pPr>
+        <w:ind w:left="1440" w:hanging="1080"/>
+      </w:pPr>
+      <w:rPr>
+        <w:rFonts w:hint="default"/>
+      </w:rPr>
+    </w:lvl>
+    <w:lvl w:ilvl="6">
+      <w:start w:val="1"/>
+      <w:numFmt w:val="decimal"/>
+      <w:isLgl/>
+      <w:lvlText w:val="%1.%2.%3.%4.%5.%6.%7"/>
+      <w:lvlJc w:val="left"/>
+      <w:pPr>
+        <w:ind w:left="1800" w:hanging="1440"/>
+      </w:pPr>
+      <w:rPr>
+        <w:rFonts w:hint="default"/>
+      </w:rPr>
+    </w:lvl>
+    <w:lvl w:ilvl="7">
+      <w:start w:val="1"/>
+      <w:numFmt w:val="decimal"/>
+      <w:isLgl/>
+      <w:lvlText w:val="%1.%2.%3.%4.%5.%6.%7.%8"/>
+      <w:lvlJc w:val="left"/>
+      <w:pPr>
+        <w:ind w:left="1800" w:hanging="1440"/>
+      </w:pPr>
+      <w:rPr>
+        <w:rFonts w:hint="default"/>
+      </w:rPr>
+    </w:lvl>
+    <w:lvl w:ilvl="8">
+      <w:start w:val="1"/>
+      <w:numFmt w:val="decimal"/>
+      <w:isLgl/>
+      <w:lvlText w:val="%1.%2.%3.%4.%5.%6.%7.%8.%9"/>
+      <w:lvlJc w:val="left"/>
+      <w:pPr>
+        <w:ind w:left="2160" w:hanging="1800"/>
+      </w:pPr>
+      <w:rPr>
+        <w:rFonts w:hint="default"/>
+      </w:rPr>
+    </w:lvl>
+  </w:abstractNum>
+  <w:abstractNum w:abstractNumId="12" w15:restartNumberingAfterBreak="0">
+    <w:nsid w:val="7B9146AF"/>
+    <w:multiLevelType w:val="multilevel"/>
+    <w:tmpl w:val="C71ACC46"/>
+    <w:lvl w:ilvl="0">
+      <w:start w:val="1"/>
+      <w:numFmt w:val="decimal"/>
+      <w:lvlText w:val="%1."/>
+      <w:lvlJc w:val="left"/>
+      <w:pPr>
+        <w:tabs>
+          <w:tab w:val="num" w:pos="720"/>
+        </w:tabs>
+        <w:ind w:left="720" w:hanging="360"/>
+      </w:pPr>
+    </w:lvl>
+    <w:lvl w:ilvl="1" w:tentative="1">
+      <w:start w:val="1"/>
+      <w:numFmt w:val="decimal"/>
+      <w:lvlText w:val="%2."/>
+      <w:lvlJc w:val="left"/>
+      <w:pPr>
+        <w:tabs>
+          <w:tab w:val="num" w:pos="1440"/>
+        </w:tabs>
+        <w:ind w:left="1440" w:hanging="360"/>
+      </w:pPr>
+    </w:lvl>
+    <w:lvl w:ilvl="2" w:tentative="1">
+      <w:start w:val="1"/>
+      <w:numFmt w:val="decimal"/>
+      <w:lvlText w:val="%3."/>
+      <w:lvlJc w:val="left"/>
+      <w:pPr>
+        <w:tabs>
+          <w:tab w:val="num" w:pos="2160"/>
+        </w:tabs>
+        <w:ind w:left="2160" w:hanging="360"/>
+      </w:pPr>
+    </w:lvl>
+    <w:lvl w:ilvl="3" w:tentative="1">
+      <w:start w:val="1"/>
+      <w:numFmt w:val="decimal"/>
+      <w:lvlText w:val="%4."/>
+      <w:lvlJc w:val="left"/>
+      <w:pPr>
+        <w:tabs>
+          <w:tab w:val="num" w:pos="2880"/>
+        </w:tabs>
+        <w:ind w:left="2880" w:hanging="360"/>
+      </w:pPr>
+    </w:lvl>
+    <w:lvl w:ilvl="4" w:tentative="1">
+      <w:start w:val="1"/>
+      <w:numFmt w:val="decimal"/>
+      <w:lvlText w:val="%5."/>
+      <w:lvlJc w:val="left"/>
+      <w:pPr>
+        <w:tabs>
+          <w:tab w:val="num" w:pos="3600"/>
+        </w:tabs>
+        <w:ind w:left="3600" w:hanging="360"/>
+      </w:pPr>
+    </w:lvl>
+    <w:lvl w:ilvl="5" w:tentative="1">
+      <w:start w:val="1"/>
+      <w:numFmt w:val="decimal"/>
+      <w:lvlText w:val="%6."/>
+      <w:lvlJc w:val="left"/>
+      <w:pPr>
+        <w:tabs>
+          <w:tab w:val="num" w:pos="4320"/>
+        </w:tabs>
+        <w:ind w:left="4320" w:hanging="360"/>
+      </w:pPr>
+    </w:lvl>
+    <w:lvl w:ilvl="6" w:tentative="1">
+      <w:start w:val="1"/>
+      <w:numFmt w:val="decimal"/>
+      <w:lvlText w:val="%7."/>
+      <w:lvlJc w:val="left"/>
+      <w:pPr>
+        <w:tabs>
+          <w:tab w:val="num" w:pos="5040"/>
+        </w:tabs>
+        <w:ind w:left="5040" w:hanging="360"/>
+      </w:pPr>
+    </w:lvl>
+    <w:lvl w:ilvl="7" w:tentative="1">
+      <w:start w:val="1"/>
+      <w:numFmt w:val="decimal"/>
+      <w:lvlText w:val="%8."/>
+      <w:lvlJc w:val="left"/>
+      <w:pPr>
+        <w:tabs>
+          <w:tab w:val="num" w:pos="5760"/>
+        </w:tabs>
+        <w:ind w:left="5760" w:hanging="360"/>
+      </w:pPr>
+    </w:lvl>
+    <w:lvl w:ilvl="8" w:tentative="1">
+      <w:start w:val="1"/>
+      <w:numFmt w:val="decimal"/>
+      <w:lvlText w:val="%9."/>
+      <w:lvlJc w:val="left"/>
+      <w:pPr>
+        <w:tabs>
+          <w:tab w:val="num" w:pos="6480"/>
+        </w:tabs>
+        <w:ind w:left="6480" w:hanging="360"/>
+      </w:pPr>
+    </w:lvl>
+  </w:abstractNum>
+  <w:abstractNum w:abstractNumId="13" w15:restartNumberingAfterBreak="0">
     <w:nsid w:val="7E752170"/>
     <w:multiLevelType w:val="hybridMultilevel"/>
     <w:tmpl w:val="88C0D706"/>
@@ -3186,16 +6038,46 @@
     </w:lvl>
   </w:abstractNum>
   <w:num w:numId="1" w16cid:durableId="873422198">
-    <w:abstractNumId w:val="1"/>
+    <w:abstractNumId w:val="7"/>
   </w:num>
   <w:num w:numId="2" w16cid:durableId="1843158215">
-    <w:abstractNumId w:val="3"/>
+    <w:abstractNumId w:val="13"/>
   </w:num>
   <w:num w:numId="3" w16cid:durableId="225266068">
-    <w:abstractNumId w:val="2"/>
+    <w:abstractNumId w:val="11"/>
   </w:num>
   <w:num w:numId="4" w16cid:durableId="1255675544">
     <w:abstractNumId w:val="0"/>
+  </w:num>
+  <w:num w:numId="5" w16cid:durableId="1904679409">
+    <w:abstractNumId w:val="8"/>
+  </w:num>
+  <w:num w:numId="6" w16cid:durableId="500706680">
+    <w:abstractNumId w:val="12"/>
+  </w:num>
+  <w:num w:numId="7" w16cid:durableId="1338847582">
+    <w:abstractNumId w:val="4"/>
+  </w:num>
+  <w:num w:numId="8" w16cid:durableId="531647694">
+    <w:abstractNumId w:val="3"/>
+  </w:num>
+  <w:num w:numId="9" w16cid:durableId="68235973">
+    <w:abstractNumId w:val="6"/>
+  </w:num>
+  <w:num w:numId="10" w16cid:durableId="1108476274">
+    <w:abstractNumId w:val="2"/>
+  </w:num>
+  <w:num w:numId="11" w16cid:durableId="1543782291">
+    <w:abstractNumId w:val="5"/>
+  </w:num>
+  <w:num w:numId="12" w16cid:durableId="1195312040">
+    <w:abstractNumId w:val="1"/>
+  </w:num>
+  <w:num w:numId="13" w16cid:durableId="128060865">
+    <w:abstractNumId w:val="10"/>
+  </w:num>
+  <w:num w:numId="14" w16cid:durableId="94518304">
+    <w:abstractNumId w:val="9"/>
   </w:num>
 </w:numbering>
 </file>
@@ -3806,6 +6688,7 @@
   <w:style w:type="character" w:default="1" w:styleId="Carpredefinitoparagrafo">
     <w:name w:val="Default Paragraph Font"/>
     <w:uiPriority w:val="1"/>
+    <w:semiHidden/>
     <w:unhideWhenUsed/>
   </w:style>
   <w:style w:type="table" w:default="1" w:styleId="Tabellanormale">

</xml_diff>